<commit_message>
Implemented useRef for socket and media stream management
</commit_message>
<xml_diff>
--- a/connetify document.docx
+++ b/connetify document.docx
@@ -2,7 +2,3228 @@
 <file path=word/document.xml><?xml version="1.0" encoding="utf-8"?>
 <w:document xmlns:wpc="http://schemas.microsoft.com/office/word/2010/wordprocessingCanvas" xmlns:cx="http://schemas.microsoft.com/office/drawing/2014/chartex" xmlns:cx1="http://schemas.microsoft.com/office/drawing/2015/9/8/chartex" xmlns:cx2="http://schemas.microsoft.com/office/drawing/2015/10/21/chartex" xmlns:cx3="http://schemas.microsoft.com/office/drawing/2016/5/9/chartex" xmlns:cx4="http://schemas.microsoft.com/office/drawing/2016/5/10/chartex" xmlns:cx5="http://schemas.microsoft.com/office/drawing/2016/5/11/chartex" xmlns:cx6="http://schemas.microsoft.com/office/drawing/2016/5/12/chartex" xmlns:cx7="http://schemas.microsoft.com/office/drawing/2016/5/13/chartex" xmlns:cx8="http://schemas.microsoft.com/office/drawing/2016/5/14/chartex" xmlns:mc="http://schemas.openxmlformats.org/markup-compatibility/2006" xmlns:aink="http://schemas.microsoft.com/office/drawing/2016/ink" xmlns:am3d="http://schemas.microsoft.com/office/drawing/2017/model3d" xmlns:o="urn:schemas-microsoft-com:office:office" xmlns:oel="http://schemas.microsoft.com/office/2019/extlst" xmlns:r="http://schemas.openxmlformats.org/officeDocument/2006/relationships" xmlns:m="http://schemas.openxmlformats.org/officeDocument/2006/math" xmlns:v="urn:schemas-microsoft-com:vml" xmlns:wp14="http://schemas.microsoft.com/office/word/2010/wordprocessingDrawing" xmlns:wp="http://schemas.openxmlformats.org/drawingml/2006/wordprocessingDrawing" xmlns:w10="urn:schemas-microsoft-com:office:word" xmlns:w="http://schemas.openxmlformats.org/wordprocessingml/2006/main" xmlns:w14="http://schemas.microsoft.com/office/word/2010/wordml" xmlns:w15="http://schemas.microsoft.com/office/word/2012/wordml" xmlns:w16cex="http://schemas.microsoft.com/office/word/2018/wordml/cex" xmlns:w16cid="http://schemas.microsoft.com/office/word/2016/wordml/cid" xmlns:w16="http://schemas.microsoft.com/office/word/2018/wordml" xmlns:w16du="http://schemas.microsoft.com/office/word/2023/wordml/word16du" xmlns:w16sdtdh="http://schemas.microsoft.com/office/word/2020/wordml/sdtdatahash" xmlns:w16sdtfl="http://schemas.microsoft.com/office/word/2024/wordml/sdtformatlock" xmlns:w16se="http://schemas.microsoft.com/office/word/2015/wordml/symex" xmlns:wpg="http://schemas.microsoft.com/office/word/2010/wordprocessingGroup" xmlns:wpi="http://schemas.microsoft.com/office/word/2010/wordprocessingInk" xmlns:wne="http://schemas.microsoft.com/office/word/2006/wordml" xmlns:wps="http://schemas.microsoft.com/office/word/2010/wordprocessingShape" mc:Ignorable="w14 w15 w16se w16cid w16 w16cex w16sdtdh w16sdtfl w16du wp14">
   <w:body>
+    <w:p>
+      <w:r>
+        <w:t xml:space="preserve">Today you covered several important concepts related to </w:t>
+      </w:r>
+      <w:r>
+        <w:rPr>
+          <w:b/>
+          <w:bCs/>
+        </w:rPr>
+        <w:t>React</w:t>
+      </w:r>
+      <w:r>
+        <w:t xml:space="preserve">, </w:t>
+      </w:r>
+      <w:r>
+        <w:rPr>
+          <w:b/>
+          <w:bCs/>
+        </w:rPr>
+        <w:t>WebRTC</w:t>
+      </w:r>
+      <w:r>
+        <w:t xml:space="preserve">, and </w:t>
+      </w:r>
+      <w:r>
+        <w:rPr>
+          <w:b/>
+          <w:bCs/>
+        </w:rPr>
+        <w:t>video calling applications</w:t>
+      </w:r>
+      <w:r>
+        <w:t xml:space="preserve"> like your </w:t>
+      </w:r>
+      <w:proofErr w:type="spellStart"/>
+      <w:r>
+        <w:rPr>
+          <w:b/>
+          <w:bCs/>
+        </w:rPr>
+        <w:t>Connectify</w:t>
+      </w:r>
+      <w:proofErr w:type="spellEnd"/>
+      <w:r>
+        <w:t xml:space="preserve"> project.</w:t>
+      </w:r>
+    </w:p>
+    <w:p>
+      <w:r>
+        <w:pict w14:anchorId="6E10038E">
+          <v:rect id="_x0000_i1211" style="width:0;height:1.5pt" o:hralign="center" o:hrstd="t" o:hr="t" fillcolor="#a0a0a0" stroked="f"/>
+        </w:pict>
+      </w:r>
+    </w:p>
+    <w:p>
+      <w:pPr>
+        <w:rPr>
+          <w:b/>
+          <w:bCs/>
+        </w:rPr>
+      </w:pPr>
+      <w:r>
+        <w:rPr>
+          <w:b/>
+          <w:bCs/>
+        </w:rPr>
+        <w:t xml:space="preserve">1. </w:t>
+      </w:r>
+      <w:proofErr w:type="spellStart"/>
+      <w:r>
+        <w:rPr>
+          <w:b/>
+          <w:bCs/>
+        </w:rPr>
+        <w:t>useState</w:t>
+      </w:r>
+      <w:proofErr w:type="spellEnd"/>
+      <w:r>
+        <w:rPr>
+          <w:b/>
+          <w:bCs/>
+        </w:rPr>
+        <w:t xml:space="preserve"> Hook</w:t>
+      </w:r>
+    </w:p>
+    <w:p>
+      <w:pPr>
+        <w:rPr>
+          <w:b/>
+          <w:bCs/>
+        </w:rPr>
+      </w:pPr>
+      <w:r>
+        <w:rPr>
+          <w:b/>
+          <w:bCs/>
+        </w:rPr>
+        <w:t xml:space="preserve">What is </w:t>
+      </w:r>
+      <w:proofErr w:type="spellStart"/>
+      <w:r>
+        <w:rPr>
+          <w:b/>
+          <w:bCs/>
+        </w:rPr>
+        <w:t>useState</w:t>
+      </w:r>
+      <w:proofErr w:type="spellEnd"/>
+      <w:r>
+        <w:rPr>
+          <w:b/>
+          <w:bCs/>
+        </w:rPr>
+        <w:t>?</w:t>
+      </w:r>
+    </w:p>
+    <w:p>
+      <w:proofErr w:type="spellStart"/>
+      <w:r>
+        <w:t>useState</w:t>
+      </w:r>
+      <w:proofErr w:type="spellEnd"/>
+      <w:r>
+        <w:t xml:space="preserve"> is a React Hook used to store data that affects the UI.</w:t>
+      </w:r>
+    </w:p>
+    <w:p>
+      <w:proofErr w:type="spellStart"/>
+      <w:r>
+        <w:t>const</w:t>
+      </w:r>
+      <w:proofErr w:type="spellEnd"/>
+      <w:r>
+        <w:t xml:space="preserve"> [count, </w:t>
+      </w:r>
+      <w:proofErr w:type="spellStart"/>
+      <w:r>
+        <w:t>setCount</w:t>
+      </w:r>
+      <w:proofErr w:type="spellEnd"/>
+      <w:r>
+        <w:t xml:space="preserve">] = </w:t>
+      </w:r>
+      <w:proofErr w:type="spellStart"/>
+      <w:proofErr w:type="gramStart"/>
+      <w:r>
+        <w:t>useState</w:t>
+      </w:r>
+      <w:proofErr w:type="spellEnd"/>
+      <w:r>
+        <w:t>(</w:t>
+      </w:r>
+      <w:proofErr w:type="gramEnd"/>
+      <w:r>
+        <w:t>0);</w:t>
+      </w:r>
+    </w:p>
+    <w:p>
+      <w:r>
+        <w:t>Here:</w:t>
+      </w:r>
+    </w:p>
+    <w:p>
+      <w:pPr>
+        <w:numPr>
+          <w:ilvl w:val="0"/>
+          <w:numId w:val="1"/>
+        </w:numPr>
+      </w:pPr>
+      <w:r>
+        <w:t xml:space="preserve">count → current value </w:t>
+      </w:r>
+    </w:p>
+    <w:p>
+      <w:pPr>
+        <w:numPr>
+          <w:ilvl w:val="0"/>
+          <w:numId w:val="1"/>
+        </w:numPr>
+      </w:pPr>
+      <w:proofErr w:type="spellStart"/>
+      <w:proofErr w:type="gramStart"/>
+      <w:r>
+        <w:t>setCount</w:t>
+      </w:r>
+      <w:proofErr w:type="spellEnd"/>
+      <w:r>
+        <w:t>(</w:t>
+      </w:r>
+      <w:proofErr w:type="gramEnd"/>
+      <w:r>
+        <w:t xml:space="preserve">) → function to update value </w:t>
+      </w:r>
+    </w:p>
+    <w:p>
+      <w:pPr>
+        <w:numPr>
+          <w:ilvl w:val="0"/>
+          <w:numId w:val="1"/>
+        </w:numPr>
+      </w:pPr>
+      <w:r>
+        <w:t xml:space="preserve">0 → initial value </w:t>
+      </w:r>
+    </w:p>
+    <w:p>
+      <w:r>
+        <w:pict w14:anchorId="77655E69">
+          <v:rect id="_x0000_i1212" style="width:0;height:1.5pt" o:hralign="center" o:hrstd="t" o:hr="t" fillcolor="#a0a0a0" stroked="f"/>
+        </w:pict>
+      </w:r>
+    </w:p>
+    <w:p>
+      <w:pPr>
+        <w:rPr>
+          <w:b/>
+          <w:bCs/>
+        </w:rPr>
+      </w:pPr>
+      <w:r>
+        <w:rPr>
+          <w:b/>
+          <w:bCs/>
+        </w:rPr>
+        <w:t>Example</w:t>
+      </w:r>
+    </w:p>
+    <w:p>
+      <w:proofErr w:type="spellStart"/>
+      <w:r>
+        <w:t>const</w:t>
+      </w:r>
+      <w:proofErr w:type="spellEnd"/>
+      <w:r>
+        <w:t xml:space="preserve"> [count, </w:t>
+      </w:r>
+      <w:proofErr w:type="spellStart"/>
+      <w:r>
+        <w:t>setCount</w:t>
+      </w:r>
+      <w:proofErr w:type="spellEnd"/>
+      <w:r>
+        <w:t xml:space="preserve">] = </w:t>
+      </w:r>
+      <w:proofErr w:type="spellStart"/>
+      <w:proofErr w:type="gramStart"/>
+      <w:r>
+        <w:t>useState</w:t>
+      </w:r>
+      <w:proofErr w:type="spellEnd"/>
+      <w:r>
+        <w:t>(</w:t>
+      </w:r>
+      <w:proofErr w:type="gramEnd"/>
+      <w:r>
+        <w:t>0);</w:t>
+      </w:r>
+    </w:p>
     <w:p/>
+    <w:p>
+      <w:r>
+        <w:t xml:space="preserve">function </w:t>
+      </w:r>
+      <w:proofErr w:type="gramStart"/>
+      <w:r>
+        <w:t>increment(</w:t>
+      </w:r>
+      <w:proofErr w:type="gramEnd"/>
+      <w:r>
+        <w:t>) {</w:t>
+      </w:r>
+    </w:p>
+    <w:p>
+      <w:r>
+        <w:t xml:space="preserve">    </w:t>
+      </w:r>
+      <w:proofErr w:type="spellStart"/>
+      <w:proofErr w:type="gramStart"/>
+      <w:r>
+        <w:t>setCount</w:t>
+      </w:r>
+      <w:proofErr w:type="spellEnd"/>
+      <w:r>
+        <w:t>(</w:t>
+      </w:r>
+      <w:proofErr w:type="gramEnd"/>
+      <w:r>
+        <w:t>count + 1);</w:t>
+      </w:r>
+    </w:p>
+    <w:p>
+      <w:r>
+        <w:t>}</w:t>
+      </w:r>
+    </w:p>
+    <w:p>
+      <w:r>
+        <w:t>When:</w:t>
+      </w:r>
+    </w:p>
+    <w:p>
+      <w:proofErr w:type="spellStart"/>
+      <w:proofErr w:type="gramStart"/>
+      <w:r>
+        <w:t>setCount</w:t>
+      </w:r>
+      <w:proofErr w:type="spellEnd"/>
+      <w:r>
+        <w:t>(</w:t>
+      </w:r>
+      <w:proofErr w:type="gramEnd"/>
+      <w:r>
+        <w:t>1);</w:t>
+      </w:r>
+    </w:p>
+    <w:p>
+      <w:r>
+        <w:t>React:</w:t>
+      </w:r>
+    </w:p>
+    <w:p>
+      <w:pPr>
+        <w:numPr>
+          <w:ilvl w:val="0"/>
+          <w:numId w:val="2"/>
+        </w:numPr>
+      </w:pPr>
+      <w:r>
+        <w:t xml:space="preserve">Updates count </w:t>
+      </w:r>
+    </w:p>
+    <w:p>
+      <w:pPr>
+        <w:numPr>
+          <w:ilvl w:val="0"/>
+          <w:numId w:val="2"/>
+        </w:numPr>
+      </w:pPr>
+      <w:r>
+        <w:t xml:space="preserve">Re-renders component </w:t>
+      </w:r>
+    </w:p>
+    <w:p>
+      <w:pPr>
+        <w:numPr>
+          <w:ilvl w:val="0"/>
+          <w:numId w:val="2"/>
+        </w:numPr>
+      </w:pPr>
+      <w:r>
+        <w:t xml:space="preserve">Updates UI </w:t>
+      </w:r>
+    </w:p>
+    <w:p>
+      <w:r>
+        <w:pict w14:anchorId="06E3DDDB">
+          <v:rect id="_x0000_i1213" style="width:0;height:1.5pt" o:hralign="center" o:hrstd="t" o:hr="t" fillcolor="#a0a0a0" stroked="f"/>
+        </w:pict>
+      </w:r>
+    </w:p>
+    <w:p>
+      <w:pPr>
+        <w:rPr>
+          <w:b/>
+          <w:bCs/>
+        </w:rPr>
+      </w:pPr>
+      <w:r>
+        <w:rPr>
+          <w:b/>
+          <w:bCs/>
+        </w:rPr>
+        <w:t>Use Cases</w:t>
+      </w:r>
+    </w:p>
+    <w:p>
+      <w:r>
+        <w:rPr>
+          <w:rFonts w:ascii="Segoe UI Emoji" w:hAnsi="Segoe UI Emoji" w:cs="Segoe UI Emoji"/>
+        </w:rPr>
+        <w:t>✅</w:t>
+      </w:r>
+      <w:r>
+        <w:t xml:space="preserve"> Counter</w:t>
+      </w:r>
+    </w:p>
+    <w:p>
+      <w:proofErr w:type="spellStart"/>
+      <w:r>
+        <w:t>const</w:t>
+      </w:r>
+      <w:proofErr w:type="spellEnd"/>
+      <w:r>
+        <w:t xml:space="preserve"> [count, </w:t>
+      </w:r>
+      <w:proofErr w:type="spellStart"/>
+      <w:r>
+        <w:t>setCount</w:t>
+      </w:r>
+      <w:proofErr w:type="spellEnd"/>
+      <w:r>
+        <w:t xml:space="preserve">] = </w:t>
+      </w:r>
+      <w:proofErr w:type="spellStart"/>
+      <w:proofErr w:type="gramStart"/>
+      <w:r>
+        <w:t>useState</w:t>
+      </w:r>
+      <w:proofErr w:type="spellEnd"/>
+      <w:r>
+        <w:t>(</w:t>
+      </w:r>
+      <w:proofErr w:type="gramEnd"/>
+      <w:r>
+        <w:t>0);</w:t>
+      </w:r>
+    </w:p>
+    <w:p>
+      <w:r>
+        <w:rPr>
+          <w:rFonts w:ascii="Segoe UI Emoji" w:hAnsi="Segoe UI Emoji" w:cs="Segoe UI Emoji"/>
+        </w:rPr>
+        <w:t>✅</w:t>
+      </w:r>
+      <w:r>
+        <w:t xml:space="preserve"> Username</w:t>
+      </w:r>
+    </w:p>
+    <w:p>
+      <w:proofErr w:type="spellStart"/>
+      <w:r>
+        <w:t>const</w:t>
+      </w:r>
+      <w:proofErr w:type="spellEnd"/>
+      <w:r>
+        <w:t xml:space="preserve"> [username, </w:t>
+      </w:r>
+      <w:proofErr w:type="spellStart"/>
+      <w:r>
+        <w:t>setUsername</w:t>
+      </w:r>
+      <w:proofErr w:type="spellEnd"/>
+      <w:r>
+        <w:t xml:space="preserve">] = </w:t>
+      </w:r>
+      <w:proofErr w:type="spellStart"/>
+      <w:proofErr w:type="gramStart"/>
+      <w:r>
+        <w:t>useState</w:t>
+      </w:r>
+      <w:proofErr w:type="spellEnd"/>
+      <w:r>
+        <w:t>(</w:t>
+      </w:r>
+      <w:proofErr w:type="gramEnd"/>
+      <w:r>
+        <w:t>"");</w:t>
+      </w:r>
+    </w:p>
+    <w:p>
+      <w:r>
+        <w:rPr>
+          <w:rFonts w:ascii="Segoe UI Emoji" w:hAnsi="Segoe UI Emoji" w:cs="Segoe UI Emoji"/>
+        </w:rPr>
+        <w:t>✅</w:t>
+      </w:r>
+      <w:r>
+        <w:t xml:space="preserve"> Messages</w:t>
+      </w:r>
+    </w:p>
+    <w:p>
+      <w:proofErr w:type="spellStart"/>
+      <w:r>
+        <w:lastRenderedPageBreak/>
+        <w:t>const</w:t>
+      </w:r>
+      <w:proofErr w:type="spellEnd"/>
+      <w:r>
+        <w:t xml:space="preserve"> [messages, </w:t>
+      </w:r>
+      <w:proofErr w:type="spellStart"/>
+      <w:r>
+        <w:t>setMessages</w:t>
+      </w:r>
+      <w:proofErr w:type="spellEnd"/>
+      <w:r>
+        <w:t xml:space="preserve">] = </w:t>
+      </w:r>
+      <w:proofErr w:type="spellStart"/>
+      <w:proofErr w:type="gramStart"/>
+      <w:r>
+        <w:t>useState</w:t>
+      </w:r>
+      <w:proofErr w:type="spellEnd"/>
+      <w:r>
+        <w:t>(</w:t>
+      </w:r>
+      <w:proofErr w:type="gramEnd"/>
+      <w:r>
+        <w:t>[]);</w:t>
+      </w:r>
+    </w:p>
+    <w:p>
+      <w:r>
+        <w:pict w14:anchorId="6EC2C9D6">
+          <v:rect id="_x0000_i1214" style="width:0;height:1.5pt" o:hralign="center" o:hrstd="t" o:hr="t" fillcolor="#a0a0a0" stroked="f"/>
+        </w:pict>
+      </w:r>
+    </w:p>
+    <w:p>
+      <w:pPr>
+        <w:rPr>
+          <w:b/>
+          <w:bCs/>
+        </w:rPr>
+      </w:pPr>
+      <w:r>
+        <w:rPr>
+          <w:b/>
+          <w:bCs/>
+        </w:rPr>
+        <w:t xml:space="preserve">2. </w:t>
+      </w:r>
+      <w:proofErr w:type="spellStart"/>
+      <w:r>
+        <w:rPr>
+          <w:b/>
+          <w:bCs/>
+        </w:rPr>
+        <w:t>useRef</w:t>
+      </w:r>
+      <w:proofErr w:type="spellEnd"/>
+      <w:r>
+        <w:rPr>
+          <w:b/>
+          <w:bCs/>
+        </w:rPr>
+        <w:t xml:space="preserve"> Hook</w:t>
+      </w:r>
+    </w:p>
+    <w:p>
+      <w:pPr>
+        <w:rPr>
+          <w:b/>
+          <w:bCs/>
+        </w:rPr>
+      </w:pPr>
+      <w:r>
+        <w:rPr>
+          <w:b/>
+          <w:bCs/>
+        </w:rPr>
+        <w:t xml:space="preserve">What is </w:t>
+      </w:r>
+      <w:proofErr w:type="spellStart"/>
+      <w:r>
+        <w:rPr>
+          <w:b/>
+          <w:bCs/>
+        </w:rPr>
+        <w:t>useRef</w:t>
+      </w:r>
+      <w:proofErr w:type="spellEnd"/>
+      <w:r>
+        <w:rPr>
+          <w:b/>
+          <w:bCs/>
+        </w:rPr>
+        <w:t>?</w:t>
+      </w:r>
+    </w:p>
+    <w:p>
+      <w:proofErr w:type="spellStart"/>
+      <w:r>
+        <w:t>useRef</w:t>
+      </w:r>
+      <w:proofErr w:type="spellEnd"/>
+      <w:r>
+        <w:t xml:space="preserve"> stores values that persist across renders but do not cause re-rendering.</w:t>
+      </w:r>
+    </w:p>
+    <w:p>
+      <w:proofErr w:type="spellStart"/>
+      <w:r>
+        <w:t>const</w:t>
+      </w:r>
+      <w:proofErr w:type="spellEnd"/>
+      <w:r>
+        <w:t xml:space="preserve"> ref = </w:t>
+      </w:r>
+      <w:proofErr w:type="spellStart"/>
+      <w:r>
+        <w:t>useRef</w:t>
+      </w:r>
+      <w:proofErr w:type="spellEnd"/>
+      <w:r>
+        <w:t>(</w:t>
+      </w:r>
+      <w:proofErr w:type="spellStart"/>
+      <w:r>
+        <w:t>initialValue</w:t>
+      </w:r>
+      <w:proofErr w:type="spellEnd"/>
+      <w:r>
+        <w:t>);</w:t>
+      </w:r>
+    </w:p>
+    <w:p>
+      <w:r>
+        <w:t>It returns:</w:t>
+      </w:r>
+    </w:p>
+    <w:p>
+      <w:r>
+        <w:t>{</w:t>
+      </w:r>
+    </w:p>
+    <w:p>
+      <w:r>
+        <w:t xml:space="preserve">    current: </w:t>
+      </w:r>
+      <w:proofErr w:type="spellStart"/>
+      <w:r>
+        <w:t>initialValue</w:t>
+      </w:r>
+      <w:proofErr w:type="spellEnd"/>
+    </w:p>
+    <w:p>
+      <w:r>
+        <w:t>}</w:t>
+      </w:r>
+    </w:p>
+    <w:p>
+      <w:r>
+        <w:t>Access value using:</w:t>
+      </w:r>
+    </w:p>
+    <w:p>
+      <w:proofErr w:type="spellStart"/>
+      <w:proofErr w:type="gramStart"/>
+      <w:r>
+        <w:t>ref.current</w:t>
+      </w:r>
+      <w:proofErr w:type="spellEnd"/>
+      <w:proofErr w:type="gramEnd"/>
+    </w:p>
+    <w:p>
+      <w:r>
+        <w:pict w14:anchorId="41C6082F">
+          <v:rect id="_x0000_i1215" style="width:0;height:1.5pt" o:hralign="center" o:hrstd="t" o:hr="t" fillcolor="#a0a0a0" stroked="f"/>
+        </w:pict>
+      </w:r>
+    </w:p>
+    <w:p>
+      <w:pPr>
+        <w:rPr>
+          <w:b/>
+          <w:bCs/>
+        </w:rPr>
+      </w:pPr>
+      <w:r>
+        <w:rPr>
+          <w:b/>
+          <w:bCs/>
+        </w:rPr>
+        <w:t>Example</w:t>
+      </w:r>
+    </w:p>
+    <w:p>
+      <w:proofErr w:type="spellStart"/>
+      <w:r>
+        <w:t>const</w:t>
+      </w:r>
+      <w:proofErr w:type="spellEnd"/>
+      <w:r>
+        <w:t xml:space="preserve"> </w:t>
+      </w:r>
+      <w:proofErr w:type="spellStart"/>
+      <w:r>
+        <w:t>countRef</w:t>
+      </w:r>
+      <w:proofErr w:type="spellEnd"/>
+      <w:r>
+        <w:t xml:space="preserve"> = </w:t>
+      </w:r>
+      <w:proofErr w:type="spellStart"/>
+      <w:proofErr w:type="gramStart"/>
+      <w:r>
+        <w:t>useRef</w:t>
+      </w:r>
+      <w:proofErr w:type="spellEnd"/>
+      <w:r>
+        <w:t>(</w:t>
+      </w:r>
+      <w:proofErr w:type="gramEnd"/>
+      <w:r>
+        <w:t>0);</w:t>
+      </w:r>
+    </w:p>
+    <w:p/>
+    <w:p>
+      <w:proofErr w:type="spellStart"/>
+      <w:r>
+        <w:t>countRef.current</w:t>
+      </w:r>
+      <w:proofErr w:type="spellEnd"/>
+      <w:r>
+        <w:t>++;</w:t>
+      </w:r>
+    </w:p>
+    <w:p>
+      <w:r>
+        <w:t>Value changes:</w:t>
+      </w:r>
+    </w:p>
+    <w:p>
+      <w:r>
+        <w:t>0 → 1 → 2 → 3</w:t>
+      </w:r>
+    </w:p>
+    <w:p>
+      <w:r>
+        <w:t>But component does NOT re-render.</w:t>
+      </w:r>
+    </w:p>
+    <w:p>
+      <w:r>
+        <w:pict w14:anchorId="6534CD36">
+          <v:rect id="_x0000_i1216" style="width:0;height:1.5pt" o:hralign="center" o:hrstd="t" o:hr="t" fillcolor="#a0a0a0" stroked="f"/>
+        </w:pict>
+      </w:r>
+    </w:p>
+    <w:p>
+      <w:pPr>
+        <w:rPr>
+          <w:b/>
+          <w:bCs/>
+        </w:rPr>
+      </w:pPr>
+      <w:r>
+        <w:rPr>
+          <w:b/>
+          <w:bCs/>
+        </w:rPr>
+        <w:t xml:space="preserve">Why use </w:t>
+      </w:r>
+      <w:proofErr w:type="spellStart"/>
+      <w:r>
+        <w:rPr>
+          <w:b/>
+          <w:bCs/>
+        </w:rPr>
+        <w:t>useRef</w:t>
+      </w:r>
+      <w:proofErr w:type="spellEnd"/>
+      <w:r>
+        <w:rPr>
+          <w:b/>
+          <w:bCs/>
+        </w:rPr>
+        <w:t>?</w:t>
+      </w:r>
+    </w:p>
+    <w:p>
+      <w:r>
+        <w:t>Because some values do not affect UI.</w:t>
+      </w:r>
+    </w:p>
+    <w:p>
+      <w:r>
+        <w:t>Examples:</w:t>
+      </w:r>
+    </w:p>
+    <w:p>
+      <w:pPr>
+        <w:numPr>
+          <w:ilvl w:val="0"/>
+          <w:numId w:val="3"/>
+        </w:numPr>
+      </w:pPr>
+      <w:r>
+        <w:t xml:space="preserve">Socket connections </w:t>
+      </w:r>
+    </w:p>
+    <w:p>
+      <w:pPr>
+        <w:numPr>
+          <w:ilvl w:val="0"/>
+          <w:numId w:val="3"/>
+        </w:numPr>
+      </w:pPr>
+      <w:r>
+        <w:t xml:space="preserve">Peer connections </w:t>
+      </w:r>
+    </w:p>
+    <w:p>
+      <w:pPr>
+        <w:numPr>
+          <w:ilvl w:val="0"/>
+          <w:numId w:val="3"/>
+        </w:numPr>
+      </w:pPr>
+      <w:r>
+        <w:t xml:space="preserve">Video elements </w:t>
+      </w:r>
+    </w:p>
+    <w:p>
+      <w:pPr>
+        <w:numPr>
+          <w:ilvl w:val="0"/>
+          <w:numId w:val="3"/>
+        </w:numPr>
+      </w:pPr>
+      <w:r>
+        <w:t xml:space="preserve">Timers </w:t>
+      </w:r>
+    </w:p>
+    <w:p>
+      <w:pPr>
+        <w:numPr>
+          <w:ilvl w:val="0"/>
+          <w:numId w:val="3"/>
+        </w:numPr>
+      </w:pPr>
+      <w:r>
+        <w:t xml:space="preserve">Previous values </w:t>
+      </w:r>
+    </w:p>
+    <w:p>
+      <w:r>
+        <w:pict w14:anchorId="35B17E2A">
+          <v:rect id="_x0000_i1217" style="width:0;height:1.5pt" o:hralign="center" o:hrstd="t" o:hr="t" fillcolor="#a0a0a0" stroked="f"/>
+        </w:pict>
+      </w:r>
+    </w:p>
+    <w:p>
+      <w:pPr>
+        <w:rPr>
+          <w:b/>
+          <w:bCs/>
+        </w:rPr>
+      </w:pPr>
+      <w:r>
+        <w:rPr>
+          <w:b/>
+          <w:bCs/>
+        </w:rPr>
+        <w:t xml:space="preserve">3. Difference Between </w:t>
+      </w:r>
+      <w:proofErr w:type="spellStart"/>
+      <w:r>
+        <w:rPr>
+          <w:b/>
+          <w:bCs/>
+        </w:rPr>
+        <w:t>useState</w:t>
+      </w:r>
+      <w:proofErr w:type="spellEnd"/>
+      <w:r>
+        <w:rPr>
+          <w:b/>
+          <w:bCs/>
+        </w:rPr>
+        <w:t xml:space="preserve"> and </w:t>
+      </w:r>
+      <w:proofErr w:type="spellStart"/>
+      <w:r>
+        <w:rPr>
+          <w:b/>
+          <w:bCs/>
+        </w:rPr>
+        <w:t>useRef</w:t>
+      </w:r>
+      <w:proofErr w:type="spellEnd"/>
+    </w:p>
+    <w:tbl>
+      <w:tblPr>
+        <w:tblW w:w="0" w:type="auto"/>
+        <w:tblCellSpacing w:w="15" w:type="dxa"/>
+        <w:tblCellMar>
+          <w:top w:w="15" w:type="dxa"/>
+          <w:left w:w="15" w:type="dxa"/>
+          <w:bottom w:w="15" w:type="dxa"/>
+          <w:right w:w="15" w:type="dxa"/>
+        </w:tblCellMar>
+        <w:tblLook w:val="04A0" w:firstRow="1" w:lastRow="0" w:firstColumn="1" w:lastColumn="0" w:noHBand="0" w:noVBand="1"/>
+      </w:tblPr>
+      <w:tblGrid>
+        <w:gridCol w:w="2317"/>
+        <w:gridCol w:w="846"/>
+        <w:gridCol w:w="691"/>
+      </w:tblGrid>
+      <w:tr>
+        <w:trPr>
+          <w:tblHeader/>
+          <w:tblCellSpacing w:w="15" w:type="dxa"/>
+        </w:trPr>
+        <w:tc>
+          <w:tcPr>
+            <w:tcW w:w="0" w:type="auto"/>
+            <w:vAlign w:val="center"/>
+            <w:hideMark/>
+          </w:tcPr>
+          <w:p>
+            <w:pPr>
+              <w:rPr>
+                <w:b/>
+                <w:bCs/>
+              </w:rPr>
+            </w:pPr>
+            <w:r>
+              <w:rPr>
+                <w:b/>
+                <w:bCs/>
+              </w:rPr>
+              <w:lastRenderedPageBreak/>
+              <w:t>Feature</w:t>
+            </w:r>
+          </w:p>
+        </w:tc>
+        <w:tc>
+          <w:tcPr>
+            <w:tcW w:w="0" w:type="auto"/>
+            <w:vAlign w:val="center"/>
+            <w:hideMark/>
+          </w:tcPr>
+          <w:p>
+            <w:pPr>
+              <w:rPr>
+                <w:b/>
+                <w:bCs/>
+              </w:rPr>
+            </w:pPr>
+            <w:proofErr w:type="spellStart"/>
+            <w:r>
+              <w:rPr>
+                <w:b/>
+                <w:bCs/>
+              </w:rPr>
+              <w:t>useState</w:t>
+            </w:r>
+            <w:proofErr w:type="spellEnd"/>
+          </w:p>
+        </w:tc>
+        <w:tc>
+          <w:tcPr>
+            <w:tcW w:w="0" w:type="auto"/>
+            <w:vAlign w:val="center"/>
+            <w:hideMark/>
+          </w:tcPr>
+          <w:p>
+            <w:pPr>
+              <w:rPr>
+                <w:b/>
+                <w:bCs/>
+              </w:rPr>
+            </w:pPr>
+            <w:proofErr w:type="spellStart"/>
+            <w:r>
+              <w:rPr>
+                <w:b/>
+                <w:bCs/>
+              </w:rPr>
+              <w:t>useRef</w:t>
+            </w:r>
+            <w:proofErr w:type="spellEnd"/>
+          </w:p>
+        </w:tc>
+      </w:tr>
+      <w:tr>
+        <w:trPr>
+          <w:tblCellSpacing w:w="15" w:type="dxa"/>
+        </w:trPr>
+        <w:tc>
+          <w:tcPr>
+            <w:tcW w:w="0" w:type="auto"/>
+            <w:vAlign w:val="center"/>
+            <w:hideMark/>
+          </w:tcPr>
+          <w:p>
+            <w:r>
+              <w:t>Stores values</w:t>
+            </w:r>
+          </w:p>
+        </w:tc>
+        <w:tc>
+          <w:tcPr>
+            <w:tcW w:w="0" w:type="auto"/>
+            <w:vAlign w:val="center"/>
+            <w:hideMark/>
+          </w:tcPr>
+          <w:p>
+            <w:r>
+              <w:rPr>
+                <w:rFonts w:ascii="Segoe UI Emoji" w:hAnsi="Segoe UI Emoji" w:cs="Segoe UI Emoji"/>
+              </w:rPr>
+              <w:t>✅</w:t>
+            </w:r>
+          </w:p>
+        </w:tc>
+        <w:tc>
+          <w:tcPr>
+            <w:tcW w:w="0" w:type="auto"/>
+            <w:vAlign w:val="center"/>
+            <w:hideMark/>
+          </w:tcPr>
+          <w:p>
+            <w:r>
+              <w:rPr>
+                <w:rFonts w:ascii="Segoe UI Emoji" w:hAnsi="Segoe UI Emoji" w:cs="Segoe UI Emoji"/>
+              </w:rPr>
+              <w:t>✅</w:t>
+            </w:r>
+          </w:p>
+        </w:tc>
+      </w:tr>
+      <w:tr>
+        <w:trPr>
+          <w:tblCellSpacing w:w="15" w:type="dxa"/>
+        </w:trPr>
+        <w:tc>
+          <w:tcPr>
+            <w:tcW w:w="0" w:type="auto"/>
+            <w:vAlign w:val="center"/>
+            <w:hideMark/>
+          </w:tcPr>
+          <w:p>
+            <w:r>
+              <w:t>Persists between renders</w:t>
+            </w:r>
+          </w:p>
+        </w:tc>
+        <w:tc>
+          <w:tcPr>
+            <w:tcW w:w="0" w:type="auto"/>
+            <w:vAlign w:val="center"/>
+            <w:hideMark/>
+          </w:tcPr>
+          <w:p>
+            <w:r>
+              <w:rPr>
+                <w:rFonts w:ascii="Segoe UI Emoji" w:hAnsi="Segoe UI Emoji" w:cs="Segoe UI Emoji"/>
+              </w:rPr>
+              <w:t>✅</w:t>
+            </w:r>
+          </w:p>
+        </w:tc>
+        <w:tc>
+          <w:tcPr>
+            <w:tcW w:w="0" w:type="auto"/>
+            <w:vAlign w:val="center"/>
+            <w:hideMark/>
+          </w:tcPr>
+          <w:p>
+            <w:r>
+              <w:rPr>
+                <w:rFonts w:ascii="Segoe UI Emoji" w:hAnsi="Segoe UI Emoji" w:cs="Segoe UI Emoji"/>
+              </w:rPr>
+              <w:t>✅</w:t>
+            </w:r>
+          </w:p>
+        </w:tc>
+      </w:tr>
+      <w:tr>
+        <w:trPr>
+          <w:tblCellSpacing w:w="15" w:type="dxa"/>
+        </w:trPr>
+        <w:tc>
+          <w:tcPr>
+            <w:tcW w:w="0" w:type="auto"/>
+            <w:vAlign w:val="center"/>
+            <w:hideMark/>
+          </w:tcPr>
+          <w:p>
+            <w:r>
+              <w:t>Causes re-render</w:t>
+            </w:r>
+          </w:p>
+        </w:tc>
+        <w:tc>
+          <w:tcPr>
+            <w:tcW w:w="0" w:type="auto"/>
+            <w:vAlign w:val="center"/>
+            <w:hideMark/>
+          </w:tcPr>
+          <w:p>
+            <w:r>
+              <w:rPr>
+                <w:rFonts w:ascii="Segoe UI Emoji" w:hAnsi="Segoe UI Emoji" w:cs="Segoe UI Emoji"/>
+              </w:rPr>
+              <w:t>✅</w:t>
+            </w:r>
+          </w:p>
+        </w:tc>
+        <w:tc>
+          <w:tcPr>
+            <w:tcW w:w="0" w:type="auto"/>
+            <w:vAlign w:val="center"/>
+            <w:hideMark/>
+          </w:tcPr>
+          <w:p>
+            <w:r>
+              <w:rPr>
+                <w:rFonts w:ascii="Segoe UI Emoji" w:hAnsi="Segoe UI Emoji" w:cs="Segoe UI Emoji"/>
+              </w:rPr>
+              <w:t>❌</w:t>
+            </w:r>
+          </w:p>
+        </w:tc>
+      </w:tr>
+      <w:tr>
+        <w:trPr>
+          <w:tblCellSpacing w:w="15" w:type="dxa"/>
+        </w:trPr>
+        <w:tc>
+          <w:tcPr>
+            <w:tcW w:w="0" w:type="auto"/>
+            <w:vAlign w:val="center"/>
+            <w:hideMark/>
+          </w:tcPr>
+          <w:p>
+            <w:r>
+              <w:t>Used for UI data</w:t>
+            </w:r>
+          </w:p>
+        </w:tc>
+        <w:tc>
+          <w:tcPr>
+            <w:tcW w:w="0" w:type="auto"/>
+            <w:vAlign w:val="center"/>
+            <w:hideMark/>
+          </w:tcPr>
+          <w:p>
+            <w:r>
+              <w:rPr>
+                <w:rFonts w:ascii="Segoe UI Emoji" w:hAnsi="Segoe UI Emoji" w:cs="Segoe UI Emoji"/>
+              </w:rPr>
+              <w:t>✅</w:t>
+            </w:r>
+          </w:p>
+        </w:tc>
+        <w:tc>
+          <w:tcPr>
+            <w:tcW w:w="0" w:type="auto"/>
+            <w:vAlign w:val="center"/>
+            <w:hideMark/>
+          </w:tcPr>
+          <w:p>
+            <w:r>
+              <w:rPr>
+                <w:rFonts w:ascii="Segoe UI Emoji" w:hAnsi="Segoe UI Emoji" w:cs="Segoe UI Emoji"/>
+              </w:rPr>
+              <w:t>❌</w:t>
+            </w:r>
+          </w:p>
+        </w:tc>
+      </w:tr>
+      <w:tr>
+        <w:trPr>
+          <w:tblCellSpacing w:w="15" w:type="dxa"/>
+        </w:trPr>
+        <w:tc>
+          <w:tcPr>
+            <w:tcW w:w="0" w:type="auto"/>
+            <w:vAlign w:val="center"/>
+            <w:hideMark/>
+          </w:tcPr>
+          <w:p>
+            <w:r>
+              <w:t>Used for DOM elements</w:t>
+            </w:r>
+          </w:p>
+        </w:tc>
+        <w:tc>
+          <w:tcPr>
+            <w:tcW w:w="0" w:type="auto"/>
+            <w:vAlign w:val="center"/>
+            <w:hideMark/>
+          </w:tcPr>
+          <w:p>
+            <w:r>
+              <w:rPr>
+                <w:rFonts w:ascii="Segoe UI Emoji" w:hAnsi="Segoe UI Emoji" w:cs="Segoe UI Emoji"/>
+              </w:rPr>
+              <w:t>❌</w:t>
+            </w:r>
+          </w:p>
+        </w:tc>
+        <w:tc>
+          <w:tcPr>
+            <w:tcW w:w="0" w:type="auto"/>
+            <w:vAlign w:val="center"/>
+            <w:hideMark/>
+          </w:tcPr>
+          <w:p>
+            <w:r>
+              <w:rPr>
+                <w:rFonts w:ascii="Segoe UI Emoji" w:hAnsi="Segoe UI Emoji" w:cs="Segoe UI Emoji"/>
+              </w:rPr>
+              <w:t>✅</w:t>
+            </w:r>
+          </w:p>
+        </w:tc>
+      </w:tr>
+    </w:tbl>
+    <w:p>
+      <w:r>
+        <w:pict w14:anchorId="7541DA29">
+          <v:rect id="_x0000_i1218" style="width:0;height:1.5pt" o:hralign="center" o:hrstd="t" o:hr="t" fillcolor="#a0a0a0" stroked="f"/>
+        </w:pict>
+      </w:r>
+    </w:p>
+    <w:p>
+      <w:pPr>
+        <w:rPr>
+          <w:b/>
+          <w:bCs/>
+        </w:rPr>
+      </w:pPr>
+      <w:r>
+        <w:rPr>
+          <w:b/>
+          <w:bCs/>
+        </w:rPr>
+        <w:t>Easy way to remember</w:t>
+      </w:r>
+    </w:p>
+    <w:p>
+      <w:pPr>
+        <w:rPr>
+          <w:b/>
+          <w:bCs/>
+        </w:rPr>
+      </w:pPr>
+      <w:proofErr w:type="spellStart"/>
+      <w:r>
+        <w:rPr>
+          <w:b/>
+          <w:bCs/>
+        </w:rPr>
+        <w:t>useState</w:t>
+      </w:r>
+      <w:proofErr w:type="spellEnd"/>
+    </w:p>
+    <w:p>
+      <w:r>
+        <w:t>Change value → Update UI</w:t>
+      </w:r>
+    </w:p>
+    <w:p>
+      <w:r>
+        <w:pict w14:anchorId="7A5B4CFA">
+          <v:rect id="_x0000_i1219" style="width:0;height:1.5pt" o:hralign="center" o:hrstd="t" o:hr="t" fillcolor="#a0a0a0" stroked="f"/>
+        </w:pict>
+      </w:r>
+    </w:p>
+    <w:p>
+      <w:pPr>
+        <w:rPr>
+          <w:b/>
+          <w:bCs/>
+        </w:rPr>
+      </w:pPr>
+      <w:proofErr w:type="spellStart"/>
+      <w:r>
+        <w:rPr>
+          <w:b/>
+          <w:bCs/>
+        </w:rPr>
+        <w:t>useRef</w:t>
+      </w:r>
+      <w:proofErr w:type="spellEnd"/>
+    </w:p>
+    <w:p>
+      <w:r>
+        <w:t>Change value → No UI update</w:t>
+      </w:r>
+    </w:p>
+    <w:p>
+      <w:r>
+        <w:pict w14:anchorId="1BA51D37">
+          <v:rect id="_x0000_i1220" style="width:0;height:1.5pt" o:hralign="center" o:hrstd="t" o:hr="t" fillcolor="#a0a0a0" stroked="f"/>
+        </w:pict>
+      </w:r>
+    </w:p>
+    <w:p>
+      <w:pPr>
+        <w:rPr>
+          <w:b/>
+          <w:bCs/>
+        </w:rPr>
+      </w:pPr>
+      <w:r>
+        <w:rPr>
+          <w:b/>
+          <w:bCs/>
+        </w:rPr>
+        <w:t xml:space="preserve">4. </w:t>
+      </w:r>
+      <w:proofErr w:type="spellStart"/>
+      <w:proofErr w:type="gramStart"/>
+      <w:r>
+        <w:rPr>
+          <w:b/>
+          <w:bCs/>
+        </w:rPr>
+        <w:t>window.location</w:t>
+      </w:r>
+      <w:proofErr w:type="gramEnd"/>
+      <w:r>
+        <w:rPr>
+          <w:b/>
+          <w:bCs/>
+        </w:rPr>
+        <w:t>.href</w:t>
+      </w:r>
+      <w:proofErr w:type="spellEnd"/>
+    </w:p>
+    <w:p>
+      <w:pPr>
+        <w:rPr>
+          <w:b/>
+          <w:bCs/>
+        </w:rPr>
+      </w:pPr>
+      <w:r>
+        <w:rPr>
+          <w:b/>
+          <w:bCs/>
+        </w:rPr>
+        <w:t>Purpose</w:t>
+      </w:r>
+    </w:p>
+    <w:p>
+      <w:r>
+        <w:t>Used to get or change browser URL.</w:t>
+      </w:r>
+    </w:p>
+    <w:p>
+      <w:r>
+        <w:pict w14:anchorId="285E8D57">
+          <v:rect id="_x0000_i1221" style="width:0;height:1.5pt" o:hralign="center" o:hrstd="t" o:hr="t" fillcolor="#a0a0a0" stroked="f"/>
+        </w:pict>
+      </w:r>
+    </w:p>
+    <w:p>
+      <w:pPr>
+        <w:rPr>
+          <w:b/>
+          <w:bCs/>
+        </w:rPr>
+      </w:pPr>
+      <w:r>
+        <w:rPr>
+          <w:b/>
+          <w:bCs/>
+        </w:rPr>
+        <w:t>Get Current URL</w:t>
+      </w:r>
+    </w:p>
+    <w:p>
+      <w:r>
+        <w:t>console.log(</w:t>
+      </w:r>
+      <w:proofErr w:type="spellStart"/>
+      <w:proofErr w:type="gramStart"/>
+      <w:r>
+        <w:t>window.location</w:t>
+      </w:r>
+      <w:proofErr w:type="gramEnd"/>
+      <w:r>
+        <w:t>.href</w:t>
+      </w:r>
+      <w:proofErr w:type="spellEnd"/>
+      <w:r>
+        <w:t>);</w:t>
+      </w:r>
+    </w:p>
+    <w:p>
+      <w:r>
+        <w:t>Output:</w:t>
+      </w:r>
+    </w:p>
+    <w:p>
+      <w:r>
+        <w:t>http://localhost:3000/room/abc</w:t>
+      </w:r>
+    </w:p>
+    <w:p>
+      <w:r>
+        <w:pict w14:anchorId="4E610B96">
+          <v:rect id="_x0000_i1222" style="width:0;height:1.5pt" o:hralign="center" o:hrstd="t" o:hr="t" fillcolor="#a0a0a0" stroked="f"/>
+        </w:pict>
+      </w:r>
+    </w:p>
+    <w:p>
+      <w:pPr>
+        <w:rPr>
+          <w:b/>
+          <w:bCs/>
+        </w:rPr>
+      </w:pPr>
+      <w:r>
+        <w:rPr>
+          <w:b/>
+          <w:bCs/>
+        </w:rPr>
+        <w:t>Redirect User</w:t>
+      </w:r>
+    </w:p>
+    <w:p>
+      <w:proofErr w:type="spellStart"/>
+      <w:proofErr w:type="gramStart"/>
+      <w:r>
+        <w:t>window.location</w:t>
+      </w:r>
+      <w:proofErr w:type="gramEnd"/>
+      <w:r>
+        <w:t>.href</w:t>
+      </w:r>
+      <w:proofErr w:type="spellEnd"/>
+      <w:r>
+        <w:t xml:space="preserve"> = "/dashboard";</w:t>
+      </w:r>
+    </w:p>
+    <w:p>
+      <w:r>
+        <w:t>Browser navigates to dashboard.</w:t>
+      </w:r>
+    </w:p>
+    <w:p>
+      <w:r>
+        <w:pict w14:anchorId="7C06502E">
+          <v:rect id="_x0000_i1223" style="width:0;height:1.5pt" o:hralign="center" o:hrstd="t" o:hr="t" fillcolor="#a0a0a0" stroked="f"/>
+        </w:pict>
+      </w:r>
+    </w:p>
+    <w:p>
+      <w:pPr>
+        <w:rPr>
+          <w:b/>
+          <w:bCs/>
+        </w:rPr>
+      </w:pPr>
+      <w:r>
+        <w:rPr>
+          <w:b/>
+          <w:bCs/>
+        </w:rPr>
+        <w:t>External Redirect</w:t>
+      </w:r>
+    </w:p>
+    <w:p>
+      <w:proofErr w:type="spellStart"/>
+      <w:proofErr w:type="gramStart"/>
+      <w:r>
+        <w:t>window.location</w:t>
+      </w:r>
+      <w:proofErr w:type="gramEnd"/>
+      <w:r>
+        <w:t>.href</w:t>
+      </w:r>
+      <w:proofErr w:type="spellEnd"/>
+      <w:r>
+        <w:t xml:space="preserve"> = "https://github.com";</w:t>
+      </w:r>
+    </w:p>
+    <w:p>
+      <w:r>
+        <w:pict w14:anchorId="193EFAFC">
+          <v:rect id="_x0000_i1224" style="width:0;height:1.5pt" o:hralign="center" o:hrstd="t" o:hr="t" fillcolor="#a0a0a0" stroked="f"/>
+        </w:pict>
+      </w:r>
+    </w:p>
+    <w:p>
+      <w:pPr>
+        <w:rPr>
+          <w:b/>
+          <w:bCs/>
+        </w:rPr>
+      </w:pPr>
+      <w:r>
+        <w:rPr>
+          <w:b/>
+          <w:bCs/>
+        </w:rPr>
+        <w:lastRenderedPageBreak/>
+        <w:t>React Alternative</w:t>
+      </w:r>
+    </w:p>
+    <w:p>
+      <w:r>
+        <w:t>navigate("/dashboard");</w:t>
+      </w:r>
+    </w:p>
+    <w:p>
+      <w:r>
+        <w:t>using:</w:t>
+      </w:r>
+    </w:p>
+    <w:p>
+      <w:proofErr w:type="spellStart"/>
+      <w:r>
+        <w:t>const</w:t>
+      </w:r>
+      <w:proofErr w:type="spellEnd"/>
+      <w:r>
+        <w:t xml:space="preserve"> navigate = </w:t>
+      </w:r>
+      <w:proofErr w:type="spellStart"/>
+      <w:proofErr w:type="gramStart"/>
+      <w:r>
+        <w:t>useNavigate</w:t>
+      </w:r>
+      <w:proofErr w:type="spellEnd"/>
+      <w:r>
+        <w:t>(</w:t>
+      </w:r>
+      <w:proofErr w:type="gramEnd"/>
+      <w:r>
+        <w:t>);</w:t>
+      </w:r>
+    </w:p>
+    <w:p>
+      <w:r>
+        <w:pict w14:anchorId="202F5C35">
+          <v:rect id="_x0000_i1225" style="width:0;height:1.5pt" o:hralign="center" o:hrstd="t" o:hr="t" fillcolor="#a0a0a0" stroked="f"/>
+        </w:pict>
+      </w:r>
+    </w:p>
+    <w:p>
+      <w:pPr>
+        <w:rPr>
+          <w:b/>
+          <w:bCs/>
+        </w:rPr>
+      </w:pPr>
+      <w:r>
+        <w:rPr>
+          <w:b/>
+          <w:bCs/>
+        </w:rPr>
+        <w:t>Difference</w:t>
+      </w:r>
+    </w:p>
+    <w:tbl>
+      <w:tblPr>
+        <w:tblW w:w="0" w:type="auto"/>
+        <w:tblCellSpacing w:w="15" w:type="dxa"/>
+        <w:tblCellMar>
+          <w:top w:w="15" w:type="dxa"/>
+          <w:left w:w="15" w:type="dxa"/>
+          <w:bottom w:w="15" w:type="dxa"/>
+          <w:right w:w="15" w:type="dxa"/>
+        </w:tblCellMar>
+        <w:tblLook w:val="04A0" w:firstRow="1" w:lastRow="0" w:firstColumn="1" w:lastColumn="0" w:noHBand="0" w:noVBand="1"/>
+      </w:tblPr>
+      <w:tblGrid>
+        <w:gridCol w:w="1972"/>
+        <w:gridCol w:w="433"/>
+        <w:gridCol w:w="849"/>
+      </w:tblGrid>
+      <w:tr>
+        <w:trPr>
+          <w:tblHeader/>
+          <w:tblCellSpacing w:w="15" w:type="dxa"/>
+        </w:trPr>
+        <w:tc>
+          <w:tcPr>
+            <w:tcW w:w="0" w:type="auto"/>
+            <w:vAlign w:val="center"/>
+            <w:hideMark/>
+          </w:tcPr>
+          <w:p>
+            <w:pPr>
+              <w:rPr>
+                <w:b/>
+                <w:bCs/>
+              </w:rPr>
+            </w:pPr>
+            <w:r>
+              <w:rPr>
+                <w:b/>
+                <w:bCs/>
+              </w:rPr>
+              <w:t>Feature</w:t>
+            </w:r>
+          </w:p>
+        </w:tc>
+        <w:tc>
+          <w:tcPr>
+            <w:tcW w:w="0" w:type="auto"/>
+            <w:vAlign w:val="center"/>
+            <w:hideMark/>
+          </w:tcPr>
+          <w:p>
+            <w:pPr>
+              <w:rPr>
+                <w:b/>
+                <w:bCs/>
+              </w:rPr>
+            </w:pPr>
+            <w:proofErr w:type="spellStart"/>
+            <w:r>
+              <w:rPr>
+                <w:b/>
+                <w:bCs/>
+              </w:rPr>
+              <w:t>href</w:t>
+            </w:r>
+            <w:proofErr w:type="spellEnd"/>
+          </w:p>
+        </w:tc>
+        <w:tc>
+          <w:tcPr>
+            <w:tcW w:w="0" w:type="auto"/>
+            <w:vAlign w:val="center"/>
+            <w:hideMark/>
+          </w:tcPr>
+          <w:p>
+            <w:pPr>
+              <w:rPr>
+                <w:b/>
+                <w:bCs/>
+              </w:rPr>
+            </w:pPr>
+            <w:r>
+              <w:rPr>
+                <w:b/>
+                <w:bCs/>
+              </w:rPr>
+              <w:t>navigate</w:t>
+            </w:r>
+          </w:p>
+        </w:tc>
+      </w:tr>
+      <w:tr>
+        <w:trPr>
+          <w:tblCellSpacing w:w="15" w:type="dxa"/>
+        </w:trPr>
+        <w:tc>
+          <w:tcPr>
+            <w:tcW w:w="0" w:type="auto"/>
+            <w:vAlign w:val="center"/>
+            <w:hideMark/>
+          </w:tcPr>
+          <w:p>
+            <w:r>
+              <w:t>Page Reload</w:t>
+            </w:r>
+          </w:p>
+        </w:tc>
+        <w:tc>
+          <w:tcPr>
+            <w:tcW w:w="0" w:type="auto"/>
+            <w:vAlign w:val="center"/>
+            <w:hideMark/>
+          </w:tcPr>
+          <w:p>
+            <w:r>
+              <w:t>Yes</w:t>
+            </w:r>
+          </w:p>
+        </w:tc>
+        <w:tc>
+          <w:tcPr>
+            <w:tcW w:w="0" w:type="auto"/>
+            <w:vAlign w:val="center"/>
+            <w:hideMark/>
+          </w:tcPr>
+          <w:p>
+            <w:r>
+              <w:t>No</w:t>
+            </w:r>
+          </w:p>
+        </w:tc>
+      </w:tr>
+      <w:tr>
+        <w:trPr>
+          <w:tblCellSpacing w:w="15" w:type="dxa"/>
+        </w:trPr>
+        <w:tc>
+          <w:tcPr>
+            <w:tcW w:w="0" w:type="auto"/>
+            <w:vAlign w:val="center"/>
+            <w:hideMark/>
+          </w:tcPr>
+          <w:p>
+            <w:r>
+              <w:t>SPA Friendly</w:t>
+            </w:r>
+          </w:p>
+        </w:tc>
+        <w:tc>
+          <w:tcPr>
+            <w:tcW w:w="0" w:type="auto"/>
+            <w:vAlign w:val="center"/>
+            <w:hideMark/>
+          </w:tcPr>
+          <w:p>
+            <w:r>
+              <w:t>No</w:t>
+            </w:r>
+          </w:p>
+        </w:tc>
+        <w:tc>
+          <w:tcPr>
+            <w:tcW w:w="0" w:type="auto"/>
+            <w:vAlign w:val="center"/>
+            <w:hideMark/>
+          </w:tcPr>
+          <w:p>
+            <w:r>
+              <w:t>Yes</w:t>
+            </w:r>
+          </w:p>
+        </w:tc>
+      </w:tr>
+      <w:tr>
+        <w:trPr>
+          <w:tblCellSpacing w:w="15" w:type="dxa"/>
+        </w:trPr>
+        <w:tc>
+          <w:tcPr>
+            <w:tcW w:w="0" w:type="auto"/>
+            <w:vAlign w:val="center"/>
+            <w:hideMark/>
+          </w:tcPr>
+          <w:p>
+            <w:r>
+              <w:t>React Recommended</w:t>
+            </w:r>
+          </w:p>
+        </w:tc>
+        <w:tc>
+          <w:tcPr>
+            <w:tcW w:w="0" w:type="auto"/>
+            <w:vAlign w:val="center"/>
+            <w:hideMark/>
+          </w:tcPr>
+          <w:p>
+            <w:r>
+              <w:t>No</w:t>
+            </w:r>
+          </w:p>
+        </w:tc>
+        <w:tc>
+          <w:tcPr>
+            <w:tcW w:w="0" w:type="auto"/>
+            <w:vAlign w:val="center"/>
+            <w:hideMark/>
+          </w:tcPr>
+          <w:p>
+            <w:r>
+              <w:t>Yes</w:t>
+            </w:r>
+          </w:p>
+        </w:tc>
+      </w:tr>
+    </w:tbl>
+    <w:p>
+      <w:r>
+        <w:pict w14:anchorId="53F11BBE">
+          <v:rect id="_x0000_i1226" style="width:0;height:1.5pt" o:hralign="center" o:hrstd="t" o:hr="t" fillcolor="#a0a0a0" stroked="f"/>
+        </w:pict>
+      </w:r>
+    </w:p>
+    <w:p>
+      <w:pPr>
+        <w:rPr>
+          <w:b/>
+          <w:bCs/>
+        </w:rPr>
+      </w:pPr>
+      <w:r>
+        <w:rPr>
+          <w:b/>
+          <w:bCs/>
+        </w:rPr>
+        <w:t>5. STUN Server</w:t>
+      </w:r>
+    </w:p>
+    <w:p>
+      <w:pPr>
+        <w:rPr>
+          <w:b/>
+          <w:bCs/>
+        </w:rPr>
+      </w:pPr>
+      <w:r>
+        <w:rPr>
+          <w:b/>
+          <w:bCs/>
+        </w:rPr>
+        <w:t>Full Form</w:t>
+      </w:r>
+    </w:p>
+    <w:p>
+      <w:r>
+        <w:rPr>
+          <w:b/>
+          <w:bCs/>
+        </w:rPr>
+        <w:t>Session Traversal Utilities for NAT</w:t>
+      </w:r>
+    </w:p>
+    <w:p>
+      <w:r>
+        <w:pict w14:anchorId="63C23498">
+          <v:rect id="_x0000_i1227" style="width:0;height:1.5pt" o:hralign="center" o:hrstd="t" o:hr="t" fillcolor="#a0a0a0" stroked="f"/>
+        </w:pict>
+      </w:r>
+    </w:p>
+    <w:p>
+      <w:pPr>
+        <w:rPr>
+          <w:b/>
+          <w:bCs/>
+        </w:rPr>
+      </w:pPr>
+      <w:r>
+        <w:rPr>
+          <w:b/>
+          <w:bCs/>
+        </w:rPr>
+        <w:t>Purpose</w:t>
+      </w:r>
+    </w:p>
+    <w:p>
+      <w:r>
+        <w:t>Helps devices discover their public IP and port.</w:t>
+      </w:r>
+    </w:p>
+    <w:p>
+      <w:r>
+        <w:pict w14:anchorId="2C688CA1">
+          <v:rect id="_x0000_i1228" style="width:0;height:1.5pt" o:hralign="center" o:hrstd="t" o:hr="t" fillcolor="#a0a0a0" stroked="f"/>
+        </w:pict>
+      </w:r>
+    </w:p>
+    <w:p>
+      <w:pPr>
+        <w:rPr>
+          <w:b/>
+          <w:bCs/>
+        </w:rPr>
+      </w:pPr>
+      <w:r>
+        <w:rPr>
+          <w:b/>
+          <w:bCs/>
+        </w:rPr>
+        <w:t>Problem</w:t>
+      </w:r>
+    </w:p>
+    <w:p>
+      <w:r>
+        <w:t>Your laptop may have:</w:t>
+      </w:r>
+    </w:p>
+    <w:p>
+      <w:r>
+        <w:t>192.168.1.10</w:t>
+      </w:r>
+    </w:p>
+    <w:p>
+      <w:r>
+        <w:t xml:space="preserve">This IP works only inside your </w:t>
+      </w:r>
+      <w:proofErr w:type="spellStart"/>
+      <w:r>
+        <w:t>WiFi</w:t>
+      </w:r>
+      <w:proofErr w:type="spellEnd"/>
+      <w:r>
+        <w:t>.</w:t>
+      </w:r>
+    </w:p>
+    <w:p>
+      <w:r>
+        <w:t>People on internet cannot reach this IP.</w:t>
+      </w:r>
+    </w:p>
+    <w:p>
+      <w:r>
+        <w:pict w14:anchorId="41E7B50F">
+          <v:rect id="_x0000_i1229" style="width:0;height:1.5pt" o:hralign="center" o:hrstd="t" o:hr="t" fillcolor="#a0a0a0" stroked="f"/>
+        </w:pict>
+      </w:r>
+    </w:p>
+    <w:p>
+      <w:pPr>
+        <w:rPr>
+          <w:b/>
+          <w:bCs/>
+        </w:rPr>
+      </w:pPr>
+      <w:r>
+        <w:rPr>
+          <w:b/>
+          <w:bCs/>
+        </w:rPr>
+        <w:t>Solution</w:t>
+      </w:r>
+    </w:p>
+    <w:p>
+      <w:r>
+        <w:t>Browser contacts STUN server:</w:t>
+      </w:r>
+    </w:p>
+    <w:p>
+      <w:r>
+        <w:t>Who am I on the internet?</w:t>
+      </w:r>
+    </w:p>
+    <w:p>
+      <w:r>
+        <w:t>STUN server replies:</w:t>
+      </w:r>
+    </w:p>
+    <w:p>
+      <w:r>
+        <w:t>49.205.100.50:54321</w:t>
+      </w:r>
+    </w:p>
+    <w:p>
+      <w:r>
+        <w:t>This is your public IP and port.</w:t>
+      </w:r>
+    </w:p>
+    <w:p>
+      <w:r>
+        <w:lastRenderedPageBreak/>
+        <w:pict w14:anchorId="7119DF9B">
+          <v:rect id="_x0000_i1230" style="width:0;height:1.5pt" o:hralign="center" o:hrstd="t" o:hr="t" fillcolor="#a0a0a0" stroked="f"/>
+        </w:pict>
+      </w:r>
+    </w:p>
+    <w:p>
+      <w:pPr>
+        <w:rPr>
+          <w:b/>
+          <w:bCs/>
+        </w:rPr>
+      </w:pPr>
+      <w:r>
+        <w:rPr>
+          <w:b/>
+          <w:bCs/>
+        </w:rPr>
+        <w:t>Flow</w:t>
+      </w:r>
+    </w:p>
+    <w:p>
+      <w:r>
+        <w:t>Your Device</w:t>
+      </w:r>
+    </w:p>
+    <w:p>
+      <w:r>
+        <w:t xml:space="preserve">    ↓</w:t>
+      </w:r>
+    </w:p>
+    <w:p>
+      <w:r>
+        <w:t>STUN Server</w:t>
+      </w:r>
+    </w:p>
+    <w:p>
+      <w:r>
+        <w:t xml:space="preserve">    ↓</w:t>
+      </w:r>
+    </w:p>
+    <w:p>
+      <w:r>
+        <w:t>Public IP + Port</w:t>
+      </w:r>
+    </w:p>
+    <w:p>
+      <w:r>
+        <w:pict w14:anchorId="08A43160">
+          <v:rect id="_x0000_i1231" style="width:0;height:1.5pt" o:hralign="center" o:hrstd="t" o:hr="t" fillcolor="#a0a0a0" stroked="f"/>
+        </w:pict>
+      </w:r>
+    </w:p>
+    <w:p>
+      <w:pPr>
+        <w:rPr>
+          <w:b/>
+          <w:bCs/>
+        </w:rPr>
+      </w:pPr>
+      <w:r>
+        <w:rPr>
+          <w:b/>
+          <w:bCs/>
+        </w:rPr>
+        <w:t>Example</w:t>
+      </w:r>
+    </w:p>
+    <w:p>
+      <w:proofErr w:type="spellStart"/>
+      <w:r>
+        <w:t>const</w:t>
+      </w:r>
+      <w:proofErr w:type="spellEnd"/>
+      <w:r>
+        <w:t xml:space="preserve"> </w:t>
+      </w:r>
+      <w:proofErr w:type="spellStart"/>
+      <w:r>
+        <w:t>peerConfigConnections</w:t>
+      </w:r>
+      <w:proofErr w:type="spellEnd"/>
+      <w:r>
+        <w:t xml:space="preserve"> = {</w:t>
+      </w:r>
+    </w:p>
+    <w:p>
+      <w:r>
+        <w:t xml:space="preserve">    </w:t>
+      </w:r>
+      <w:proofErr w:type="spellStart"/>
+      <w:r>
+        <w:t>iceServers</w:t>
+      </w:r>
+      <w:proofErr w:type="spellEnd"/>
+      <w:r>
+        <w:t>: [</w:t>
+      </w:r>
+    </w:p>
+    <w:p>
+      <w:r>
+        <w:t xml:space="preserve">        {</w:t>
+      </w:r>
+    </w:p>
+    <w:p>
+      <w:r>
+        <w:t xml:space="preserve">            </w:t>
+      </w:r>
+      <w:proofErr w:type="spellStart"/>
+      <w:r>
+        <w:t>urls</w:t>
+      </w:r>
+      <w:proofErr w:type="spellEnd"/>
+      <w:r>
+        <w:t>: "</w:t>
+      </w:r>
+      <w:proofErr w:type="gramStart"/>
+      <w:r>
+        <w:t>stun:stun.l.google.com:19302</w:t>
+      </w:r>
+      <w:proofErr w:type="gramEnd"/>
+      <w:r>
+        <w:t>"</w:t>
+      </w:r>
+    </w:p>
+    <w:p>
+      <w:r>
+        <w:t xml:space="preserve">        }</w:t>
+      </w:r>
+    </w:p>
+    <w:p>
+      <w:r>
+        <w:t xml:space="preserve">    ]</w:t>
+      </w:r>
+    </w:p>
+    <w:p>
+      <w:r>
+        <w:t>}</w:t>
+      </w:r>
+    </w:p>
+    <w:p>
+      <w:r>
+        <w:t>Google's public STUN server:</w:t>
+      </w:r>
+    </w:p>
+    <w:p>
+      <w:r>
+        <w:t>stun.l.google.com:19302</w:t>
+      </w:r>
+    </w:p>
+    <w:p>
+      <w:r>
+        <w:pict w14:anchorId="1E06F14A">
+          <v:rect id="_x0000_i1232" style="width:0;height:1.5pt" o:hralign="center" o:hrstd="t" o:hr="t" fillcolor="#a0a0a0" stroked="f"/>
+        </w:pict>
+      </w:r>
+    </w:p>
+    <w:p>
+      <w:pPr>
+        <w:rPr>
+          <w:b/>
+          <w:bCs/>
+        </w:rPr>
+      </w:pPr>
+      <w:r>
+        <w:rPr>
+          <w:b/>
+          <w:bCs/>
+        </w:rPr>
+        <w:t>6. TURN Server</w:t>
+      </w:r>
+    </w:p>
+    <w:p>
+      <w:r>
+        <w:t>If STUN fails because of strict firewalls:</w:t>
+      </w:r>
+    </w:p>
+    <w:p>
+      <w:r>
+        <w:t>Peer-to-peer connection fails</w:t>
+      </w:r>
+    </w:p>
+    <w:p>
+      <w:r>
+        <w:t>TURN server acts as a relay.</w:t>
+      </w:r>
+    </w:p>
+    <w:p>
+      <w:r>
+        <w:pict w14:anchorId="0B636D51">
+          <v:rect id="_x0000_i1233" style="width:0;height:1.5pt" o:hralign="center" o:hrstd="t" o:hr="t" fillcolor="#a0a0a0" stroked="f"/>
+        </w:pict>
+      </w:r>
+    </w:p>
+    <w:p>
+      <w:pPr>
+        <w:rPr>
+          <w:b/>
+          <w:bCs/>
+        </w:rPr>
+      </w:pPr>
+      <w:r>
+        <w:rPr>
+          <w:b/>
+          <w:bCs/>
+        </w:rPr>
+        <w:t>Flow</w:t>
+      </w:r>
+    </w:p>
+    <w:p>
+      <w:r>
+        <w:t>Without TURN:</w:t>
+      </w:r>
+    </w:p>
+    <w:p>
+      <w:r>
+        <w:t>User A &lt;------&gt; User B</w:t>
+      </w:r>
+    </w:p>
+    <w:p>
+      <w:r>
+        <w:t>With TURN:</w:t>
+      </w:r>
+    </w:p>
+    <w:p>
+      <w:r>
+        <w:t>User A</w:t>
+      </w:r>
+    </w:p>
+    <w:p>
+      <w:r>
+        <w:t xml:space="preserve">   ↓</w:t>
+      </w:r>
+    </w:p>
+    <w:p>
+      <w:r>
+        <w:t>TURN Server</w:t>
+      </w:r>
+    </w:p>
+    <w:p>
+      <w:r>
+        <w:lastRenderedPageBreak/>
+        <w:t xml:space="preserve">   ↓</w:t>
+      </w:r>
+    </w:p>
+    <w:p>
+      <w:r>
+        <w:t>User B</w:t>
+      </w:r>
+    </w:p>
+    <w:p>
+      <w:r>
+        <w:pict w14:anchorId="00657035">
+          <v:rect id="_x0000_i1234" style="width:0;height:1.5pt" o:hralign="center" o:hrstd="t" o:hr="t" fillcolor="#a0a0a0" stroked="f"/>
+        </w:pict>
+      </w:r>
+    </w:p>
+    <w:p>
+      <w:pPr>
+        <w:rPr>
+          <w:b/>
+          <w:bCs/>
+        </w:rPr>
+      </w:pPr>
+      <w:r>
+        <w:rPr>
+          <w:b/>
+          <w:bCs/>
+        </w:rPr>
+        <w:t>Difference</w:t>
+      </w:r>
+    </w:p>
+    <w:tbl>
+      <w:tblPr>
+        <w:tblW w:w="0" w:type="auto"/>
+        <w:tblCellSpacing w:w="15" w:type="dxa"/>
+        <w:tblCellMar>
+          <w:top w:w="15" w:type="dxa"/>
+          <w:left w:w="15" w:type="dxa"/>
+          <w:bottom w:w="15" w:type="dxa"/>
+          <w:right w:w="15" w:type="dxa"/>
+        </w:tblCellMar>
+        <w:tblLook w:val="04A0" w:firstRow="1" w:lastRow="0" w:firstColumn="1" w:lastColumn="0" w:noHBand="0" w:noVBand="1"/>
+      </w:tblPr>
+      <w:tblGrid>
+        <w:gridCol w:w="1745"/>
+        <w:gridCol w:w="560"/>
+        <w:gridCol w:w="597"/>
+      </w:tblGrid>
+      <w:tr>
+        <w:trPr>
+          <w:tblHeader/>
+          <w:tblCellSpacing w:w="15" w:type="dxa"/>
+        </w:trPr>
+        <w:tc>
+          <w:tcPr>
+            <w:tcW w:w="0" w:type="auto"/>
+            <w:vAlign w:val="center"/>
+            <w:hideMark/>
+          </w:tcPr>
+          <w:p>
+            <w:pPr>
+              <w:rPr>
+                <w:b/>
+                <w:bCs/>
+              </w:rPr>
+            </w:pPr>
+            <w:r>
+              <w:rPr>
+                <w:b/>
+                <w:bCs/>
+              </w:rPr>
+              <w:t>Feature</w:t>
+            </w:r>
+          </w:p>
+        </w:tc>
+        <w:tc>
+          <w:tcPr>
+            <w:tcW w:w="0" w:type="auto"/>
+            <w:vAlign w:val="center"/>
+            <w:hideMark/>
+          </w:tcPr>
+          <w:p>
+            <w:pPr>
+              <w:rPr>
+                <w:b/>
+                <w:bCs/>
+              </w:rPr>
+            </w:pPr>
+            <w:r>
+              <w:rPr>
+                <w:b/>
+                <w:bCs/>
+              </w:rPr>
+              <w:t>STUN</w:t>
+            </w:r>
+          </w:p>
+        </w:tc>
+        <w:tc>
+          <w:tcPr>
+            <w:tcW w:w="0" w:type="auto"/>
+            <w:vAlign w:val="center"/>
+            <w:hideMark/>
+          </w:tcPr>
+          <w:p>
+            <w:pPr>
+              <w:rPr>
+                <w:b/>
+                <w:bCs/>
+              </w:rPr>
+            </w:pPr>
+            <w:r>
+              <w:rPr>
+                <w:b/>
+                <w:bCs/>
+              </w:rPr>
+              <w:t>TURN</w:t>
+            </w:r>
+          </w:p>
+        </w:tc>
+      </w:tr>
+      <w:tr>
+        <w:trPr>
+          <w:tblCellSpacing w:w="15" w:type="dxa"/>
+        </w:trPr>
+        <w:tc>
+          <w:tcPr>
+            <w:tcW w:w="0" w:type="auto"/>
+            <w:vAlign w:val="center"/>
+            <w:hideMark/>
+          </w:tcPr>
+          <w:p>
+            <w:r>
+              <w:t>Public IP Discovery</w:t>
+            </w:r>
+          </w:p>
+        </w:tc>
+        <w:tc>
+          <w:tcPr>
+            <w:tcW w:w="0" w:type="auto"/>
+            <w:vAlign w:val="center"/>
+            <w:hideMark/>
+          </w:tcPr>
+          <w:p>
+            <w:r>
+              <w:rPr>
+                <w:rFonts w:ascii="Segoe UI Emoji" w:hAnsi="Segoe UI Emoji" w:cs="Segoe UI Emoji"/>
+              </w:rPr>
+              <w:t>✅</w:t>
+            </w:r>
+          </w:p>
+        </w:tc>
+        <w:tc>
+          <w:tcPr>
+            <w:tcW w:w="0" w:type="auto"/>
+            <w:vAlign w:val="center"/>
+            <w:hideMark/>
+          </w:tcPr>
+          <w:p>
+            <w:r>
+              <w:rPr>
+                <w:rFonts w:ascii="Segoe UI Emoji" w:hAnsi="Segoe UI Emoji" w:cs="Segoe UI Emoji"/>
+              </w:rPr>
+              <w:t>✅</w:t>
+            </w:r>
+          </w:p>
+        </w:tc>
+      </w:tr>
+      <w:tr>
+        <w:trPr>
+          <w:tblCellSpacing w:w="15" w:type="dxa"/>
+        </w:trPr>
+        <w:tc>
+          <w:tcPr>
+            <w:tcW w:w="0" w:type="auto"/>
+            <w:vAlign w:val="center"/>
+            <w:hideMark/>
+          </w:tcPr>
+          <w:p>
+            <w:r>
+              <w:t>Media Relay</w:t>
+            </w:r>
+          </w:p>
+        </w:tc>
+        <w:tc>
+          <w:tcPr>
+            <w:tcW w:w="0" w:type="auto"/>
+            <w:vAlign w:val="center"/>
+            <w:hideMark/>
+          </w:tcPr>
+          <w:p>
+            <w:r>
+              <w:rPr>
+                <w:rFonts w:ascii="Segoe UI Emoji" w:hAnsi="Segoe UI Emoji" w:cs="Segoe UI Emoji"/>
+              </w:rPr>
+              <w:t>❌</w:t>
+            </w:r>
+          </w:p>
+        </w:tc>
+        <w:tc>
+          <w:tcPr>
+            <w:tcW w:w="0" w:type="auto"/>
+            <w:vAlign w:val="center"/>
+            <w:hideMark/>
+          </w:tcPr>
+          <w:p>
+            <w:r>
+              <w:rPr>
+                <w:rFonts w:ascii="Segoe UI Emoji" w:hAnsi="Segoe UI Emoji" w:cs="Segoe UI Emoji"/>
+              </w:rPr>
+              <w:t>✅</w:t>
+            </w:r>
+          </w:p>
+        </w:tc>
+      </w:tr>
+      <w:tr>
+        <w:trPr>
+          <w:tblCellSpacing w:w="15" w:type="dxa"/>
+        </w:trPr>
+        <w:tc>
+          <w:tcPr>
+            <w:tcW w:w="0" w:type="auto"/>
+            <w:vAlign w:val="center"/>
+            <w:hideMark/>
+          </w:tcPr>
+          <w:p>
+            <w:r>
+              <w:t>Faster</w:t>
+            </w:r>
+          </w:p>
+        </w:tc>
+        <w:tc>
+          <w:tcPr>
+            <w:tcW w:w="0" w:type="auto"/>
+            <w:vAlign w:val="center"/>
+            <w:hideMark/>
+          </w:tcPr>
+          <w:p>
+            <w:r>
+              <w:rPr>
+                <w:rFonts w:ascii="Segoe UI Emoji" w:hAnsi="Segoe UI Emoji" w:cs="Segoe UI Emoji"/>
+              </w:rPr>
+              <w:t>✅</w:t>
+            </w:r>
+          </w:p>
+        </w:tc>
+        <w:tc>
+          <w:tcPr>
+            <w:tcW w:w="0" w:type="auto"/>
+            <w:vAlign w:val="center"/>
+            <w:hideMark/>
+          </w:tcPr>
+          <w:p>
+            <w:r>
+              <w:rPr>
+                <w:rFonts w:ascii="Segoe UI Emoji" w:hAnsi="Segoe UI Emoji" w:cs="Segoe UI Emoji"/>
+              </w:rPr>
+              <w:t>❌</w:t>
+            </w:r>
+          </w:p>
+        </w:tc>
+      </w:tr>
+      <w:tr>
+        <w:trPr>
+          <w:tblCellSpacing w:w="15" w:type="dxa"/>
+        </w:trPr>
+        <w:tc>
+          <w:tcPr>
+            <w:tcW w:w="0" w:type="auto"/>
+            <w:vAlign w:val="center"/>
+            <w:hideMark/>
+          </w:tcPr>
+          <w:p>
+            <w:r>
+              <w:t>More Expensive</w:t>
+            </w:r>
+          </w:p>
+        </w:tc>
+        <w:tc>
+          <w:tcPr>
+            <w:tcW w:w="0" w:type="auto"/>
+            <w:vAlign w:val="center"/>
+            <w:hideMark/>
+          </w:tcPr>
+          <w:p>
+            <w:r>
+              <w:rPr>
+                <w:rFonts w:ascii="Segoe UI Emoji" w:hAnsi="Segoe UI Emoji" w:cs="Segoe UI Emoji"/>
+              </w:rPr>
+              <w:t>❌</w:t>
+            </w:r>
+          </w:p>
+        </w:tc>
+        <w:tc>
+          <w:tcPr>
+            <w:tcW w:w="0" w:type="auto"/>
+            <w:vAlign w:val="center"/>
+            <w:hideMark/>
+          </w:tcPr>
+          <w:p>
+            <w:r>
+              <w:rPr>
+                <w:rFonts w:ascii="Segoe UI Emoji" w:hAnsi="Segoe UI Emoji" w:cs="Segoe UI Emoji"/>
+              </w:rPr>
+              <w:t>✅</w:t>
+            </w:r>
+          </w:p>
+        </w:tc>
+      </w:tr>
+    </w:tbl>
+    <w:p>
+      <w:r>
+        <w:pict w14:anchorId="4E8E4212">
+          <v:rect id="_x0000_i1235" style="width:0;height:1.5pt" o:hralign="center" o:hrstd="t" o:hr="t" fillcolor="#a0a0a0" stroked="f"/>
+        </w:pict>
+      </w:r>
+    </w:p>
+    <w:p>
+      <w:pPr>
+        <w:rPr>
+          <w:b/>
+          <w:bCs/>
+        </w:rPr>
+      </w:pPr>
+      <w:r>
+        <w:rPr>
+          <w:b/>
+          <w:bCs/>
+        </w:rPr>
+        <w:t>7. Understanding Your Video Meet Component</w:t>
+      </w:r>
+    </w:p>
+    <w:p>
+      <w:r>
+        <w:pict w14:anchorId="42899BCF">
+          <v:rect id="_x0000_i1236" style="width:0;height:1.5pt" o:hralign="center" o:hrstd="t" o:hr="t" fillcolor="#a0a0a0" stroked="f"/>
+        </w:pict>
+      </w:r>
+    </w:p>
+    <w:p>
+      <w:pPr>
+        <w:rPr>
+          <w:b/>
+          <w:bCs/>
+        </w:rPr>
+      </w:pPr>
+      <w:proofErr w:type="spellStart"/>
+      <w:r>
+        <w:rPr>
+          <w:b/>
+          <w:bCs/>
+        </w:rPr>
+        <w:t>socketRef</w:t>
+      </w:r>
+      <w:proofErr w:type="spellEnd"/>
+    </w:p>
+    <w:p>
+      <w:r>
+        <w:t xml:space="preserve">var </w:t>
+      </w:r>
+      <w:proofErr w:type="spellStart"/>
+      <w:r>
+        <w:t>socketRef</w:t>
+      </w:r>
+      <w:proofErr w:type="spellEnd"/>
+      <w:r>
+        <w:t xml:space="preserve"> = </w:t>
+      </w:r>
+      <w:proofErr w:type="spellStart"/>
+      <w:proofErr w:type="gramStart"/>
+      <w:r>
+        <w:t>useRef</w:t>
+      </w:r>
+      <w:proofErr w:type="spellEnd"/>
+      <w:r>
+        <w:t>(</w:t>
+      </w:r>
+      <w:proofErr w:type="gramEnd"/>
+      <w:r>
+        <w:t>);</w:t>
+      </w:r>
+    </w:p>
+    <w:p>
+      <w:r>
+        <w:t>Stores socket connection.</w:t>
+      </w:r>
+    </w:p>
+    <w:p>
+      <w:r>
+        <w:t>Example:</w:t>
+      </w:r>
+    </w:p>
+    <w:p>
+      <w:proofErr w:type="spellStart"/>
+      <w:r>
+        <w:t>socketRef.current</w:t>
+      </w:r>
+      <w:proofErr w:type="spellEnd"/>
+      <w:r>
+        <w:t xml:space="preserve"> = io(</w:t>
+      </w:r>
+      <w:proofErr w:type="spellStart"/>
+      <w:r>
+        <w:t>server_url</w:t>
+      </w:r>
+      <w:proofErr w:type="spellEnd"/>
+      <w:r>
+        <w:t>);</w:t>
+      </w:r>
+    </w:p>
+    <w:p>
+      <w:r>
+        <w:t>Reason:</w:t>
+      </w:r>
+    </w:p>
+    <w:p>
+      <w:pPr>
+        <w:numPr>
+          <w:ilvl w:val="0"/>
+          <w:numId w:val="4"/>
+        </w:numPr>
+      </w:pPr>
+      <w:r>
+        <w:t xml:space="preserve">Avoid creating socket every render. </w:t>
+      </w:r>
+    </w:p>
+    <w:p>
+      <w:pPr>
+        <w:numPr>
+          <w:ilvl w:val="0"/>
+          <w:numId w:val="4"/>
+        </w:numPr>
+      </w:pPr>
+      <w:r>
+        <w:t xml:space="preserve">Socket object persists. </w:t>
+      </w:r>
+    </w:p>
+    <w:p>
+      <w:r>
+        <w:pict w14:anchorId="342B324F">
+          <v:rect id="_x0000_i1237" style="width:0;height:1.5pt" o:hralign="center" o:hrstd="t" o:hr="t" fillcolor="#a0a0a0" stroked="f"/>
+        </w:pict>
+      </w:r>
+    </w:p>
+    <w:p>
+      <w:pPr>
+        <w:rPr>
+          <w:b/>
+          <w:bCs/>
+        </w:rPr>
+      </w:pPr>
+      <w:proofErr w:type="spellStart"/>
+      <w:r>
+        <w:rPr>
+          <w:b/>
+          <w:bCs/>
+        </w:rPr>
+        <w:t>socketIdRef</w:t>
+      </w:r>
+      <w:proofErr w:type="spellEnd"/>
+    </w:p>
+    <w:p>
+      <w:r>
+        <w:t xml:space="preserve">let </w:t>
+      </w:r>
+      <w:proofErr w:type="spellStart"/>
+      <w:r>
+        <w:t>socketIdRef</w:t>
+      </w:r>
+      <w:proofErr w:type="spellEnd"/>
+      <w:r>
+        <w:t xml:space="preserve"> = </w:t>
+      </w:r>
+      <w:proofErr w:type="spellStart"/>
+      <w:proofErr w:type="gramStart"/>
+      <w:r>
+        <w:t>useRef</w:t>
+      </w:r>
+      <w:proofErr w:type="spellEnd"/>
+      <w:r>
+        <w:t>(</w:t>
+      </w:r>
+      <w:proofErr w:type="gramEnd"/>
+      <w:r>
+        <w:t>);</w:t>
+      </w:r>
+    </w:p>
+    <w:p>
+      <w:r>
+        <w:t>Stores:</w:t>
+      </w:r>
+    </w:p>
+    <w:p>
+      <w:r>
+        <w:t>socket.id</w:t>
+      </w:r>
+    </w:p>
+    <w:p>
+      <w:r>
+        <w:t>Example:</w:t>
+      </w:r>
+    </w:p>
+    <w:p>
+      <w:proofErr w:type="spellStart"/>
+      <w:r>
+        <w:t>socketIdRef.current</w:t>
+      </w:r>
+      <w:proofErr w:type="spellEnd"/>
+      <w:r>
+        <w:t xml:space="preserve"> = socket.id;</w:t>
+      </w:r>
+    </w:p>
+    <w:p>
+      <w:r>
+        <w:t>No UI update required.</w:t>
+      </w:r>
+    </w:p>
+    <w:p>
+      <w:r>
+        <w:pict w14:anchorId="7835DFEE">
+          <v:rect id="_x0000_i1238" style="width:0;height:1.5pt" o:hralign="center" o:hrstd="t" o:hr="t" fillcolor="#a0a0a0" stroked="f"/>
+        </w:pict>
+      </w:r>
+    </w:p>
+    <w:p>
+      <w:pPr>
+        <w:rPr>
+          <w:b/>
+          <w:bCs/>
+        </w:rPr>
+      </w:pPr>
+      <w:proofErr w:type="spellStart"/>
+      <w:r>
+        <w:rPr>
+          <w:b/>
+          <w:bCs/>
+        </w:rPr>
+        <w:t>localVideoref</w:t>
+      </w:r>
+      <w:proofErr w:type="spellEnd"/>
+    </w:p>
+    <w:p>
+      <w:r>
+        <w:lastRenderedPageBreak/>
+        <w:t xml:space="preserve">let </w:t>
+      </w:r>
+      <w:proofErr w:type="spellStart"/>
+      <w:r>
+        <w:t>localVideoref</w:t>
+      </w:r>
+      <w:proofErr w:type="spellEnd"/>
+      <w:r>
+        <w:t xml:space="preserve"> = </w:t>
+      </w:r>
+      <w:proofErr w:type="spellStart"/>
+      <w:proofErr w:type="gramStart"/>
+      <w:r>
+        <w:t>useRef</w:t>
+      </w:r>
+      <w:proofErr w:type="spellEnd"/>
+      <w:r>
+        <w:t>(</w:t>
+      </w:r>
+      <w:proofErr w:type="gramEnd"/>
+      <w:r>
+        <w:t>);</w:t>
+      </w:r>
+    </w:p>
+    <w:p>
+      <w:r>
+        <w:t>Stores local video DOM element.</w:t>
+      </w:r>
+    </w:p>
+    <w:p>
+      <w:r>
+        <w:t>&lt;video ref={</w:t>
+      </w:r>
+      <w:proofErr w:type="spellStart"/>
+      <w:r>
+        <w:t>localVideoref</w:t>
+      </w:r>
+      <w:proofErr w:type="spellEnd"/>
+      <w:r>
+        <w:t>} /&gt;</w:t>
+      </w:r>
+    </w:p>
+    <w:p>
+      <w:r>
+        <w:t>Then:</w:t>
+      </w:r>
+    </w:p>
+    <w:p>
+      <w:proofErr w:type="spellStart"/>
+      <w:proofErr w:type="gramStart"/>
+      <w:r>
+        <w:t>localVideoref.current.srcObject</w:t>
+      </w:r>
+      <w:proofErr w:type="spellEnd"/>
+      <w:proofErr w:type="gramEnd"/>
+      <w:r>
+        <w:t xml:space="preserve"> = stream;</w:t>
+      </w:r>
+    </w:p>
+    <w:p>
+      <w:r>
+        <w:pict w14:anchorId="45DCA87E">
+          <v:rect id="_x0000_i1239" style="width:0;height:1.5pt" o:hralign="center" o:hrstd="t" o:hr="t" fillcolor="#a0a0a0" stroked="f"/>
+        </w:pict>
+      </w:r>
+    </w:p>
+    <w:p>
+      <w:pPr>
+        <w:rPr>
+          <w:b/>
+          <w:bCs/>
+        </w:rPr>
+      </w:pPr>
+      <w:proofErr w:type="spellStart"/>
+      <w:r>
+        <w:rPr>
+          <w:b/>
+          <w:bCs/>
+        </w:rPr>
+        <w:t>videoRef</w:t>
+      </w:r>
+      <w:proofErr w:type="spellEnd"/>
+    </w:p>
+    <w:p>
+      <w:proofErr w:type="spellStart"/>
+      <w:r>
+        <w:t>const</w:t>
+      </w:r>
+      <w:proofErr w:type="spellEnd"/>
+      <w:r>
+        <w:t xml:space="preserve"> </w:t>
+      </w:r>
+      <w:proofErr w:type="spellStart"/>
+      <w:r>
+        <w:t>videoRef</w:t>
+      </w:r>
+      <w:proofErr w:type="spellEnd"/>
+      <w:r>
+        <w:t xml:space="preserve"> = </w:t>
+      </w:r>
+      <w:proofErr w:type="spellStart"/>
+      <w:proofErr w:type="gramStart"/>
+      <w:r>
+        <w:t>useRef</w:t>
+      </w:r>
+      <w:proofErr w:type="spellEnd"/>
+      <w:r>
+        <w:t>(</w:t>
+      </w:r>
+      <w:proofErr w:type="gramEnd"/>
+      <w:r>
+        <w:t>[]);</w:t>
+      </w:r>
+    </w:p>
+    <w:p>
+      <w:r>
+        <w:t>Stores references to remote user videos.</w:t>
+      </w:r>
+    </w:p>
+    <w:p>
+      <w:r>
+        <w:t>Example:</w:t>
+      </w:r>
+    </w:p>
+    <w:p>
+      <w:proofErr w:type="spellStart"/>
+      <w:r>
+        <w:t>videoRef.current</w:t>
+      </w:r>
+      <w:proofErr w:type="spellEnd"/>
+      <w:r>
+        <w:t>[0]</w:t>
+      </w:r>
+    </w:p>
+    <w:p>
+      <w:proofErr w:type="spellStart"/>
+      <w:r>
+        <w:t>videoRef.current</w:t>
+      </w:r>
+      <w:proofErr w:type="spellEnd"/>
+      <w:r>
+        <w:t>[1]</w:t>
+      </w:r>
+    </w:p>
+    <w:p>
+      <w:proofErr w:type="spellStart"/>
+      <w:r>
+        <w:t>videoRef.current</w:t>
+      </w:r>
+      <w:proofErr w:type="spellEnd"/>
+      <w:r>
+        <w:t>[2]</w:t>
+      </w:r>
+    </w:p>
+    <w:p>
+      <w:r>
+        <w:t>Used for:</w:t>
+      </w:r>
+    </w:p>
+    <w:p>
+      <w:proofErr w:type="spellStart"/>
+      <w:r>
+        <w:t>videoRef.current</w:t>
+      </w:r>
+      <w:proofErr w:type="spellEnd"/>
+      <w:r>
+        <w:t>[index</w:t>
+      </w:r>
+      <w:proofErr w:type="gramStart"/>
+      <w:r>
+        <w:t>].</w:t>
+      </w:r>
+      <w:proofErr w:type="spellStart"/>
+      <w:r>
+        <w:t>srcObject</w:t>
+      </w:r>
+      <w:proofErr w:type="spellEnd"/>
+      <w:proofErr w:type="gramEnd"/>
+      <w:r>
+        <w:t xml:space="preserve"> = </w:t>
+      </w:r>
+      <w:proofErr w:type="spellStart"/>
+      <w:r>
+        <w:t>remoteStream</w:t>
+      </w:r>
+      <w:proofErr w:type="spellEnd"/>
+      <w:r>
+        <w:t>;</w:t>
+      </w:r>
+    </w:p>
+    <w:p>
+      <w:r>
+        <w:pict w14:anchorId="3D38CD81">
+          <v:rect id="_x0000_i1240" style="width:0;height:1.5pt" o:hralign="center" o:hrstd="t" o:hr="t" fillcolor="#a0a0a0" stroked="f"/>
+        </w:pict>
+      </w:r>
+    </w:p>
+    <w:p>
+      <w:pPr>
+        <w:rPr>
+          <w:b/>
+          <w:bCs/>
+        </w:rPr>
+      </w:pPr>
+      <w:r>
+        <w:rPr>
+          <w:b/>
+          <w:bCs/>
+        </w:rPr>
+        <w:t>connections</w:t>
+      </w:r>
+    </w:p>
+    <w:p>
+      <w:r>
+        <w:t>Current:</w:t>
+      </w:r>
+    </w:p>
+    <w:p>
+      <w:r>
+        <w:t>var connections = {};</w:t>
+      </w:r>
+    </w:p>
+    <w:p>
+      <w:r>
+        <w:t>Better approach:</w:t>
+      </w:r>
+    </w:p>
+    <w:p>
+      <w:proofErr w:type="spellStart"/>
+      <w:r>
+        <w:t>const</w:t>
+      </w:r>
+      <w:proofErr w:type="spellEnd"/>
+      <w:r>
+        <w:t xml:space="preserve"> connections = </w:t>
+      </w:r>
+      <w:proofErr w:type="spellStart"/>
+      <w:proofErr w:type="gramStart"/>
+      <w:r>
+        <w:t>useRef</w:t>
+      </w:r>
+      <w:proofErr w:type="spellEnd"/>
+      <w:r>
+        <w:t>(</w:t>
+      </w:r>
+      <w:proofErr w:type="gramEnd"/>
+      <w:r>
+        <w:t>{});</w:t>
+      </w:r>
+    </w:p>
+    <w:p>
+      <w:r>
+        <w:t>Then:</w:t>
+      </w:r>
+    </w:p>
+    <w:p>
+      <w:proofErr w:type="spellStart"/>
+      <w:proofErr w:type="gramStart"/>
+      <w:r>
+        <w:t>connections.current</w:t>
+      </w:r>
+      <w:proofErr w:type="spellEnd"/>
+      <w:proofErr w:type="gramEnd"/>
+      <w:r>
+        <w:t>[</w:t>
+      </w:r>
+      <w:proofErr w:type="spellStart"/>
+      <w:r>
+        <w:t>socketId</w:t>
+      </w:r>
+      <w:proofErr w:type="spellEnd"/>
+      <w:r>
+        <w:t xml:space="preserve">] = </w:t>
+      </w:r>
+      <w:proofErr w:type="spellStart"/>
+      <w:r>
+        <w:t>peerConnection</w:t>
+      </w:r>
+      <w:proofErr w:type="spellEnd"/>
+      <w:r>
+        <w:t>;</w:t>
+      </w:r>
+    </w:p>
+    <w:p>
+      <w:r>
+        <w:t>This preserves peer connections across renders.</w:t>
+      </w:r>
+    </w:p>
+    <w:p>
+      <w:r>
+        <w:pict w14:anchorId="47309EA3">
+          <v:rect id="_x0000_i1241" style="width:0;height:1.5pt" o:hralign="center" o:hrstd="t" o:hr="t" fillcolor="#a0a0a0" stroked="f"/>
+        </w:pict>
+      </w:r>
+    </w:p>
+    <w:p>
+      <w:pPr>
+        <w:rPr>
+          <w:b/>
+          <w:bCs/>
+        </w:rPr>
+      </w:pPr>
+      <w:r>
+        <w:rPr>
+          <w:b/>
+          <w:bCs/>
+        </w:rPr>
+        <w:t>8. ICE Servers</w:t>
+      </w:r>
+    </w:p>
+    <w:p>
+      <w:r>
+        <w:t>You also encountered:</w:t>
+      </w:r>
+    </w:p>
+    <w:p>
+      <w:proofErr w:type="spellStart"/>
+      <w:r>
+        <w:t>iceServers</w:t>
+      </w:r>
+      <w:proofErr w:type="spellEnd"/>
+    </w:p>
+    <w:p>
+      <w:r>
+        <w:t>ICE stands for:</w:t>
+      </w:r>
+    </w:p>
+    <w:p>
+      <w:r>
+        <w:t>Interactive Connectivity Establishment</w:t>
+      </w:r>
+    </w:p>
+    <w:p>
+      <w:r>
+        <w:t>Its job is to find the best route between peers.</w:t>
+      </w:r>
+    </w:p>
+    <w:p>
+      <w:r>
+        <w:lastRenderedPageBreak/>
+        <w:t>Example:</w:t>
+      </w:r>
+    </w:p>
+    <w:p>
+      <w:proofErr w:type="spellStart"/>
+      <w:r>
+        <w:t>const</w:t>
+      </w:r>
+      <w:proofErr w:type="spellEnd"/>
+      <w:r>
+        <w:t xml:space="preserve"> </w:t>
+      </w:r>
+      <w:proofErr w:type="spellStart"/>
+      <w:r>
+        <w:t>peerConfigConnections</w:t>
+      </w:r>
+      <w:proofErr w:type="spellEnd"/>
+      <w:r>
+        <w:t xml:space="preserve"> = {</w:t>
+      </w:r>
+    </w:p>
+    <w:p>
+      <w:r>
+        <w:t xml:space="preserve">    </w:t>
+      </w:r>
+      <w:proofErr w:type="spellStart"/>
+      <w:r>
+        <w:t>iceServers</w:t>
+      </w:r>
+      <w:proofErr w:type="spellEnd"/>
+      <w:r>
+        <w:t>: [</w:t>
+      </w:r>
+    </w:p>
+    <w:p>
+      <w:r>
+        <w:t xml:space="preserve">        {</w:t>
+      </w:r>
+    </w:p>
+    <w:p>
+      <w:r>
+        <w:t xml:space="preserve">            </w:t>
+      </w:r>
+      <w:proofErr w:type="spellStart"/>
+      <w:r>
+        <w:t>urls</w:t>
+      </w:r>
+      <w:proofErr w:type="spellEnd"/>
+      <w:r>
+        <w:t>: "</w:t>
+      </w:r>
+      <w:proofErr w:type="gramStart"/>
+      <w:r>
+        <w:t>stun:stun.l.google.com:19302</w:t>
+      </w:r>
+      <w:proofErr w:type="gramEnd"/>
+      <w:r>
+        <w:t>"</w:t>
+      </w:r>
+    </w:p>
+    <w:p>
+      <w:r>
+        <w:t xml:space="preserve">        }</w:t>
+      </w:r>
+    </w:p>
+    <w:p>
+      <w:r>
+        <w:t xml:space="preserve">    ]</w:t>
+      </w:r>
+    </w:p>
+    <w:p>
+      <w:r>
+        <w:t>};</w:t>
+      </w:r>
+    </w:p>
+    <w:p>
+      <w:r>
+        <w:t>ICE uses:</w:t>
+      </w:r>
+    </w:p>
+    <w:p>
+      <w:pPr>
+        <w:numPr>
+          <w:ilvl w:val="0"/>
+          <w:numId w:val="5"/>
+        </w:numPr>
+      </w:pPr>
+      <w:r>
+        <w:t xml:space="preserve">STUN server </w:t>
+      </w:r>
+    </w:p>
+    <w:p>
+      <w:pPr>
+        <w:numPr>
+          <w:ilvl w:val="0"/>
+          <w:numId w:val="5"/>
+        </w:numPr>
+      </w:pPr>
+      <w:r>
+        <w:t xml:space="preserve">TURN server </w:t>
+      </w:r>
+    </w:p>
+    <w:p>
+      <w:pPr>
+        <w:numPr>
+          <w:ilvl w:val="0"/>
+          <w:numId w:val="5"/>
+        </w:numPr>
+      </w:pPr>
+      <w:r>
+        <w:t xml:space="preserve">Candidate exchange </w:t>
+      </w:r>
+    </w:p>
+    <w:p>
+      <w:r>
+        <w:t>to establish connection.</w:t>
+      </w:r>
+    </w:p>
+    <w:p>
+      <w:r>
+        <w:rPr>
+          <w:noProof/>
+        </w:rPr>
+        <w:drawing>
+          <wp:inline distT="0" distB="0" distL="0" distR="0" wp14:anchorId="3BC59E14" wp14:editId="38FE3B9B">
+            <wp:extent cx="5731510" cy="728980"/>
+            <wp:effectExtent l="0" t="0" r="2540" b="0"/>
+            <wp:docPr id="1817499427" name="Picture 1"/>
+            <wp:cNvGraphicFramePr>
+              <a:graphicFrameLocks xmlns:a="http://schemas.openxmlformats.org/drawingml/2006/main" noChangeAspect="1"/>
+            </wp:cNvGraphicFramePr>
+            <a:graphic xmlns:a="http://schemas.openxmlformats.org/drawingml/2006/main">
+              <a:graphicData uri="http://schemas.openxmlformats.org/drawingml/2006/picture">
+                <pic:pic xmlns:pic="http://schemas.openxmlformats.org/drawingml/2006/picture">
+                  <pic:nvPicPr>
+                    <pic:cNvPr id="1817499427" name="Picture 1817499427"/>
+                    <pic:cNvPicPr/>
+                  </pic:nvPicPr>
+                  <pic:blipFill>
+                    <a:blip r:embed="rId5">
+                      <a:extLst>
+                        <a:ext uri="{28A0092B-C50C-407E-A947-70E740481C1C}">
+                          <a14:useLocalDpi xmlns:a14="http://schemas.microsoft.com/office/drawing/2010/main" val="0"/>
+                        </a:ext>
+                      </a:extLst>
+                    </a:blip>
+                    <a:stretch>
+                      <a:fillRect/>
+                    </a:stretch>
+                  </pic:blipFill>
+                  <pic:spPr>
+                    <a:xfrm>
+                      <a:off x="0" y="0"/>
+                      <a:ext cx="5731510" cy="728980"/>
+                    </a:xfrm>
+                    <a:prstGeom prst="rect">
+                      <a:avLst/>
+                    </a:prstGeom>
+                  </pic:spPr>
+                </pic:pic>
+              </a:graphicData>
+            </a:graphic>
+          </wp:inline>
+        </w:drawing>
+      </w:r>
+    </w:p>
     <w:sectPr>
       <w:pgSz w:w="11906" w:h="16838"/>
       <w:pgMar w:top="1440" w:right="1440" w:bottom="1440" w:left="1440" w:header="708" w:footer="708" w:gutter="0"/>
@@ -11,6 +3232,699 @@
     </w:sectPr>
   </w:body>
 </w:document>
+</file>
+
+<file path=word/numbering.xml><?xml version="1.0" encoding="utf-8"?>
+<w:numbering xmlns:wpc="http://schemas.microsoft.com/office/word/2010/wordprocessingCanvas" xmlns:cx="http://schemas.microsoft.com/office/drawing/2014/chartex" xmlns:cx1="http://schemas.microsoft.com/office/drawing/2015/9/8/chartex" xmlns:cx2="http://schemas.microsoft.com/office/drawing/2015/10/21/chartex" xmlns:cx3="http://schemas.microsoft.com/office/drawing/2016/5/9/chartex" xmlns:cx4="http://schemas.microsoft.com/office/drawing/2016/5/10/chartex" xmlns:cx5="http://schemas.microsoft.com/office/drawing/2016/5/11/chartex" xmlns:cx6="http://schemas.microsoft.com/office/drawing/2016/5/12/chartex" xmlns:cx7="http://schemas.microsoft.com/office/drawing/2016/5/13/chartex" xmlns:cx8="http://schemas.microsoft.com/office/drawing/2016/5/14/chartex" xmlns:mc="http://schemas.openxmlformats.org/markup-compatibility/2006" xmlns:aink="http://schemas.microsoft.com/office/drawing/2016/ink" xmlns:am3d="http://schemas.microsoft.com/office/drawing/2017/model3d" xmlns:o="urn:schemas-microsoft-com:office:office" xmlns:oel="http://schemas.microsoft.com/office/2019/extlst" xmlns:r="http://schemas.openxmlformats.org/officeDocument/2006/relationships" xmlns:m="http://schemas.openxmlformats.org/officeDocument/2006/math" xmlns:v="urn:schemas-microsoft-com:vml" xmlns:wp14="http://schemas.microsoft.com/office/word/2010/wordprocessingDrawing" xmlns:wp="http://schemas.openxmlformats.org/drawingml/2006/wordprocessingDrawing" xmlns:w10="urn:schemas-microsoft-com:office:word" xmlns:w="http://schemas.openxmlformats.org/wordprocessingml/2006/main" xmlns:w14="http://schemas.microsoft.com/office/word/2010/wordml" xmlns:w15="http://schemas.microsoft.com/office/word/2012/wordml" xmlns:w16cex="http://schemas.microsoft.com/office/word/2018/wordml/cex" xmlns:w16cid="http://schemas.microsoft.com/office/word/2016/wordml/cid" xmlns:w16="http://schemas.microsoft.com/office/word/2018/wordml" xmlns:w16du="http://schemas.microsoft.com/office/word/2023/wordml/word16du" xmlns:w16sdtdh="http://schemas.microsoft.com/office/word/2020/wordml/sdtdatahash" xmlns:w16sdtfl="http://schemas.microsoft.com/office/word/2024/wordml/sdtformatlock" xmlns:w16se="http://schemas.microsoft.com/office/word/2015/wordml/symex" xmlns:wpg="http://schemas.microsoft.com/office/word/2010/wordprocessingGroup" xmlns:wpi="http://schemas.microsoft.com/office/word/2010/wordprocessingInk" xmlns:wne="http://schemas.microsoft.com/office/word/2006/wordml" xmlns:wps="http://schemas.microsoft.com/office/word/2010/wordprocessingShape" mc:Ignorable="w14 w15 w16se w16cid w16 w16cex w16sdtdh w16sdtfl w16du wp14">
+  <w:abstractNum w:abstractNumId="0" w15:restartNumberingAfterBreak="0">
+    <w:nsid w:val="02EE19EE"/>
+    <w:multiLevelType w:val="multilevel"/>
+    <w:tmpl w:val="F9F2514A"/>
+    <w:lvl w:ilvl="0">
+      <w:start w:val="1"/>
+      <w:numFmt w:val="decimal"/>
+      <w:lvlText w:val="%1."/>
+      <w:lvlJc w:val="left"/>
+      <w:pPr>
+        <w:tabs>
+          <w:tab w:val="num" w:pos="720"/>
+        </w:tabs>
+        <w:ind w:left="720" w:hanging="360"/>
+      </w:pPr>
+    </w:lvl>
+    <w:lvl w:ilvl="1" w:tentative="1">
+      <w:start w:val="1"/>
+      <w:numFmt w:val="decimal"/>
+      <w:lvlText w:val="%2."/>
+      <w:lvlJc w:val="left"/>
+      <w:pPr>
+        <w:tabs>
+          <w:tab w:val="num" w:pos="1440"/>
+        </w:tabs>
+        <w:ind w:left="1440" w:hanging="360"/>
+      </w:pPr>
+    </w:lvl>
+    <w:lvl w:ilvl="2" w:tentative="1">
+      <w:start w:val="1"/>
+      <w:numFmt w:val="decimal"/>
+      <w:lvlText w:val="%3."/>
+      <w:lvlJc w:val="left"/>
+      <w:pPr>
+        <w:tabs>
+          <w:tab w:val="num" w:pos="2160"/>
+        </w:tabs>
+        <w:ind w:left="2160" w:hanging="360"/>
+      </w:pPr>
+    </w:lvl>
+    <w:lvl w:ilvl="3" w:tentative="1">
+      <w:start w:val="1"/>
+      <w:numFmt w:val="decimal"/>
+      <w:lvlText w:val="%4."/>
+      <w:lvlJc w:val="left"/>
+      <w:pPr>
+        <w:tabs>
+          <w:tab w:val="num" w:pos="2880"/>
+        </w:tabs>
+        <w:ind w:left="2880" w:hanging="360"/>
+      </w:pPr>
+    </w:lvl>
+    <w:lvl w:ilvl="4" w:tentative="1">
+      <w:start w:val="1"/>
+      <w:numFmt w:val="decimal"/>
+      <w:lvlText w:val="%5."/>
+      <w:lvlJc w:val="left"/>
+      <w:pPr>
+        <w:tabs>
+          <w:tab w:val="num" w:pos="3600"/>
+        </w:tabs>
+        <w:ind w:left="3600" w:hanging="360"/>
+      </w:pPr>
+    </w:lvl>
+    <w:lvl w:ilvl="5" w:tentative="1">
+      <w:start w:val="1"/>
+      <w:numFmt w:val="decimal"/>
+      <w:lvlText w:val="%6."/>
+      <w:lvlJc w:val="left"/>
+      <w:pPr>
+        <w:tabs>
+          <w:tab w:val="num" w:pos="4320"/>
+        </w:tabs>
+        <w:ind w:left="4320" w:hanging="360"/>
+      </w:pPr>
+    </w:lvl>
+    <w:lvl w:ilvl="6" w:tentative="1">
+      <w:start w:val="1"/>
+      <w:numFmt w:val="decimal"/>
+      <w:lvlText w:val="%7."/>
+      <w:lvlJc w:val="left"/>
+      <w:pPr>
+        <w:tabs>
+          <w:tab w:val="num" w:pos="5040"/>
+        </w:tabs>
+        <w:ind w:left="5040" w:hanging="360"/>
+      </w:pPr>
+    </w:lvl>
+    <w:lvl w:ilvl="7" w:tentative="1">
+      <w:start w:val="1"/>
+      <w:numFmt w:val="decimal"/>
+      <w:lvlText w:val="%8."/>
+      <w:lvlJc w:val="left"/>
+      <w:pPr>
+        <w:tabs>
+          <w:tab w:val="num" w:pos="5760"/>
+        </w:tabs>
+        <w:ind w:left="5760" w:hanging="360"/>
+      </w:pPr>
+    </w:lvl>
+    <w:lvl w:ilvl="8" w:tentative="1">
+      <w:start w:val="1"/>
+      <w:numFmt w:val="decimal"/>
+      <w:lvlText w:val="%9."/>
+      <w:lvlJc w:val="left"/>
+      <w:pPr>
+        <w:tabs>
+          <w:tab w:val="num" w:pos="6480"/>
+        </w:tabs>
+        <w:ind w:left="6480" w:hanging="360"/>
+      </w:pPr>
+    </w:lvl>
+  </w:abstractNum>
+  <w:abstractNum w:abstractNumId="1" w15:restartNumberingAfterBreak="0">
+    <w:nsid w:val="14F00155"/>
+    <w:multiLevelType w:val="multilevel"/>
+    <w:tmpl w:val="6D3C1832"/>
+    <w:lvl w:ilvl="0">
+      <w:start w:val="1"/>
+      <w:numFmt w:val="bullet"/>
+      <w:lvlText w:val=""/>
+      <w:lvlJc w:val="left"/>
+      <w:pPr>
+        <w:tabs>
+          <w:tab w:val="num" w:pos="720"/>
+        </w:tabs>
+        <w:ind w:left="720" w:hanging="360"/>
+      </w:pPr>
+      <w:rPr>
+        <w:rFonts w:ascii="Symbol" w:hAnsi="Symbol" w:hint="default"/>
+        <w:sz w:val="20"/>
+      </w:rPr>
+    </w:lvl>
+    <w:lvl w:ilvl="1" w:tentative="1">
+      <w:start w:val="1"/>
+      <w:numFmt w:val="bullet"/>
+      <w:lvlText w:val="o"/>
+      <w:lvlJc w:val="left"/>
+      <w:pPr>
+        <w:tabs>
+          <w:tab w:val="num" w:pos="1440"/>
+        </w:tabs>
+        <w:ind w:left="1440" w:hanging="360"/>
+      </w:pPr>
+      <w:rPr>
+        <w:rFonts w:ascii="Courier New" w:hAnsi="Courier New" w:hint="default"/>
+        <w:sz w:val="20"/>
+      </w:rPr>
+    </w:lvl>
+    <w:lvl w:ilvl="2" w:tentative="1">
+      <w:start w:val="1"/>
+      <w:numFmt w:val="bullet"/>
+      <w:lvlText w:val=""/>
+      <w:lvlJc w:val="left"/>
+      <w:pPr>
+        <w:tabs>
+          <w:tab w:val="num" w:pos="2160"/>
+        </w:tabs>
+        <w:ind w:left="2160" w:hanging="360"/>
+      </w:pPr>
+      <w:rPr>
+        <w:rFonts w:ascii="Wingdings" w:hAnsi="Wingdings" w:hint="default"/>
+        <w:sz w:val="20"/>
+      </w:rPr>
+    </w:lvl>
+    <w:lvl w:ilvl="3" w:tentative="1">
+      <w:start w:val="1"/>
+      <w:numFmt w:val="bullet"/>
+      <w:lvlText w:val=""/>
+      <w:lvlJc w:val="left"/>
+      <w:pPr>
+        <w:tabs>
+          <w:tab w:val="num" w:pos="2880"/>
+        </w:tabs>
+        <w:ind w:left="2880" w:hanging="360"/>
+      </w:pPr>
+      <w:rPr>
+        <w:rFonts w:ascii="Wingdings" w:hAnsi="Wingdings" w:hint="default"/>
+        <w:sz w:val="20"/>
+      </w:rPr>
+    </w:lvl>
+    <w:lvl w:ilvl="4" w:tentative="1">
+      <w:start w:val="1"/>
+      <w:numFmt w:val="bullet"/>
+      <w:lvlText w:val=""/>
+      <w:lvlJc w:val="left"/>
+      <w:pPr>
+        <w:tabs>
+          <w:tab w:val="num" w:pos="3600"/>
+        </w:tabs>
+        <w:ind w:left="3600" w:hanging="360"/>
+      </w:pPr>
+      <w:rPr>
+        <w:rFonts w:ascii="Wingdings" w:hAnsi="Wingdings" w:hint="default"/>
+        <w:sz w:val="20"/>
+      </w:rPr>
+    </w:lvl>
+    <w:lvl w:ilvl="5" w:tentative="1">
+      <w:start w:val="1"/>
+      <w:numFmt w:val="bullet"/>
+      <w:lvlText w:val=""/>
+      <w:lvlJc w:val="left"/>
+      <w:pPr>
+        <w:tabs>
+          <w:tab w:val="num" w:pos="4320"/>
+        </w:tabs>
+        <w:ind w:left="4320" w:hanging="360"/>
+      </w:pPr>
+      <w:rPr>
+        <w:rFonts w:ascii="Wingdings" w:hAnsi="Wingdings" w:hint="default"/>
+        <w:sz w:val="20"/>
+      </w:rPr>
+    </w:lvl>
+    <w:lvl w:ilvl="6" w:tentative="1">
+      <w:start w:val="1"/>
+      <w:numFmt w:val="bullet"/>
+      <w:lvlText w:val=""/>
+      <w:lvlJc w:val="left"/>
+      <w:pPr>
+        <w:tabs>
+          <w:tab w:val="num" w:pos="5040"/>
+        </w:tabs>
+        <w:ind w:left="5040" w:hanging="360"/>
+      </w:pPr>
+      <w:rPr>
+        <w:rFonts w:ascii="Wingdings" w:hAnsi="Wingdings" w:hint="default"/>
+        <w:sz w:val="20"/>
+      </w:rPr>
+    </w:lvl>
+    <w:lvl w:ilvl="7" w:tentative="1">
+      <w:start w:val="1"/>
+      <w:numFmt w:val="bullet"/>
+      <w:lvlText w:val=""/>
+      <w:lvlJc w:val="left"/>
+      <w:pPr>
+        <w:tabs>
+          <w:tab w:val="num" w:pos="5760"/>
+        </w:tabs>
+        <w:ind w:left="5760" w:hanging="360"/>
+      </w:pPr>
+      <w:rPr>
+        <w:rFonts w:ascii="Wingdings" w:hAnsi="Wingdings" w:hint="default"/>
+        <w:sz w:val="20"/>
+      </w:rPr>
+    </w:lvl>
+    <w:lvl w:ilvl="8" w:tentative="1">
+      <w:start w:val="1"/>
+      <w:numFmt w:val="bullet"/>
+      <w:lvlText w:val=""/>
+      <w:lvlJc w:val="left"/>
+      <w:pPr>
+        <w:tabs>
+          <w:tab w:val="num" w:pos="6480"/>
+        </w:tabs>
+        <w:ind w:left="6480" w:hanging="360"/>
+      </w:pPr>
+      <w:rPr>
+        <w:rFonts w:ascii="Wingdings" w:hAnsi="Wingdings" w:hint="default"/>
+        <w:sz w:val="20"/>
+      </w:rPr>
+    </w:lvl>
+  </w:abstractNum>
+  <w:abstractNum w:abstractNumId="2" w15:restartNumberingAfterBreak="0">
+    <w:nsid w:val="16073EBB"/>
+    <w:multiLevelType w:val="multilevel"/>
+    <w:tmpl w:val="8EEA3CC6"/>
+    <w:lvl w:ilvl="0">
+      <w:start w:val="1"/>
+      <w:numFmt w:val="bullet"/>
+      <w:lvlText w:val=""/>
+      <w:lvlJc w:val="left"/>
+      <w:pPr>
+        <w:tabs>
+          <w:tab w:val="num" w:pos="720"/>
+        </w:tabs>
+        <w:ind w:left="720" w:hanging="360"/>
+      </w:pPr>
+      <w:rPr>
+        <w:rFonts w:ascii="Symbol" w:hAnsi="Symbol" w:hint="default"/>
+        <w:sz w:val="20"/>
+      </w:rPr>
+    </w:lvl>
+    <w:lvl w:ilvl="1" w:tentative="1">
+      <w:start w:val="1"/>
+      <w:numFmt w:val="bullet"/>
+      <w:lvlText w:val="o"/>
+      <w:lvlJc w:val="left"/>
+      <w:pPr>
+        <w:tabs>
+          <w:tab w:val="num" w:pos="1440"/>
+        </w:tabs>
+        <w:ind w:left="1440" w:hanging="360"/>
+      </w:pPr>
+      <w:rPr>
+        <w:rFonts w:ascii="Courier New" w:hAnsi="Courier New" w:hint="default"/>
+        <w:sz w:val="20"/>
+      </w:rPr>
+    </w:lvl>
+    <w:lvl w:ilvl="2" w:tentative="1">
+      <w:start w:val="1"/>
+      <w:numFmt w:val="bullet"/>
+      <w:lvlText w:val=""/>
+      <w:lvlJc w:val="left"/>
+      <w:pPr>
+        <w:tabs>
+          <w:tab w:val="num" w:pos="2160"/>
+        </w:tabs>
+        <w:ind w:left="2160" w:hanging="360"/>
+      </w:pPr>
+      <w:rPr>
+        <w:rFonts w:ascii="Wingdings" w:hAnsi="Wingdings" w:hint="default"/>
+        <w:sz w:val="20"/>
+      </w:rPr>
+    </w:lvl>
+    <w:lvl w:ilvl="3" w:tentative="1">
+      <w:start w:val="1"/>
+      <w:numFmt w:val="bullet"/>
+      <w:lvlText w:val=""/>
+      <w:lvlJc w:val="left"/>
+      <w:pPr>
+        <w:tabs>
+          <w:tab w:val="num" w:pos="2880"/>
+        </w:tabs>
+        <w:ind w:left="2880" w:hanging="360"/>
+      </w:pPr>
+      <w:rPr>
+        <w:rFonts w:ascii="Wingdings" w:hAnsi="Wingdings" w:hint="default"/>
+        <w:sz w:val="20"/>
+      </w:rPr>
+    </w:lvl>
+    <w:lvl w:ilvl="4" w:tentative="1">
+      <w:start w:val="1"/>
+      <w:numFmt w:val="bullet"/>
+      <w:lvlText w:val=""/>
+      <w:lvlJc w:val="left"/>
+      <w:pPr>
+        <w:tabs>
+          <w:tab w:val="num" w:pos="3600"/>
+        </w:tabs>
+        <w:ind w:left="3600" w:hanging="360"/>
+      </w:pPr>
+      <w:rPr>
+        <w:rFonts w:ascii="Wingdings" w:hAnsi="Wingdings" w:hint="default"/>
+        <w:sz w:val="20"/>
+      </w:rPr>
+    </w:lvl>
+    <w:lvl w:ilvl="5" w:tentative="1">
+      <w:start w:val="1"/>
+      <w:numFmt w:val="bullet"/>
+      <w:lvlText w:val=""/>
+      <w:lvlJc w:val="left"/>
+      <w:pPr>
+        <w:tabs>
+          <w:tab w:val="num" w:pos="4320"/>
+        </w:tabs>
+        <w:ind w:left="4320" w:hanging="360"/>
+      </w:pPr>
+      <w:rPr>
+        <w:rFonts w:ascii="Wingdings" w:hAnsi="Wingdings" w:hint="default"/>
+        <w:sz w:val="20"/>
+      </w:rPr>
+    </w:lvl>
+    <w:lvl w:ilvl="6" w:tentative="1">
+      <w:start w:val="1"/>
+      <w:numFmt w:val="bullet"/>
+      <w:lvlText w:val=""/>
+      <w:lvlJc w:val="left"/>
+      <w:pPr>
+        <w:tabs>
+          <w:tab w:val="num" w:pos="5040"/>
+        </w:tabs>
+        <w:ind w:left="5040" w:hanging="360"/>
+      </w:pPr>
+      <w:rPr>
+        <w:rFonts w:ascii="Wingdings" w:hAnsi="Wingdings" w:hint="default"/>
+        <w:sz w:val="20"/>
+      </w:rPr>
+    </w:lvl>
+    <w:lvl w:ilvl="7" w:tentative="1">
+      <w:start w:val="1"/>
+      <w:numFmt w:val="bullet"/>
+      <w:lvlText w:val=""/>
+      <w:lvlJc w:val="left"/>
+      <w:pPr>
+        <w:tabs>
+          <w:tab w:val="num" w:pos="5760"/>
+        </w:tabs>
+        <w:ind w:left="5760" w:hanging="360"/>
+      </w:pPr>
+      <w:rPr>
+        <w:rFonts w:ascii="Wingdings" w:hAnsi="Wingdings" w:hint="default"/>
+        <w:sz w:val="20"/>
+      </w:rPr>
+    </w:lvl>
+    <w:lvl w:ilvl="8" w:tentative="1">
+      <w:start w:val="1"/>
+      <w:numFmt w:val="bullet"/>
+      <w:lvlText w:val=""/>
+      <w:lvlJc w:val="left"/>
+      <w:pPr>
+        <w:tabs>
+          <w:tab w:val="num" w:pos="6480"/>
+        </w:tabs>
+        <w:ind w:left="6480" w:hanging="360"/>
+      </w:pPr>
+      <w:rPr>
+        <w:rFonts w:ascii="Wingdings" w:hAnsi="Wingdings" w:hint="default"/>
+        <w:sz w:val="20"/>
+      </w:rPr>
+    </w:lvl>
+  </w:abstractNum>
+  <w:abstractNum w:abstractNumId="3" w15:restartNumberingAfterBreak="0">
+    <w:nsid w:val="3AFF1569"/>
+    <w:multiLevelType w:val="multilevel"/>
+    <w:tmpl w:val="37AE95FE"/>
+    <w:lvl w:ilvl="0">
+      <w:start w:val="1"/>
+      <w:numFmt w:val="decimal"/>
+      <w:lvlText w:val="%1."/>
+      <w:lvlJc w:val="left"/>
+      <w:pPr>
+        <w:tabs>
+          <w:tab w:val="num" w:pos="720"/>
+        </w:tabs>
+        <w:ind w:left="720" w:hanging="360"/>
+      </w:pPr>
+    </w:lvl>
+    <w:lvl w:ilvl="1" w:tentative="1">
+      <w:start w:val="1"/>
+      <w:numFmt w:val="decimal"/>
+      <w:lvlText w:val="%2."/>
+      <w:lvlJc w:val="left"/>
+      <w:pPr>
+        <w:tabs>
+          <w:tab w:val="num" w:pos="1440"/>
+        </w:tabs>
+        <w:ind w:left="1440" w:hanging="360"/>
+      </w:pPr>
+    </w:lvl>
+    <w:lvl w:ilvl="2" w:tentative="1">
+      <w:start w:val="1"/>
+      <w:numFmt w:val="decimal"/>
+      <w:lvlText w:val="%3."/>
+      <w:lvlJc w:val="left"/>
+      <w:pPr>
+        <w:tabs>
+          <w:tab w:val="num" w:pos="2160"/>
+        </w:tabs>
+        <w:ind w:left="2160" w:hanging="360"/>
+      </w:pPr>
+    </w:lvl>
+    <w:lvl w:ilvl="3" w:tentative="1">
+      <w:start w:val="1"/>
+      <w:numFmt w:val="decimal"/>
+      <w:lvlText w:val="%4."/>
+      <w:lvlJc w:val="left"/>
+      <w:pPr>
+        <w:tabs>
+          <w:tab w:val="num" w:pos="2880"/>
+        </w:tabs>
+        <w:ind w:left="2880" w:hanging="360"/>
+      </w:pPr>
+    </w:lvl>
+    <w:lvl w:ilvl="4" w:tentative="1">
+      <w:start w:val="1"/>
+      <w:numFmt w:val="decimal"/>
+      <w:lvlText w:val="%5."/>
+      <w:lvlJc w:val="left"/>
+      <w:pPr>
+        <w:tabs>
+          <w:tab w:val="num" w:pos="3600"/>
+        </w:tabs>
+        <w:ind w:left="3600" w:hanging="360"/>
+      </w:pPr>
+    </w:lvl>
+    <w:lvl w:ilvl="5" w:tentative="1">
+      <w:start w:val="1"/>
+      <w:numFmt w:val="decimal"/>
+      <w:lvlText w:val="%6."/>
+      <w:lvlJc w:val="left"/>
+      <w:pPr>
+        <w:tabs>
+          <w:tab w:val="num" w:pos="4320"/>
+        </w:tabs>
+        <w:ind w:left="4320" w:hanging="360"/>
+      </w:pPr>
+    </w:lvl>
+    <w:lvl w:ilvl="6" w:tentative="1">
+      <w:start w:val="1"/>
+      <w:numFmt w:val="decimal"/>
+      <w:lvlText w:val="%7."/>
+      <w:lvlJc w:val="left"/>
+      <w:pPr>
+        <w:tabs>
+          <w:tab w:val="num" w:pos="5040"/>
+        </w:tabs>
+        <w:ind w:left="5040" w:hanging="360"/>
+      </w:pPr>
+    </w:lvl>
+    <w:lvl w:ilvl="7" w:tentative="1">
+      <w:start w:val="1"/>
+      <w:numFmt w:val="decimal"/>
+      <w:lvlText w:val="%8."/>
+      <w:lvlJc w:val="left"/>
+      <w:pPr>
+        <w:tabs>
+          <w:tab w:val="num" w:pos="5760"/>
+        </w:tabs>
+        <w:ind w:left="5760" w:hanging="360"/>
+      </w:pPr>
+    </w:lvl>
+    <w:lvl w:ilvl="8" w:tentative="1">
+      <w:start w:val="1"/>
+      <w:numFmt w:val="decimal"/>
+      <w:lvlText w:val="%9."/>
+      <w:lvlJc w:val="left"/>
+      <w:pPr>
+        <w:tabs>
+          <w:tab w:val="num" w:pos="6480"/>
+        </w:tabs>
+        <w:ind w:left="6480" w:hanging="360"/>
+      </w:pPr>
+    </w:lvl>
+  </w:abstractNum>
+  <w:abstractNum w:abstractNumId="4" w15:restartNumberingAfterBreak="0">
+    <w:nsid w:val="520E1C95"/>
+    <w:multiLevelType w:val="multilevel"/>
+    <w:tmpl w:val="48266A70"/>
+    <w:lvl w:ilvl="0">
+      <w:start w:val="1"/>
+      <w:numFmt w:val="bullet"/>
+      <w:lvlText w:val=""/>
+      <w:lvlJc w:val="left"/>
+      <w:pPr>
+        <w:tabs>
+          <w:tab w:val="num" w:pos="720"/>
+        </w:tabs>
+        <w:ind w:left="720" w:hanging="360"/>
+      </w:pPr>
+      <w:rPr>
+        <w:rFonts w:ascii="Symbol" w:hAnsi="Symbol" w:hint="default"/>
+        <w:sz w:val="20"/>
+      </w:rPr>
+    </w:lvl>
+    <w:lvl w:ilvl="1" w:tentative="1">
+      <w:start w:val="1"/>
+      <w:numFmt w:val="bullet"/>
+      <w:lvlText w:val="o"/>
+      <w:lvlJc w:val="left"/>
+      <w:pPr>
+        <w:tabs>
+          <w:tab w:val="num" w:pos="1440"/>
+        </w:tabs>
+        <w:ind w:left="1440" w:hanging="360"/>
+      </w:pPr>
+      <w:rPr>
+        <w:rFonts w:ascii="Courier New" w:hAnsi="Courier New" w:hint="default"/>
+        <w:sz w:val="20"/>
+      </w:rPr>
+    </w:lvl>
+    <w:lvl w:ilvl="2" w:tentative="1">
+      <w:start w:val="1"/>
+      <w:numFmt w:val="bullet"/>
+      <w:lvlText w:val=""/>
+      <w:lvlJc w:val="left"/>
+      <w:pPr>
+        <w:tabs>
+          <w:tab w:val="num" w:pos="2160"/>
+        </w:tabs>
+        <w:ind w:left="2160" w:hanging="360"/>
+      </w:pPr>
+      <w:rPr>
+        <w:rFonts w:ascii="Wingdings" w:hAnsi="Wingdings" w:hint="default"/>
+        <w:sz w:val="20"/>
+      </w:rPr>
+    </w:lvl>
+    <w:lvl w:ilvl="3" w:tentative="1">
+      <w:start w:val="1"/>
+      <w:numFmt w:val="bullet"/>
+      <w:lvlText w:val=""/>
+      <w:lvlJc w:val="left"/>
+      <w:pPr>
+        <w:tabs>
+          <w:tab w:val="num" w:pos="2880"/>
+        </w:tabs>
+        <w:ind w:left="2880" w:hanging="360"/>
+      </w:pPr>
+      <w:rPr>
+        <w:rFonts w:ascii="Wingdings" w:hAnsi="Wingdings" w:hint="default"/>
+        <w:sz w:val="20"/>
+      </w:rPr>
+    </w:lvl>
+    <w:lvl w:ilvl="4" w:tentative="1">
+      <w:start w:val="1"/>
+      <w:numFmt w:val="bullet"/>
+      <w:lvlText w:val=""/>
+      <w:lvlJc w:val="left"/>
+      <w:pPr>
+        <w:tabs>
+          <w:tab w:val="num" w:pos="3600"/>
+        </w:tabs>
+        <w:ind w:left="3600" w:hanging="360"/>
+      </w:pPr>
+      <w:rPr>
+        <w:rFonts w:ascii="Wingdings" w:hAnsi="Wingdings" w:hint="default"/>
+        <w:sz w:val="20"/>
+      </w:rPr>
+    </w:lvl>
+    <w:lvl w:ilvl="5" w:tentative="1">
+      <w:start w:val="1"/>
+      <w:numFmt w:val="bullet"/>
+      <w:lvlText w:val=""/>
+      <w:lvlJc w:val="left"/>
+      <w:pPr>
+        <w:tabs>
+          <w:tab w:val="num" w:pos="4320"/>
+        </w:tabs>
+        <w:ind w:left="4320" w:hanging="360"/>
+      </w:pPr>
+      <w:rPr>
+        <w:rFonts w:ascii="Wingdings" w:hAnsi="Wingdings" w:hint="default"/>
+        <w:sz w:val="20"/>
+      </w:rPr>
+    </w:lvl>
+    <w:lvl w:ilvl="6" w:tentative="1">
+      <w:start w:val="1"/>
+      <w:numFmt w:val="bullet"/>
+      <w:lvlText w:val=""/>
+      <w:lvlJc w:val="left"/>
+      <w:pPr>
+        <w:tabs>
+          <w:tab w:val="num" w:pos="5040"/>
+        </w:tabs>
+        <w:ind w:left="5040" w:hanging="360"/>
+      </w:pPr>
+      <w:rPr>
+        <w:rFonts w:ascii="Wingdings" w:hAnsi="Wingdings" w:hint="default"/>
+        <w:sz w:val="20"/>
+      </w:rPr>
+    </w:lvl>
+    <w:lvl w:ilvl="7" w:tentative="1">
+      <w:start w:val="1"/>
+      <w:numFmt w:val="bullet"/>
+      <w:lvlText w:val=""/>
+      <w:lvlJc w:val="left"/>
+      <w:pPr>
+        <w:tabs>
+          <w:tab w:val="num" w:pos="5760"/>
+        </w:tabs>
+        <w:ind w:left="5760" w:hanging="360"/>
+      </w:pPr>
+      <w:rPr>
+        <w:rFonts w:ascii="Wingdings" w:hAnsi="Wingdings" w:hint="default"/>
+        <w:sz w:val="20"/>
+      </w:rPr>
+    </w:lvl>
+    <w:lvl w:ilvl="8" w:tentative="1">
+      <w:start w:val="1"/>
+      <w:numFmt w:val="bullet"/>
+      <w:lvlText w:val=""/>
+      <w:lvlJc w:val="left"/>
+      <w:pPr>
+        <w:tabs>
+          <w:tab w:val="num" w:pos="6480"/>
+        </w:tabs>
+        <w:ind w:left="6480" w:hanging="360"/>
+      </w:pPr>
+      <w:rPr>
+        <w:rFonts w:ascii="Wingdings" w:hAnsi="Wingdings" w:hint="default"/>
+        <w:sz w:val="20"/>
+      </w:rPr>
+    </w:lvl>
+  </w:abstractNum>
+  <w:num w:numId="1" w16cid:durableId="1628313210">
+    <w:abstractNumId w:val="2"/>
+  </w:num>
+  <w:num w:numId="2" w16cid:durableId="63525851">
+    <w:abstractNumId w:val="0"/>
+  </w:num>
+  <w:num w:numId="3" w16cid:durableId="1714188091">
+    <w:abstractNumId w:val="4"/>
+  </w:num>
+  <w:num w:numId="4" w16cid:durableId="1576817066">
+    <w:abstractNumId w:val="1"/>
+  </w:num>
+  <w:num w:numId="5" w16cid:durableId="1474129752">
+    <w:abstractNumId w:val="3"/>
+  </w:num>
+</w:numbering>
 </file>
 
 <file path=word/styles.xml><?xml version="1.0" encoding="utf-8"?>
@@ -616,7 +4530,6 @@
   <w:style w:type="character" w:default="1" w:styleId="DefaultParagraphFont">
     <w:name w:val="Default Paragraph Font"/>
     <w:uiPriority w:val="1"/>
-    <w:semiHidden/>
     <w:unhideWhenUsed/>
   </w:style>
   <w:style w:type="table" w:default="1" w:styleId="TableNormal">

</xml_diff>

<commit_message>
fix: resolve lobby connection and user media errors
</commit_message>
<xml_diff>
--- a/connetify document.docx
+++ b/connetify document.docx
@@ -52,7 +52,7 @@
     <w:p>
       <w:r>
         <w:pict w14:anchorId="6E10038E">
-          <v:rect id="_x0000_i1211" style="width:0;height:1.5pt" o:hralign="center" o:hrstd="t" o:hr="t" fillcolor="#a0a0a0" stroked="f"/>
+          <v:rect id="_x0000_i1025" style="width:0;height:1.5pt" o:hralign="center" o:hrstd="t" o:hr="t" fillcolor="#a0a0a0" stroked="f"/>
         </w:pict>
       </w:r>
     </w:p>
@@ -210,7 +210,7 @@
     <w:p>
       <w:r>
         <w:pict w14:anchorId="77655E69">
-          <v:rect id="_x0000_i1212" style="width:0;height:1.5pt" o:hralign="center" o:hrstd="t" o:hr="t" fillcolor="#a0a0a0" stroked="f"/>
+          <v:rect id="_x0000_i1026" style="width:0;height:1.5pt" o:hralign="center" o:hrstd="t" o:hr="t" fillcolor="#a0a0a0" stroked="f"/>
         </w:pict>
       </w:r>
     </w:p>
@@ -358,7 +358,7 @@
     <w:p>
       <w:r>
         <w:pict w14:anchorId="06E3DDDB">
-          <v:rect id="_x0000_i1213" style="width:0;height:1.5pt" o:hralign="center" o:hrstd="t" o:hr="t" fillcolor="#a0a0a0" stroked="f"/>
+          <v:rect id="_x0000_i1027" style="width:0;height:1.5pt" o:hralign="center" o:hrstd="t" o:hr="t" fillcolor="#a0a0a0" stroked="f"/>
         </w:pict>
       </w:r>
     </w:p>
@@ -507,7 +507,7 @@
     <w:p>
       <w:r>
         <w:pict w14:anchorId="6EC2C9D6">
-          <v:rect id="_x0000_i1214" style="width:0;height:1.5pt" o:hralign="center" o:hrstd="t" o:hr="t" fillcolor="#a0a0a0" stroked="f"/>
+          <v:rect id="_x0000_i1028" style="width:0;height:1.5pt" o:hralign="center" o:hrstd="t" o:hr="t" fillcolor="#a0a0a0" stroked="f"/>
         </w:pict>
       </w:r>
     </w:p>
@@ -651,7 +651,7 @@
     <w:p>
       <w:r>
         <w:pict w14:anchorId="41C6082F">
-          <v:rect id="_x0000_i1215" style="width:0;height:1.5pt" o:hralign="center" o:hrstd="t" o:hr="t" fillcolor="#a0a0a0" stroked="f"/>
+          <v:rect id="_x0000_i1029" style="width:0;height:1.5pt" o:hralign="center" o:hrstd="t" o:hr="t" fillcolor="#a0a0a0" stroked="f"/>
         </w:pict>
       </w:r>
     </w:p>
@@ -730,7 +730,7 @@
     <w:p>
       <w:r>
         <w:pict w14:anchorId="6534CD36">
-          <v:rect id="_x0000_i1216" style="width:0;height:1.5pt" o:hralign="center" o:hrstd="t" o:hr="t" fillcolor="#a0a0a0" stroked="f"/>
+          <v:rect id="_x0000_i1030" style="width:0;height:1.5pt" o:hralign="center" o:hrstd="t" o:hr="t" fillcolor="#a0a0a0" stroked="f"/>
         </w:pict>
       </w:r>
     </w:p>
@@ -833,7 +833,7 @@
     <w:p>
       <w:r>
         <w:pict w14:anchorId="35B17E2A">
-          <v:rect id="_x0000_i1217" style="width:0;height:1.5pt" o:hralign="center" o:hrstd="t" o:hr="t" fillcolor="#a0a0a0" stroked="f"/>
+          <v:rect id="_x0000_i1031" style="width:0;height:1.5pt" o:hralign="center" o:hrstd="t" o:hr="t" fillcolor="#a0a0a0" stroked="f"/>
         </w:pict>
       </w:r>
     </w:p>
@@ -1210,7 +1210,7 @@
     <w:p>
       <w:r>
         <w:pict w14:anchorId="7541DA29">
-          <v:rect id="_x0000_i1218" style="width:0;height:1.5pt" o:hralign="center" o:hrstd="t" o:hr="t" fillcolor="#a0a0a0" stroked="f"/>
+          <v:rect id="_x0000_i1032" style="width:0;height:1.5pt" o:hralign="center" o:hrstd="t" o:hr="t" fillcolor="#a0a0a0" stroked="f"/>
         </w:pict>
       </w:r>
     </w:p>
@@ -1254,7 +1254,7 @@
     <w:p>
       <w:r>
         <w:pict w14:anchorId="7A5B4CFA">
-          <v:rect id="_x0000_i1219" style="width:0;height:1.5pt" o:hralign="center" o:hrstd="t" o:hr="t" fillcolor="#a0a0a0" stroked="f"/>
+          <v:rect id="_x0000_i1033" style="width:0;height:1.5pt" o:hralign="center" o:hrstd="t" o:hr="t" fillcolor="#a0a0a0" stroked="f"/>
         </w:pict>
       </w:r>
     </w:p>
@@ -1283,7 +1283,7 @@
     <w:p>
       <w:r>
         <w:pict w14:anchorId="1BA51D37">
-          <v:rect id="_x0000_i1220" style="width:0;height:1.5pt" o:hralign="center" o:hrstd="t" o:hr="t" fillcolor="#a0a0a0" stroked="f"/>
+          <v:rect id="_x0000_i1034" style="width:0;height:1.5pt" o:hralign="center" o:hrstd="t" o:hr="t" fillcolor="#a0a0a0" stroked="f"/>
         </w:pict>
       </w:r>
     </w:p>
@@ -1343,7 +1343,7 @@
     <w:p>
       <w:r>
         <w:pict w14:anchorId="285E8D57">
-          <v:rect id="_x0000_i1221" style="width:0;height:1.5pt" o:hralign="center" o:hrstd="t" o:hr="t" fillcolor="#a0a0a0" stroked="f"/>
+          <v:rect id="_x0000_i1035" style="width:0;height:1.5pt" o:hralign="center" o:hrstd="t" o:hr="t" fillcolor="#a0a0a0" stroked="f"/>
         </w:pict>
       </w:r>
     </w:p>
@@ -1393,7 +1393,7 @@
     <w:p>
       <w:r>
         <w:pict w14:anchorId="4E610B96">
-          <v:rect id="_x0000_i1222" style="width:0;height:1.5pt" o:hralign="center" o:hrstd="t" o:hr="t" fillcolor="#a0a0a0" stroked="f"/>
+          <v:rect id="_x0000_i1036" style="width:0;height:1.5pt" o:hralign="center" o:hrstd="t" o:hr="t" fillcolor="#a0a0a0" stroked="f"/>
         </w:pict>
       </w:r>
     </w:p>
@@ -1435,7 +1435,7 @@
     <w:p>
       <w:r>
         <w:pict w14:anchorId="7C06502E">
-          <v:rect id="_x0000_i1223" style="width:0;height:1.5pt" o:hralign="center" o:hrstd="t" o:hr="t" fillcolor="#a0a0a0" stroked="f"/>
+          <v:rect id="_x0000_i1037" style="width:0;height:1.5pt" o:hralign="center" o:hrstd="t" o:hr="t" fillcolor="#a0a0a0" stroked="f"/>
         </w:pict>
       </w:r>
     </w:p>
@@ -1472,7 +1472,7 @@
     <w:p>
       <w:r>
         <w:pict w14:anchorId="193EFAFC">
-          <v:rect id="_x0000_i1224" style="width:0;height:1.5pt" o:hralign="center" o:hrstd="t" o:hr="t" fillcolor="#a0a0a0" stroked="f"/>
+          <v:rect id="_x0000_i1038" style="width:0;height:1.5pt" o:hralign="center" o:hrstd="t" o:hr="t" fillcolor="#a0a0a0" stroked="f"/>
         </w:pict>
       </w:r>
     </w:p>
@@ -1528,7 +1528,7 @@
     <w:p>
       <w:r>
         <w:pict w14:anchorId="202F5C35">
-          <v:rect id="_x0000_i1225" style="width:0;height:1.5pt" o:hralign="center" o:hrstd="t" o:hr="t" fillcolor="#a0a0a0" stroked="f"/>
+          <v:rect id="_x0000_i1039" style="width:0;height:1.5pt" o:hralign="center" o:hrstd="t" o:hr="t" fillcolor="#a0a0a0" stroked="f"/>
         </w:pict>
       </w:r>
     </w:p>
@@ -1765,7 +1765,7 @@
     <w:p>
       <w:r>
         <w:pict w14:anchorId="53F11BBE">
-          <v:rect id="_x0000_i1226" style="width:0;height:1.5pt" o:hralign="center" o:hrstd="t" o:hr="t" fillcolor="#a0a0a0" stroked="f"/>
+          <v:rect id="_x0000_i1040" style="width:0;height:1.5pt" o:hralign="center" o:hrstd="t" o:hr="t" fillcolor="#a0a0a0" stroked="f"/>
         </w:pict>
       </w:r>
     </w:p>
@@ -1811,7 +1811,7 @@
     <w:p>
       <w:r>
         <w:pict w14:anchorId="63C23498">
-          <v:rect id="_x0000_i1227" style="width:0;height:1.5pt" o:hralign="center" o:hrstd="t" o:hr="t" fillcolor="#a0a0a0" stroked="f"/>
+          <v:rect id="_x0000_i1041" style="width:0;height:1.5pt" o:hralign="center" o:hrstd="t" o:hr="t" fillcolor="#a0a0a0" stroked="f"/>
         </w:pict>
       </w:r>
     </w:p>
@@ -1838,7 +1838,7 @@
     <w:p>
       <w:r>
         <w:pict w14:anchorId="2C688CA1">
-          <v:rect id="_x0000_i1228" style="width:0;height:1.5pt" o:hralign="center" o:hrstd="t" o:hr="t" fillcolor="#a0a0a0" stroked="f"/>
+          <v:rect id="_x0000_i1042" style="width:0;height:1.5pt" o:hralign="center" o:hrstd="t" o:hr="t" fillcolor="#a0a0a0" stroked="f"/>
         </w:pict>
       </w:r>
     </w:p>
@@ -1888,7 +1888,7 @@
     <w:p>
       <w:r>
         <w:pict w14:anchorId="41E7B50F">
-          <v:rect id="_x0000_i1229" style="width:0;height:1.5pt" o:hralign="center" o:hrstd="t" o:hr="t" fillcolor="#a0a0a0" stroked="f"/>
+          <v:rect id="_x0000_i1043" style="width:0;height:1.5pt" o:hralign="center" o:hrstd="t" o:hr="t" fillcolor="#a0a0a0" stroked="f"/>
         </w:pict>
       </w:r>
     </w:p>
@@ -1936,7 +1936,7 @@
       <w:r>
         <w:lastRenderedPageBreak/>
         <w:pict w14:anchorId="7119DF9B">
-          <v:rect id="_x0000_i1230" style="width:0;height:1.5pt" o:hralign="center" o:hrstd="t" o:hr="t" fillcolor="#a0a0a0" stroked="f"/>
+          <v:rect id="_x0000_i1044" style="width:0;height:1.5pt" o:hralign="center" o:hrstd="t" o:hr="t" fillcolor="#a0a0a0" stroked="f"/>
         </w:pict>
       </w:r>
     </w:p>
@@ -1983,7 +1983,7 @@
     <w:p>
       <w:r>
         <w:pict w14:anchorId="08A43160">
-          <v:rect id="_x0000_i1231" style="width:0;height:1.5pt" o:hralign="center" o:hrstd="t" o:hr="t" fillcolor="#a0a0a0" stroked="f"/>
+          <v:rect id="_x0000_i1045" style="width:0;height:1.5pt" o:hralign="center" o:hrstd="t" o:hr="t" fillcolor="#a0a0a0" stroked="f"/>
         </w:pict>
       </w:r>
     </w:p>
@@ -2039,29 +2039,30 @@
       </w:r>
     </w:p>
     <w:p>
+      <w:pPr>
+        <w:rPr>
+          <w:lang w:val="de-DE"/>
+        </w:rPr>
+      </w:pPr>
       <w:r>
         <w:t xml:space="preserve">            </w:t>
       </w:r>
-      <w:proofErr w:type="spellStart"/>
-      <w:r>
-        <w:t>urls</w:t>
-      </w:r>
-      <w:proofErr w:type="spellEnd"/>
-      <w:r>
-        <w:t>: "</w:t>
-      </w:r>
-      <w:proofErr w:type="gramStart"/>
-      <w:r>
-        <w:t>stun:stun.l.google.com:19302</w:t>
-      </w:r>
-      <w:proofErr w:type="gramEnd"/>
-      <w:r>
-        <w:t>"</w:t>
-      </w:r>
-    </w:p>
-    <w:p>
-      <w:r>
-        <w:t xml:space="preserve">        }</w:t>
+      <w:r>
+        <w:rPr>
+          <w:lang w:val="de-DE"/>
+        </w:rPr>
+        <w:t>urls: "stun:stun.l.google.com:19302"</w:t>
+      </w:r>
+    </w:p>
+    <w:p>
+      <w:r>
+        <w:rPr>
+          <w:lang w:val="de-DE"/>
+        </w:rPr>
+        <w:t xml:space="preserve">        </w:t>
+      </w:r>
+      <w:r>
+        <w:t>}</w:t>
       </w:r>
     </w:p>
     <w:p>
@@ -2087,7 +2088,7 @@
     <w:p>
       <w:r>
         <w:pict w14:anchorId="1E06F14A">
-          <v:rect id="_x0000_i1232" style="width:0;height:1.5pt" o:hralign="center" o:hrstd="t" o:hr="t" fillcolor="#a0a0a0" stroked="f"/>
+          <v:rect id="_x0000_i1046" style="width:0;height:1.5pt" o:hralign="center" o:hrstd="t" o:hr="t" fillcolor="#a0a0a0" stroked="f"/>
         </w:pict>
       </w:r>
     </w:p>
@@ -2124,7 +2125,7 @@
     <w:p>
       <w:r>
         <w:pict w14:anchorId="0B636D51">
-          <v:rect id="_x0000_i1233" style="width:0;height:1.5pt" o:hralign="center" o:hrstd="t" o:hr="t" fillcolor="#a0a0a0" stroked="f"/>
+          <v:rect id="_x0000_i1047" style="width:0;height:1.5pt" o:hralign="center" o:hrstd="t" o:hr="t" fillcolor="#a0a0a0" stroked="f"/>
         </w:pict>
       </w:r>
     </w:p>
@@ -2187,7 +2188,7 @@
     <w:p>
       <w:r>
         <w:pict w14:anchorId="00657035">
-          <v:rect id="_x0000_i1234" style="width:0;height:1.5pt" o:hralign="center" o:hrstd="t" o:hr="t" fillcolor="#a0a0a0" stroked="f"/>
+          <v:rect id="_x0000_i1048" style="width:0;height:1.5pt" o:hralign="center" o:hrstd="t" o:hr="t" fillcolor="#a0a0a0" stroked="f"/>
         </w:pict>
       </w:r>
     </w:p>
@@ -2487,7 +2488,7 @@
     <w:p>
       <w:r>
         <w:pict w14:anchorId="4E8E4212">
-          <v:rect id="_x0000_i1235" style="width:0;height:1.5pt" o:hralign="center" o:hrstd="t" o:hr="t" fillcolor="#a0a0a0" stroked="f"/>
+          <v:rect id="_x0000_i1049" style="width:0;height:1.5pt" o:hralign="center" o:hrstd="t" o:hr="t" fillcolor="#a0a0a0" stroked="f"/>
         </w:pict>
       </w:r>
     </w:p>
@@ -2509,7 +2510,7 @@
     <w:p>
       <w:r>
         <w:pict w14:anchorId="42899BCF">
-          <v:rect id="_x0000_i1236" style="width:0;height:1.5pt" o:hralign="center" o:hrstd="t" o:hr="t" fillcolor="#a0a0a0" stroked="f"/>
+          <v:rect id="_x0000_i1050" style="width:0;height:1.5pt" o:hralign="center" o:hrstd="t" o:hr="t" fillcolor="#a0a0a0" stroked="f"/>
         </w:pict>
       </w:r>
     </w:p>
@@ -2614,7 +2615,7 @@
     <w:p>
       <w:r>
         <w:pict w14:anchorId="342B324F">
-          <v:rect id="_x0000_i1237" style="width:0;height:1.5pt" o:hralign="center" o:hrstd="t" o:hr="t" fillcolor="#a0a0a0" stroked="f"/>
+          <v:rect id="_x0000_i1051" style="width:0;height:1.5pt" o:hralign="center" o:hrstd="t" o:hr="t" fillcolor="#a0a0a0" stroked="f"/>
         </w:pict>
       </w:r>
     </w:p>
@@ -2694,7 +2695,7 @@
     <w:p>
       <w:r>
         <w:pict w14:anchorId="7835DFEE">
-          <v:rect id="_x0000_i1238" style="width:0;height:1.5pt" o:hralign="center" o:hrstd="t" o:hr="t" fillcolor="#a0a0a0" stroked="f"/>
+          <v:rect id="_x0000_i1052" style="width:0;height:1.5pt" o:hralign="center" o:hrstd="t" o:hr="t" fillcolor="#a0a0a0" stroked="f"/>
         </w:pict>
       </w:r>
     </w:p>
@@ -2780,7 +2781,7 @@
     <w:p>
       <w:r>
         <w:pict w14:anchorId="45DCA87E">
-          <v:rect id="_x0000_i1239" style="width:0;height:1.5pt" o:hralign="center" o:hrstd="t" o:hr="t" fillcolor="#a0a0a0" stroked="f"/>
+          <v:rect id="_x0000_i1053" style="width:0;height:1.5pt" o:hralign="center" o:hrstd="t" o:hr="t" fillcolor="#a0a0a0" stroked="f"/>
         </w:pict>
       </w:r>
     </w:p>
@@ -2911,7 +2912,7 @@
     <w:p>
       <w:r>
         <w:pict w14:anchorId="3D38CD81">
-          <v:rect id="_x0000_i1240" style="width:0;height:1.5pt" o:hralign="center" o:hrstd="t" o:hr="t" fillcolor="#a0a0a0" stroked="f"/>
+          <v:rect id="_x0000_i1054" style="width:0;height:1.5pt" o:hralign="center" o:hrstd="t" o:hr="t" fillcolor="#a0a0a0" stroked="f"/>
         </w:pict>
       </w:r>
     </w:p>
@@ -3009,7 +3010,7 @@
     <w:p>
       <w:r>
         <w:pict w14:anchorId="47309EA3">
-          <v:rect id="_x0000_i1241" style="width:0;height:1.5pt" o:hralign="center" o:hrstd="t" o:hr="t" fillcolor="#a0a0a0" stroked="f"/>
+          <v:rect id="_x0000_i1055" style="width:0;height:1.5pt" o:hralign="center" o:hrstd="t" o:hr="t" fillcolor="#a0a0a0" stroked="f"/>
         </w:pict>
       </w:r>
     </w:p>
@@ -3098,29 +3099,30 @@
       </w:r>
     </w:p>
     <w:p>
+      <w:pPr>
+        <w:rPr>
+          <w:lang w:val="de-DE"/>
+        </w:rPr>
+      </w:pPr>
       <w:r>
         <w:t xml:space="preserve">            </w:t>
       </w:r>
-      <w:proofErr w:type="spellStart"/>
-      <w:r>
-        <w:t>urls</w:t>
-      </w:r>
-      <w:proofErr w:type="spellEnd"/>
-      <w:r>
-        <w:t>: "</w:t>
-      </w:r>
-      <w:proofErr w:type="gramStart"/>
-      <w:r>
-        <w:t>stun:stun.l.google.com:19302</w:t>
-      </w:r>
-      <w:proofErr w:type="gramEnd"/>
-      <w:r>
-        <w:t>"</w:t>
-      </w:r>
-    </w:p>
-    <w:p>
-      <w:r>
-        <w:t xml:space="preserve">        }</w:t>
+      <w:r>
+        <w:rPr>
+          <w:lang w:val="de-DE"/>
+        </w:rPr>
+        <w:t>urls: "stun:stun.l.google.com:19302"</w:t>
+      </w:r>
+    </w:p>
+    <w:p>
+      <w:r>
+        <w:rPr>
+          <w:lang w:val="de-DE"/>
+        </w:rPr>
+        <w:t xml:space="preserve">        </w:t>
+      </w:r>
+      <w:r>
+        <w:t>}</w:t>
       </w:r>
     </w:p>
     <w:p>
@@ -3176,13 +3178,16 @@
         <w:t>to establish connection.</w:t>
       </w:r>
     </w:p>
+    <w:p/>
+    <w:p/>
+    <w:p/>
     <w:p>
       <w:r>
         <w:rPr>
           <w:noProof/>
         </w:rPr>
         <w:drawing>
-          <wp:inline distT="0" distB="0" distL="0" distR="0" wp14:anchorId="3BC59E14" wp14:editId="38FE3B9B">
+          <wp:inline distT="0" distB="0" distL="0" distR="0" wp14:anchorId="68C298D4" wp14:editId="49AE11E5">
             <wp:extent cx="5731510" cy="728980"/>
             <wp:effectExtent l="0" t="0" r="2540" b="0"/>
             <wp:docPr id="1817499427" name="Picture 1"/>
@@ -3224,6 +3229,1966 @@
         </w:drawing>
       </w:r>
     </w:p>
+    <w:p/>
+    <w:p/>
+    <w:p/>
+    <w:p/>
+    <w:p/>
+    <w:p/>
+    <w:p/>
+    <w:p/>
+    <w:p/>
+    <w:p/>
+    <w:p/>
+    <w:p>
+      <w:pPr>
+        <w:rPr>
+          <w:noProof/>
+        </w:rPr>
+      </w:pPr>
+      <w:r>
+        <w:rPr>
+          <w:b/>
+          <w:bCs/>
+          <w:noProof/>
+        </w:rPr>
+        <w:lastRenderedPageBreak/>
+        <w:t>Date:</w:t>
+      </w:r>
+      <w:r>
+        <w:rPr>
+          <w:noProof/>
+        </w:rPr>
+        <w:t xml:space="preserve"> July 19, 2026</w:t>
+      </w:r>
+      <w:r>
+        <w:rPr>
+          <w:noProof/>
+        </w:rPr>
+        <w:br/>
+      </w:r>
+      <w:r>
+        <w:rPr>
+          <w:b/>
+          <w:bCs/>
+          <w:noProof/>
+        </w:rPr>
+        <w:t>Module:</w:t>
+      </w:r>
+      <w:r>
+        <w:rPr>
+          <w:noProof/>
+        </w:rPr>
+        <w:t xml:space="preserve"> Video Meeting / Lobby &amp; Media Access</w:t>
+      </w:r>
+      <w:r>
+        <w:rPr>
+          <w:noProof/>
+        </w:rPr>
+        <w:br/>
+      </w:r>
+      <w:r>
+        <w:rPr>
+          <w:b/>
+          <w:bCs/>
+          <w:noProof/>
+        </w:rPr>
+        <w:t>Technology:</w:t>
+      </w:r>
+      <w:r>
+        <w:rPr>
+          <w:noProof/>
+        </w:rPr>
+        <w:t xml:space="preserve"> React.js, JavaScript, Browser Media APIs, WebRTC foundation</w:t>
+      </w:r>
+    </w:p>
+    <w:p>
+      <w:pPr>
+        <w:rPr>
+          <w:b/>
+          <w:bCs/>
+          <w:noProof/>
+        </w:rPr>
+      </w:pPr>
+      <w:r>
+        <w:rPr>
+          <w:b/>
+          <w:bCs/>
+          <w:noProof/>
+        </w:rPr>
+        <w:t>Work Completed Today</w:t>
+      </w:r>
+    </w:p>
+    <w:p>
+      <w:pPr>
+        <w:rPr>
+          <w:noProof/>
+        </w:rPr>
+      </w:pPr>
+      <w:r>
+        <w:rPr>
+          <w:noProof/>
+        </w:rPr>
+        <w:t xml:space="preserve">Today, I worked on implementing and understanding the </w:t>
+      </w:r>
+      <w:r>
+        <w:rPr>
+          <w:b/>
+          <w:bCs/>
+          <w:noProof/>
+        </w:rPr>
+        <w:t>media access and lobby functionality</w:t>
+      </w:r>
+      <w:r>
+        <w:rPr>
+          <w:noProof/>
+        </w:rPr>
+        <w:t xml:space="preserve"> for the video conferencing application.</w:t>
+      </w:r>
+    </w:p>
+    <w:p>
+      <w:pPr>
+        <w:rPr>
+          <w:b/>
+          <w:bCs/>
+          <w:noProof/>
+        </w:rPr>
+      </w:pPr>
+      <w:r>
+        <w:rPr>
+          <w:b/>
+          <w:bCs/>
+          <w:noProof/>
+        </w:rPr>
+        <w:t>1. Learned the JavaScript Navigator API</w:t>
+      </w:r>
+    </w:p>
+    <w:p>
+      <w:pPr>
+        <w:rPr>
+          <w:noProof/>
+        </w:rPr>
+      </w:pPr>
+      <w:r>
+        <w:rPr>
+          <w:noProof/>
+        </w:rPr>
+        <w:t>Understood that the navigator object is a browser-provided object that gives access to various browser and device capabilities.</w:t>
+      </w:r>
+    </w:p>
+    <w:p>
+      <w:pPr>
+        <w:rPr>
+          <w:noProof/>
+        </w:rPr>
+      </w:pPr>
+      <w:r>
+        <w:rPr>
+          <w:noProof/>
+        </w:rPr>
+        <w:t>Explored properties such as:</w:t>
+      </w:r>
+    </w:p>
+    <w:p>
+      <w:pPr>
+        <w:rPr>
+          <w:noProof/>
+        </w:rPr>
+      </w:pPr>
+      <w:r>
+        <w:rPr>
+          <w:noProof/>
+        </w:rPr>
+        <w:t>navigator.mediaDevices</w:t>
+      </w:r>
+    </w:p>
+    <w:p>
+      <w:pPr>
+        <w:rPr>
+          <w:noProof/>
+        </w:rPr>
+      </w:pPr>
+      <w:r>
+        <w:rPr>
+          <w:noProof/>
+        </w:rPr>
+        <w:t>navigator.geolocation</w:t>
+      </w:r>
+    </w:p>
+    <w:p>
+      <w:pPr>
+        <w:rPr>
+          <w:noProof/>
+        </w:rPr>
+      </w:pPr>
+      <w:r>
+        <w:rPr>
+          <w:noProof/>
+        </w:rPr>
+        <w:t>navigator.clipboard</w:t>
+      </w:r>
+    </w:p>
+    <w:p>
+      <w:pPr>
+        <w:rPr>
+          <w:noProof/>
+        </w:rPr>
+      </w:pPr>
+      <w:r>
+        <w:rPr>
+          <w:noProof/>
+        </w:rPr>
+        <w:t>navigator.onLine</w:t>
+      </w:r>
+    </w:p>
+    <w:p>
+      <w:pPr>
+        <w:rPr>
+          <w:noProof/>
+        </w:rPr>
+      </w:pPr>
+      <w:r>
+        <w:rPr>
+          <w:noProof/>
+        </w:rPr>
+        <w:t>Focused mainly on:</w:t>
+      </w:r>
+    </w:p>
+    <w:p>
+      <w:pPr>
+        <w:rPr>
+          <w:noProof/>
+        </w:rPr>
+      </w:pPr>
+      <w:r>
+        <w:rPr>
+          <w:noProof/>
+        </w:rPr>
+        <w:t>navigator.mediaDevices</w:t>
+      </w:r>
+    </w:p>
+    <w:p>
+      <w:pPr>
+        <w:rPr>
+          <w:noProof/>
+        </w:rPr>
+      </w:pPr>
+      <w:r>
+        <w:rPr>
+          <w:noProof/>
+        </w:rPr>
+        <w:t xml:space="preserve">which provides access to APIs related to the user's </w:t>
+      </w:r>
+      <w:r>
+        <w:rPr>
+          <w:b/>
+          <w:bCs/>
+          <w:noProof/>
+        </w:rPr>
+        <w:t>camera, microphone, and screen sharing</w:t>
+      </w:r>
+      <w:r>
+        <w:rPr>
+          <w:noProof/>
+        </w:rPr>
+        <w:t>.</w:t>
+      </w:r>
+    </w:p>
+    <w:p>
+      <w:pPr>
+        <w:rPr>
+          <w:b/>
+          <w:bCs/>
+          <w:noProof/>
+        </w:rPr>
+      </w:pPr>
+      <w:r>
+        <w:rPr>
+          <w:b/>
+          <w:bCs/>
+          <w:noProof/>
+        </w:rPr>
+        <w:t>2. Implemented Camera and Microphone Permission Handling</w:t>
+      </w:r>
+    </w:p>
+    <w:p>
+      <w:pPr>
+        <w:rPr>
+          <w:noProof/>
+        </w:rPr>
+      </w:pPr>
+      <w:r>
+        <w:rPr>
+          <w:noProof/>
+        </w:rPr>
+        <w:t>Used the browser's built-in getUserMedia() API to request access to the user's camera and microphone.</w:t>
+      </w:r>
+    </w:p>
+    <w:p>
+      <w:pPr>
+        <w:rPr>
+          <w:noProof/>
+        </w:rPr>
+      </w:pPr>
+      <w:r>
+        <w:rPr>
+          <w:noProof/>
+        </w:rPr>
+        <w:t>navigator.mediaDevices.getUserMedia({</w:t>
+      </w:r>
+    </w:p>
+    <w:p>
+      <w:pPr>
+        <w:rPr>
+          <w:noProof/>
+        </w:rPr>
+      </w:pPr>
+      <w:r>
+        <w:rPr>
+          <w:noProof/>
+        </w:rPr>
+        <w:t xml:space="preserve">    video: true,</w:t>
+      </w:r>
+    </w:p>
+    <w:p>
+      <w:pPr>
+        <w:rPr>
+          <w:noProof/>
+        </w:rPr>
+      </w:pPr>
+      <w:r>
+        <w:rPr>
+          <w:noProof/>
+        </w:rPr>
+        <w:t xml:space="preserve">    audio: true</w:t>
+      </w:r>
+    </w:p>
+    <w:p>
+      <w:pPr>
+        <w:rPr>
+          <w:noProof/>
+        </w:rPr>
+      </w:pPr>
+      <w:r>
+        <w:rPr>
+          <w:noProof/>
+        </w:rPr>
+        <w:t>});</w:t>
+      </w:r>
+    </w:p>
+    <w:p>
+      <w:pPr>
+        <w:rPr>
+          <w:noProof/>
+        </w:rPr>
+      </w:pPr>
+      <w:r>
+        <w:rPr>
+          <w:noProof/>
+        </w:rPr>
+        <w:t xml:space="preserve">Understood that getUserMedia() returns a </w:t>
+      </w:r>
+      <w:r>
+        <w:rPr>
+          <w:b/>
+          <w:bCs/>
+          <w:noProof/>
+        </w:rPr>
+        <w:t>Promise</w:t>
+      </w:r>
+      <w:r>
+        <w:rPr>
+          <w:noProof/>
+        </w:rPr>
+        <w:t>, which resolves with a MediaStream when permission is granted.</w:t>
+      </w:r>
+    </w:p>
+    <w:p>
+      <w:pPr>
+        <w:rPr>
+          <w:noProof/>
+        </w:rPr>
+      </w:pPr>
+      <w:r>
+        <w:rPr>
+          <w:noProof/>
+        </w:rPr>
+        <w:t>Implemented separate checks for:</w:t>
+      </w:r>
+    </w:p>
+    <w:p>
+      <w:pPr>
+        <w:rPr>
+          <w:noProof/>
+        </w:rPr>
+      </w:pPr>
+      <w:r>
+        <w:rPr>
+          <w:noProof/>
+        </w:rPr>
+        <w:t>videoAvailable</w:t>
+      </w:r>
+    </w:p>
+    <w:p>
+      <w:pPr>
+        <w:rPr>
+          <w:noProof/>
+        </w:rPr>
+      </w:pPr>
+      <w:r>
+        <w:rPr>
+          <w:noProof/>
+        </w:rPr>
+        <w:t>audioAvailable</w:t>
+      </w:r>
+    </w:p>
+    <w:p>
+      <w:pPr>
+        <w:rPr>
+          <w:noProof/>
+        </w:rPr>
+      </w:pPr>
+      <w:r>
+        <w:rPr>
+          <w:noProof/>
+        </w:rPr>
+        <w:t>These states are used to track the availability of camera and microphone access.</w:t>
+      </w:r>
+    </w:p>
+    <w:p>
+      <w:pPr>
+        <w:rPr>
+          <w:b/>
+          <w:bCs/>
+          <w:noProof/>
+        </w:rPr>
+      </w:pPr>
+      <w:r>
+        <w:rPr>
+          <w:b/>
+          <w:bCs/>
+          <w:noProof/>
+        </w:rPr>
+        <w:t>3. Learned About MediaStream</w:t>
+      </w:r>
+    </w:p>
+    <w:p>
+      <w:pPr>
+        <w:rPr>
+          <w:noProof/>
+        </w:rPr>
+      </w:pPr>
+      <w:r>
+        <w:rPr>
+          <w:noProof/>
+        </w:rPr>
+        <w:t>Understood that a MediaStream represents live media captured from devices.</w:t>
+      </w:r>
+    </w:p>
+    <w:p>
+      <w:pPr>
+        <w:rPr>
+          <w:noProof/>
+        </w:rPr>
+      </w:pPr>
+      <w:r>
+        <w:rPr>
+          <w:noProof/>
+        </w:rPr>
+        <w:t>Conceptually:</w:t>
+      </w:r>
+    </w:p>
+    <w:p>
+      <w:pPr>
+        <w:rPr>
+          <w:noProof/>
+        </w:rPr>
+      </w:pPr>
+      <w:r>
+        <w:rPr>
+          <w:noProof/>
+        </w:rPr>
+        <w:lastRenderedPageBreak/>
+        <w:t>MediaStream</w:t>
+      </w:r>
+    </w:p>
+    <w:p>
+      <w:pPr>
+        <w:rPr>
+          <w:noProof/>
+        </w:rPr>
+      </w:pPr>
+      <w:r>
+        <w:rPr>
+          <w:noProof/>
+        </w:rPr>
+        <w:t xml:space="preserve">   </w:t>
+      </w:r>
+      <w:r>
+        <w:rPr>
+          <w:rFonts w:ascii="MS Gothic" w:eastAsia="MS Gothic" w:hAnsi="MS Gothic" w:cs="MS Gothic" w:hint="eastAsia"/>
+          <w:noProof/>
+        </w:rPr>
+        <w:t>├</w:t>
+      </w:r>
+      <w:r>
+        <w:rPr>
+          <w:rFonts w:ascii="Calibri" w:hAnsi="Calibri" w:cs="Calibri"/>
+          <w:noProof/>
+        </w:rPr>
+        <w:t>──</w:t>
+      </w:r>
+      <w:r>
+        <w:rPr>
+          <w:noProof/>
+        </w:rPr>
+        <w:t xml:space="preserve"> Video Track </w:t>
+      </w:r>
+      <w:r>
+        <w:rPr>
+          <w:rFonts w:ascii="Calibri" w:hAnsi="Calibri" w:cs="Calibri"/>
+          <w:noProof/>
+        </w:rPr>
+        <w:t>→</w:t>
+      </w:r>
+      <w:r>
+        <w:rPr>
+          <w:noProof/>
+        </w:rPr>
+        <w:t xml:space="preserve"> Camera</w:t>
+      </w:r>
+    </w:p>
+    <w:p>
+      <w:pPr>
+        <w:rPr>
+          <w:noProof/>
+        </w:rPr>
+      </w:pPr>
+      <w:r>
+        <w:rPr>
+          <w:noProof/>
+        </w:rPr>
+        <w:t xml:space="preserve">   └── Audio Track → Microphone</w:t>
+      </w:r>
+    </w:p>
+    <w:p>
+      <w:pPr>
+        <w:rPr>
+          <w:noProof/>
+        </w:rPr>
+      </w:pPr>
+      <w:r>
+        <w:rPr>
+          <w:noProof/>
+        </w:rPr>
+        <w:t>Stored the local media stream using:</w:t>
+      </w:r>
+    </w:p>
+    <w:p>
+      <w:pPr>
+        <w:rPr>
+          <w:noProof/>
+        </w:rPr>
+      </w:pPr>
+      <w:r>
+        <w:rPr>
+          <w:noProof/>
+        </w:rPr>
+        <w:t>window.localStream = userMediaStream;</w:t>
+      </w:r>
+    </w:p>
+    <w:p>
+      <w:pPr>
+        <w:rPr>
+          <w:b/>
+          <w:bCs/>
+          <w:noProof/>
+        </w:rPr>
+      </w:pPr>
+      <w:r>
+        <w:rPr>
+          <w:b/>
+          <w:bCs/>
+          <w:noProof/>
+        </w:rPr>
+        <w:t>4. Displayed Local Camera Preview</w:t>
+      </w:r>
+    </w:p>
+    <w:p>
+      <w:pPr>
+        <w:rPr>
+          <w:noProof/>
+        </w:rPr>
+      </w:pPr>
+      <w:r>
+        <w:rPr>
+          <w:noProof/>
+        </w:rPr>
+        <w:t>Created a React ref using:</w:t>
+      </w:r>
+    </w:p>
+    <w:p>
+      <w:pPr>
+        <w:rPr>
+          <w:noProof/>
+        </w:rPr>
+      </w:pPr>
+      <w:r>
+        <w:rPr>
+          <w:noProof/>
+        </w:rPr>
+        <w:t>const localVideoref = useRef();</w:t>
+      </w:r>
+    </w:p>
+    <w:p>
+      <w:pPr>
+        <w:rPr>
+          <w:noProof/>
+        </w:rPr>
+      </w:pPr>
+      <w:r>
+        <w:rPr>
+          <w:noProof/>
+        </w:rPr>
+        <w:t>Connected the ref to the video element:</w:t>
+      </w:r>
+    </w:p>
+    <w:p>
+      <w:pPr>
+        <w:rPr>
+          <w:noProof/>
+        </w:rPr>
+      </w:pPr>
+      <w:r>
+        <w:rPr>
+          <w:noProof/>
+        </w:rPr>
+        <w:t>&lt;video</w:t>
+      </w:r>
+    </w:p>
+    <w:p>
+      <w:pPr>
+        <w:rPr>
+          <w:noProof/>
+        </w:rPr>
+      </w:pPr>
+      <w:r>
+        <w:rPr>
+          <w:noProof/>
+        </w:rPr>
+        <w:t xml:space="preserve">    ref={localVideoref}</w:t>
+      </w:r>
+    </w:p>
+    <w:p>
+      <w:pPr>
+        <w:rPr>
+          <w:noProof/>
+        </w:rPr>
+      </w:pPr>
+      <w:r>
+        <w:rPr>
+          <w:noProof/>
+        </w:rPr>
+        <w:t xml:space="preserve">    autoPlay</w:t>
+      </w:r>
+    </w:p>
+    <w:p>
+      <w:pPr>
+        <w:rPr>
+          <w:noProof/>
+        </w:rPr>
+      </w:pPr>
+      <w:r>
+        <w:rPr>
+          <w:noProof/>
+        </w:rPr>
+        <w:t xml:space="preserve">    muted</w:t>
+      </w:r>
+    </w:p>
+    <w:p>
+      <w:pPr>
+        <w:rPr>
+          <w:noProof/>
+        </w:rPr>
+      </w:pPr>
+      <w:r>
+        <w:rPr>
+          <w:noProof/>
+        </w:rPr>
+        <w:t>&gt;&lt;/video&gt;</w:t>
+      </w:r>
+    </w:p>
+    <w:p>
+      <w:pPr>
+        <w:rPr>
+          <w:noProof/>
+        </w:rPr>
+      </w:pPr>
+      <w:r>
+        <w:rPr>
+          <w:noProof/>
+        </w:rPr>
+        <w:t>Attached the camera stream to the video element using:</w:t>
+      </w:r>
+    </w:p>
+    <w:p>
+      <w:pPr>
+        <w:rPr>
+          <w:noProof/>
+        </w:rPr>
+      </w:pPr>
+      <w:r>
+        <w:rPr>
+          <w:noProof/>
+        </w:rPr>
+        <w:t>localVideoref.current.srcObject = userMediaStream;</w:t>
+      </w:r>
+    </w:p>
+    <w:p>
+      <w:pPr>
+        <w:rPr>
+          <w:noProof/>
+        </w:rPr>
+      </w:pPr>
+      <w:r>
+        <w:rPr>
+          <w:noProof/>
+        </w:rPr>
+        <w:t>Learned that srcObject is used to assign a live MediaStream as the source of a &lt;video&gt; or &lt;audio&gt; element.</w:t>
+      </w:r>
+    </w:p>
+    <w:p>
+      <w:pPr>
+        <w:rPr>
+          <w:noProof/>
+        </w:rPr>
+      </w:pPr>
+      <w:r>
+        <w:rPr>
+          <w:noProof/>
+        </w:rPr>
+        <w:t>The overall flow is:</w:t>
+      </w:r>
+    </w:p>
+    <w:p>
+      <w:pPr>
+        <w:rPr>
+          <w:noProof/>
+        </w:rPr>
+      </w:pPr>
+      <w:r>
+        <w:rPr>
+          <w:noProof/>
+        </w:rPr>
+        <w:t>Camera</w:t>
+      </w:r>
+    </w:p>
+    <w:p>
+      <w:pPr>
+        <w:rPr>
+          <w:noProof/>
+        </w:rPr>
+      </w:pPr>
+      <w:r>
+        <w:rPr>
+          <w:noProof/>
+        </w:rPr>
+        <w:t xml:space="preserve">   ↓</w:t>
+      </w:r>
+    </w:p>
+    <w:p>
+      <w:pPr>
+        <w:rPr>
+          <w:noProof/>
+        </w:rPr>
+      </w:pPr>
+      <w:r>
+        <w:rPr>
+          <w:noProof/>
+        </w:rPr>
+        <w:t>getUserMedia()</w:t>
+      </w:r>
+    </w:p>
+    <w:p>
+      <w:pPr>
+        <w:rPr>
+          <w:noProof/>
+        </w:rPr>
+      </w:pPr>
+      <w:r>
+        <w:rPr>
+          <w:noProof/>
+        </w:rPr>
+        <w:t xml:space="preserve">   ↓</w:t>
+      </w:r>
+    </w:p>
+    <w:p>
+      <w:pPr>
+        <w:rPr>
+          <w:noProof/>
+        </w:rPr>
+      </w:pPr>
+      <w:r>
+        <w:rPr>
+          <w:noProof/>
+        </w:rPr>
+        <w:t>MediaStream</w:t>
+      </w:r>
+    </w:p>
+    <w:p>
+      <w:pPr>
+        <w:rPr>
+          <w:noProof/>
+        </w:rPr>
+      </w:pPr>
+      <w:r>
+        <w:rPr>
+          <w:noProof/>
+        </w:rPr>
+        <w:t xml:space="preserve">   ↓</w:t>
+      </w:r>
+    </w:p>
+    <w:p>
+      <w:pPr>
+        <w:rPr>
+          <w:noProof/>
+        </w:rPr>
+      </w:pPr>
+      <w:r>
+        <w:rPr>
+          <w:noProof/>
+        </w:rPr>
+        <w:t>srcObject</w:t>
+      </w:r>
+    </w:p>
+    <w:p>
+      <w:pPr>
+        <w:rPr>
+          <w:noProof/>
+        </w:rPr>
+      </w:pPr>
+      <w:r>
+        <w:rPr>
+          <w:noProof/>
+        </w:rPr>
+        <w:t xml:space="preserve">   ↓</w:t>
+      </w:r>
+    </w:p>
+    <w:p>
+      <w:pPr>
+        <w:rPr>
+          <w:noProof/>
+        </w:rPr>
+      </w:pPr>
+      <w:r>
+        <w:rPr>
+          <w:noProof/>
+        </w:rPr>
+        <w:t>&lt;video&gt;</w:t>
+      </w:r>
+    </w:p>
+    <w:p>
+      <w:pPr>
+        <w:rPr>
+          <w:noProof/>
+        </w:rPr>
+      </w:pPr>
+      <w:r>
+        <w:rPr>
+          <w:noProof/>
+        </w:rPr>
+        <w:t xml:space="preserve">   ↓</w:t>
+      </w:r>
+    </w:p>
+    <w:p>
+      <w:pPr>
+        <w:rPr>
+          <w:noProof/>
+        </w:rPr>
+      </w:pPr>
+      <w:r>
+        <w:rPr>
+          <w:noProof/>
+        </w:rPr>
+        <w:t>Local camera preview</w:t>
+      </w:r>
+    </w:p>
+    <w:p>
+      <w:pPr>
+        <w:rPr>
+          <w:b/>
+          <w:bCs/>
+          <w:noProof/>
+        </w:rPr>
+      </w:pPr>
+      <w:r>
+        <w:rPr>
+          <w:b/>
+          <w:bCs/>
+          <w:noProof/>
+        </w:rPr>
+        <w:t>5. Checked Screen-Sharing Availability</w:t>
+      </w:r>
+    </w:p>
+    <w:p>
+      <w:pPr>
+        <w:rPr>
+          <w:noProof/>
+        </w:rPr>
+      </w:pPr>
+      <w:r>
+        <w:rPr>
+          <w:noProof/>
+        </w:rPr>
+        <w:lastRenderedPageBreak/>
+        <w:t>Used:</w:t>
+      </w:r>
+    </w:p>
+    <w:p>
+      <w:pPr>
+        <w:rPr>
+          <w:noProof/>
+        </w:rPr>
+      </w:pPr>
+      <w:r>
+        <w:rPr>
+          <w:noProof/>
+        </w:rPr>
+        <w:t>navigator.mediaDevices.getDisplayMedia</w:t>
+      </w:r>
+    </w:p>
+    <w:p>
+      <w:pPr>
+        <w:rPr>
+          <w:noProof/>
+        </w:rPr>
+      </w:pPr>
+      <w:r>
+        <w:rPr>
+          <w:noProof/>
+        </w:rPr>
+        <w:t>to check whether the browser supports screen sharing.</w:t>
+      </w:r>
+    </w:p>
+    <w:p>
+      <w:pPr>
+        <w:rPr>
+          <w:noProof/>
+        </w:rPr>
+      </w:pPr>
+      <w:r>
+        <w:rPr>
+          <w:noProof/>
+        </w:rPr>
+        <w:t>if (navigator.mediaDevices.getDisplayMedia) {</w:t>
+      </w:r>
+    </w:p>
+    <w:p>
+      <w:pPr>
+        <w:rPr>
+          <w:noProof/>
+        </w:rPr>
+      </w:pPr>
+      <w:r>
+        <w:rPr>
+          <w:noProof/>
+        </w:rPr>
+        <w:t xml:space="preserve">    setScreenAvailable(true);</w:t>
+      </w:r>
+    </w:p>
+    <w:p>
+      <w:pPr>
+        <w:rPr>
+          <w:noProof/>
+        </w:rPr>
+      </w:pPr>
+      <w:r>
+        <w:rPr>
+          <w:noProof/>
+        </w:rPr>
+        <w:t>} else {</w:t>
+      </w:r>
+    </w:p>
+    <w:p>
+      <w:pPr>
+        <w:rPr>
+          <w:noProof/>
+        </w:rPr>
+      </w:pPr>
+      <w:r>
+        <w:rPr>
+          <w:noProof/>
+        </w:rPr>
+        <w:t xml:space="preserve">    setScreenAvailable(false);</w:t>
+      </w:r>
+    </w:p>
+    <w:p>
+      <w:pPr>
+        <w:rPr>
+          <w:noProof/>
+        </w:rPr>
+      </w:pPr>
+      <w:r>
+        <w:rPr>
+          <w:noProof/>
+        </w:rPr>
+        <w:t>}</w:t>
+      </w:r>
+    </w:p>
+    <w:p>
+      <w:pPr>
+        <w:rPr>
+          <w:noProof/>
+        </w:rPr>
+      </w:pPr>
+      <w:r>
+        <w:rPr>
+          <w:noProof/>
+        </w:rPr>
+        <w:t>Also started implementing screen capture using:</w:t>
+      </w:r>
+    </w:p>
+    <w:p>
+      <w:pPr>
+        <w:rPr>
+          <w:noProof/>
+        </w:rPr>
+      </w:pPr>
+      <w:r>
+        <w:rPr>
+          <w:noProof/>
+        </w:rPr>
+        <w:t>navigator.mediaDevices.getDisplayMedia({</w:t>
+      </w:r>
+    </w:p>
+    <w:p>
+      <w:pPr>
+        <w:rPr>
+          <w:noProof/>
+        </w:rPr>
+      </w:pPr>
+      <w:r>
+        <w:rPr>
+          <w:noProof/>
+        </w:rPr>
+        <w:t xml:space="preserve">    video: true,</w:t>
+      </w:r>
+    </w:p>
+    <w:p>
+      <w:pPr>
+        <w:rPr>
+          <w:noProof/>
+        </w:rPr>
+      </w:pPr>
+      <w:r>
+        <w:rPr>
+          <w:noProof/>
+        </w:rPr>
+        <w:t xml:space="preserve">    audio: true</w:t>
+      </w:r>
+    </w:p>
+    <w:p>
+      <w:pPr>
+        <w:rPr>
+          <w:noProof/>
+        </w:rPr>
+      </w:pPr>
+      <w:r>
+        <w:rPr>
+          <w:noProof/>
+        </w:rPr>
+        <w:t>});</w:t>
+      </w:r>
+    </w:p>
+    <w:p>
+      <w:pPr>
+        <w:rPr>
+          <w:b/>
+          <w:bCs/>
+          <w:noProof/>
+        </w:rPr>
+      </w:pPr>
+      <w:r>
+        <w:rPr>
+          <w:b/>
+          <w:bCs/>
+          <w:noProof/>
+        </w:rPr>
+        <w:t>6. Implemented Media State Management</w:t>
+      </w:r>
+    </w:p>
+    <w:p>
+      <w:pPr>
+        <w:rPr>
+          <w:noProof/>
+        </w:rPr>
+      </w:pPr>
+      <w:r>
+        <w:rPr>
+          <w:noProof/>
+        </w:rPr>
+        <w:t>Used React state variables to manage media:</w:t>
+      </w:r>
+    </w:p>
+    <w:p>
+      <w:pPr>
+        <w:rPr>
+          <w:noProof/>
+        </w:rPr>
+      </w:pPr>
+      <w:r>
+        <w:rPr>
+          <w:noProof/>
+        </w:rPr>
+        <w:t>video</w:t>
+      </w:r>
+    </w:p>
+    <w:p>
+      <w:pPr>
+        <w:rPr>
+          <w:noProof/>
+        </w:rPr>
+      </w:pPr>
+      <w:r>
+        <w:rPr>
+          <w:noProof/>
+        </w:rPr>
+        <w:t>audio</w:t>
+      </w:r>
+    </w:p>
+    <w:p>
+      <w:pPr>
+        <w:rPr>
+          <w:noProof/>
+        </w:rPr>
+      </w:pPr>
+      <w:r>
+        <w:rPr>
+          <w:noProof/>
+        </w:rPr>
+        <w:t>screen</w:t>
+      </w:r>
+    </w:p>
+    <w:p>
+      <w:pPr>
+        <w:rPr>
+          <w:noProof/>
+        </w:rPr>
+      </w:pPr>
+      <w:r>
+        <w:rPr>
+          <w:noProof/>
+        </w:rPr>
+        <w:t>videoAvailable</w:t>
+      </w:r>
+    </w:p>
+    <w:p>
+      <w:pPr>
+        <w:rPr>
+          <w:noProof/>
+        </w:rPr>
+      </w:pPr>
+      <w:r>
+        <w:rPr>
+          <w:noProof/>
+        </w:rPr>
+        <w:t>audioAvailable</w:t>
+      </w:r>
+    </w:p>
+    <w:p>
+      <w:pPr>
+        <w:rPr>
+          <w:noProof/>
+        </w:rPr>
+      </w:pPr>
+      <w:r>
+        <w:rPr>
+          <w:noProof/>
+        </w:rPr>
+        <w:t>screenAvailable</w:t>
+      </w:r>
+    </w:p>
+    <w:p>
+      <w:pPr>
+        <w:rPr>
+          <w:noProof/>
+        </w:rPr>
+      </w:pPr>
+      <w:r>
+        <w:rPr>
+          <w:noProof/>
+        </w:rPr>
+        <w:t>Implemented a useEffect to detect changes in the video and audio states:</w:t>
+      </w:r>
+    </w:p>
+    <w:p>
+      <w:pPr>
+        <w:rPr>
+          <w:noProof/>
+        </w:rPr>
+      </w:pPr>
+      <w:r>
+        <w:rPr>
+          <w:noProof/>
+        </w:rPr>
+        <w:t>useEffect(() =&gt; {</w:t>
+      </w:r>
+    </w:p>
+    <w:p>
+      <w:pPr>
+        <w:rPr>
+          <w:noProof/>
+        </w:rPr>
+      </w:pPr>
+      <w:r>
+        <w:rPr>
+          <w:noProof/>
+        </w:rPr>
+        <w:t xml:space="preserve">    if (video !== undefined &amp;&amp; audio !== undefined) {</w:t>
+      </w:r>
+    </w:p>
+    <w:p>
+      <w:pPr>
+        <w:rPr>
+          <w:noProof/>
+        </w:rPr>
+      </w:pPr>
+      <w:r>
+        <w:rPr>
+          <w:noProof/>
+        </w:rPr>
+        <w:t xml:space="preserve">        getUserMedia();</w:t>
+      </w:r>
+    </w:p>
+    <w:p>
+      <w:pPr>
+        <w:rPr>
+          <w:noProof/>
+        </w:rPr>
+      </w:pPr>
+      <w:r>
+        <w:rPr>
+          <w:noProof/>
+        </w:rPr>
+        <w:t xml:space="preserve">    }</w:t>
+      </w:r>
+    </w:p>
+    <w:p>
+      <w:pPr>
+        <w:rPr>
+          <w:noProof/>
+        </w:rPr>
+      </w:pPr>
+      <w:r>
+        <w:rPr>
+          <w:noProof/>
+        </w:rPr>
+        <w:t>}, [video, audio]);</w:t>
+      </w:r>
+    </w:p>
+    <w:p>
+      <w:pPr>
+        <w:rPr>
+          <w:noProof/>
+        </w:rPr>
+      </w:pPr>
+      <w:r>
+        <w:rPr>
+          <w:noProof/>
+        </w:rPr>
+        <w:t>This allows media handling logic to run whenever the camera or microphone state changes.</w:t>
+      </w:r>
+    </w:p>
+    <w:p>
+      <w:pPr>
+        <w:rPr>
+          <w:b/>
+          <w:bCs/>
+          <w:noProof/>
+        </w:rPr>
+      </w:pPr>
+      <w:r>
+        <w:rPr>
+          <w:b/>
+          <w:bCs/>
+          <w:noProof/>
+        </w:rPr>
+        <w:t>7. Learned About getTracks()</w:t>
+      </w:r>
+    </w:p>
+    <w:p>
+      <w:pPr>
+        <w:rPr>
+          <w:noProof/>
+        </w:rPr>
+      </w:pPr>
+      <w:r>
+        <w:rPr>
+          <w:noProof/>
+        </w:rPr>
+        <w:t>Used the built-in MediaStream.getTracks() method:</w:t>
+      </w:r>
+    </w:p>
+    <w:p>
+      <w:pPr>
+        <w:rPr>
+          <w:noProof/>
+        </w:rPr>
+      </w:pPr>
+      <w:r>
+        <w:rPr>
+          <w:noProof/>
+        </w:rPr>
+        <w:t>const tracks =</w:t>
+      </w:r>
+    </w:p>
+    <w:p>
+      <w:pPr>
+        <w:rPr>
+          <w:noProof/>
+        </w:rPr>
+      </w:pPr>
+      <w:r>
+        <w:rPr>
+          <w:noProof/>
+        </w:rPr>
+        <w:lastRenderedPageBreak/>
+        <w:t xml:space="preserve">    localVideoref.current.srcObject.getTracks();</w:t>
+      </w:r>
+    </w:p>
+    <w:p>
+      <w:pPr>
+        <w:rPr>
+          <w:noProof/>
+        </w:rPr>
+      </w:pPr>
+      <w:r>
+        <w:rPr>
+          <w:noProof/>
+        </w:rPr>
+        <w:t>This retrieves all audio and video tracks from the stream.</w:t>
+      </w:r>
+    </w:p>
+    <w:p>
+      <w:pPr>
+        <w:rPr>
+          <w:noProof/>
+        </w:rPr>
+      </w:pPr>
+      <w:r>
+        <w:rPr>
+          <w:noProof/>
+        </w:rPr>
+        <w:t>Used:</w:t>
+      </w:r>
+    </w:p>
+    <w:p>
+      <w:pPr>
+        <w:rPr>
+          <w:noProof/>
+        </w:rPr>
+      </w:pPr>
+      <w:r>
+        <w:rPr>
+          <w:noProof/>
+        </w:rPr>
+        <w:t>tracks.forEach(track =&gt; track.stop());</w:t>
+      </w:r>
+    </w:p>
+    <w:p>
+      <w:pPr>
+        <w:rPr>
+          <w:noProof/>
+        </w:rPr>
+      </w:pPr>
+      <w:r>
+        <w:rPr>
+          <w:noProof/>
+        </w:rPr>
+        <w:t>to stop the camera and microphone tracks when media is no longer required.</w:t>
+      </w:r>
+    </w:p>
+    <w:p>
+      <w:pPr>
+        <w:rPr>
+          <w:b/>
+          <w:bCs/>
+          <w:noProof/>
+        </w:rPr>
+      </w:pPr>
+      <w:r>
+        <w:rPr>
+          <w:b/>
+          <w:bCs/>
+          <w:noProof/>
+        </w:rPr>
+        <w:t>8. Learned Promise Handling with .then() and .catch()</w:t>
+      </w:r>
+    </w:p>
+    <w:p>
+      <w:pPr>
+        <w:rPr>
+          <w:noProof/>
+        </w:rPr>
+      </w:pPr>
+      <w:r>
+        <w:rPr>
+          <w:noProof/>
+        </w:rPr>
+        <w:t>Understood that asynchronous browser APIs such as getUserMedia() return Promises.</w:t>
+      </w:r>
+    </w:p>
+    <w:p>
+      <w:pPr>
+        <w:rPr>
+          <w:noProof/>
+        </w:rPr>
+      </w:pPr>
+      <w:r>
+        <w:rPr>
+          <w:noProof/>
+        </w:rPr>
+        <w:t>Used:</w:t>
+      </w:r>
+    </w:p>
+    <w:p>
+      <w:pPr>
+        <w:rPr>
+          <w:noProof/>
+        </w:rPr>
+      </w:pPr>
+      <w:r>
+        <w:rPr>
+          <w:noProof/>
+        </w:rPr>
+        <w:t>navigator.mediaDevices</w:t>
+      </w:r>
+    </w:p>
+    <w:p>
+      <w:pPr>
+        <w:rPr>
+          <w:noProof/>
+        </w:rPr>
+      </w:pPr>
+      <w:r>
+        <w:rPr>
+          <w:noProof/>
+        </w:rPr>
+        <w:t xml:space="preserve">    .getUserMedia({</w:t>
+      </w:r>
+    </w:p>
+    <w:p>
+      <w:pPr>
+        <w:rPr>
+          <w:noProof/>
+        </w:rPr>
+      </w:pPr>
+      <w:r>
+        <w:rPr>
+          <w:noProof/>
+        </w:rPr>
+        <w:t xml:space="preserve">        video: true,</w:t>
+      </w:r>
+    </w:p>
+    <w:p>
+      <w:pPr>
+        <w:rPr>
+          <w:noProof/>
+        </w:rPr>
+      </w:pPr>
+      <w:r>
+        <w:rPr>
+          <w:noProof/>
+        </w:rPr>
+        <w:t xml:space="preserve">        audio: true</w:t>
+      </w:r>
+    </w:p>
+    <w:p>
+      <w:pPr>
+        <w:rPr>
+          <w:noProof/>
+        </w:rPr>
+      </w:pPr>
+      <w:r>
+        <w:rPr>
+          <w:noProof/>
+        </w:rPr>
+        <w:t xml:space="preserve">    })</w:t>
+      </w:r>
+    </w:p>
+    <w:p>
+      <w:pPr>
+        <w:rPr>
+          <w:noProof/>
+        </w:rPr>
+      </w:pPr>
+      <w:r>
+        <w:rPr>
+          <w:noProof/>
+        </w:rPr>
+        <w:t xml:space="preserve">    .then((stream) =&gt; {</w:t>
+      </w:r>
+    </w:p>
+    <w:p>
+      <w:pPr>
+        <w:rPr>
+          <w:noProof/>
+        </w:rPr>
+      </w:pPr>
+      <w:r>
+        <w:rPr>
+          <w:noProof/>
+        </w:rPr>
+        <w:t xml:space="preserve">        // Handle successful MediaStream</w:t>
+      </w:r>
+    </w:p>
+    <w:p>
+      <w:pPr>
+        <w:rPr>
+          <w:noProof/>
+        </w:rPr>
+      </w:pPr>
+      <w:r>
+        <w:rPr>
+          <w:noProof/>
+        </w:rPr>
+        <w:t xml:space="preserve">    })</w:t>
+      </w:r>
+    </w:p>
+    <w:p>
+      <w:pPr>
+        <w:rPr>
+          <w:noProof/>
+        </w:rPr>
+      </w:pPr>
+      <w:r>
+        <w:rPr>
+          <w:noProof/>
+        </w:rPr>
+        <w:t xml:space="preserve">    .catch((error) =&gt; {</w:t>
+      </w:r>
+    </w:p>
+    <w:p>
+      <w:pPr>
+        <w:rPr>
+          <w:noProof/>
+        </w:rPr>
+      </w:pPr>
+      <w:r>
+        <w:rPr>
+          <w:noProof/>
+        </w:rPr>
+        <w:t xml:space="preserve">        // Handle permission or device errors</w:t>
+      </w:r>
+    </w:p>
+    <w:p>
+      <w:pPr>
+        <w:rPr>
+          <w:noProof/>
+        </w:rPr>
+      </w:pPr>
+      <w:r>
+        <w:rPr>
+          <w:noProof/>
+        </w:rPr>
+        <w:t xml:space="preserve">    });</w:t>
+      </w:r>
+    </w:p>
+    <w:p>
+      <w:pPr>
+        <w:rPr>
+          <w:noProof/>
+        </w:rPr>
+      </w:pPr>
+      <w:r>
+        <w:rPr>
+          <w:noProof/>
+        </w:rPr>
+        <w:t>Learned that:</w:t>
+      </w:r>
+    </w:p>
+    <w:p>
+      <w:pPr>
+        <w:rPr>
+          <w:noProof/>
+        </w:rPr>
+      </w:pPr>
+      <w:r>
+        <w:rPr>
+          <w:noProof/>
+        </w:rPr>
+        <w:t>.then()  → Handles successful Promise result</w:t>
+      </w:r>
+    </w:p>
+    <w:p>
+      <w:pPr>
+        <w:rPr>
+          <w:noProof/>
+        </w:rPr>
+      </w:pPr>
+      <w:r>
+        <w:rPr>
+          <w:noProof/>
+        </w:rPr>
+        <w:t>.catch() → Handles errors/rejected Promise</w:t>
+      </w:r>
+    </w:p>
+    <w:p>
+      <w:pPr>
+        <w:rPr>
+          <w:b/>
+          <w:bCs/>
+          <w:noProof/>
+        </w:rPr>
+      </w:pPr>
+      <w:r>
+        <w:rPr>
+          <w:b/>
+          <w:bCs/>
+          <w:noProof/>
+        </w:rPr>
+        <w:t>9. Created Basic Video Meeting Lobby UI</w:t>
+      </w:r>
+    </w:p>
+    <w:p>
+      <w:pPr>
+        <w:rPr>
+          <w:noProof/>
+        </w:rPr>
+      </w:pPr>
+      <w:r>
+        <w:rPr>
+          <w:noProof/>
+        </w:rPr>
+        <w:t>Created a basic lobby interface containing:</w:t>
+      </w:r>
+    </w:p>
+    <w:p>
+      <w:pPr>
+        <w:rPr>
+          <w:noProof/>
+        </w:rPr>
+      </w:pPr>
+      <w:r>
+        <w:rPr>
+          <w:noProof/>
+        </w:rPr>
+        <w:t>Enter into Lobby</w:t>
+      </w:r>
+    </w:p>
+    <w:p>
+      <w:pPr>
+        <w:rPr>
+          <w:noProof/>
+        </w:rPr>
+      </w:pPr>
+    </w:p>
+    <w:p>
+      <w:pPr>
+        <w:rPr>
+          <w:noProof/>
+        </w:rPr>
+      </w:pPr>
+      <w:r>
+        <w:rPr>
+          <w:noProof/>
+        </w:rPr>
+        <w:t>[ Username Input ]</w:t>
+      </w:r>
+    </w:p>
+    <w:p>
+      <w:pPr>
+        <w:rPr>
+          <w:noProof/>
+        </w:rPr>
+      </w:pPr>
+    </w:p>
+    <w:p>
+      <w:pPr>
+        <w:rPr>
+          <w:noProof/>
+        </w:rPr>
+      </w:pPr>
+      <w:r>
+        <w:rPr>
+          <w:noProof/>
+        </w:rPr>
+        <w:t>[ Connect Button ]</w:t>
+      </w:r>
+    </w:p>
+    <w:p>
+      <w:pPr>
+        <w:rPr>
+          <w:noProof/>
+        </w:rPr>
+      </w:pPr>
+    </w:p>
+    <w:p>
+      <w:pPr>
+        <w:rPr>
+          <w:noProof/>
+        </w:rPr>
+      </w:pPr>
+      <w:r>
+        <w:rPr>
+          <w:noProof/>
+        </w:rPr>
+        <w:t>[ Local Video Preview ]</w:t>
+      </w:r>
+    </w:p>
+    <w:p>
+      <w:pPr>
+        <w:rPr>
+          <w:noProof/>
+        </w:rPr>
+      </w:pPr>
+      <w:r>
+        <w:rPr>
+          <w:noProof/>
+        </w:rPr>
+        <w:lastRenderedPageBreak/>
+        <w:t>Used a controlled input for the username:</w:t>
+      </w:r>
+    </w:p>
+    <w:p>
+      <w:pPr>
+        <w:rPr>
+          <w:noProof/>
+        </w:rPr>
+      </w:pPr>
+      <w:r>
+        <w:rPr>
+          <w:noProof/>
+        </w:rPr>
+        <w:t>&lt;TextField</w:t>
+      </w:r>
+    </w:p>
+    <w:p>
+      <w:pPr>
+        <w:rPr>
+          <w:noProof/>
+        </w:rPr>
+      </w:pPr>
+      <w:r>
+        <w:rPr>
+          <w:noProof/>
+        </w:rPr>
+        <w:t xml:space="preserve">    label="Username"</w:t>
+      </w:r>
+    </w:p>
+    <w:p>
+      <w:pPr>
+        <w:rPr>
+          <w:noProof/>
+        </w:rPr>
+      </w:pPr>
+      <w:r>
+        <w:rPr>
+          <w:noProof/>
+        </w:rPr>
+        <w:t xml:space="preserve">    value={username}</w:t>
+      </w:r>
+    </w:p>
+    <w:p>
+      <w:pPr>
+        <w:rPr>
+          <w:noProof/>
+        </w:rPr>
+      </w:pPr>
+      <w:r>
+        <w:rPr>
+          <w:noProof/>
+        </w:rPr>
+        <w:t xml:space="preserve">    onChange={e =&gt; setUsername(e.target.value)}</w:t>
+      </w:r>
+    </w:p>
+    <w:p>
+      <w:pPr>
+        <w:rPr>
+          <w:noProof/>
+        </w:rPr>
+      </w:pPr>
+      <w:r>
+        <w:rPr>
+          <w:noProof/>
+        </w:rPr>
+        <w:t>/&gt;</w:t>
+      </w:r>
+    </w:p>
+    <w:p>
+      <w:pPr>
+        <w:rPr>
+          <w:noProof/>
+        </w:rPr>
+      </w:pPr>
+      <w:r>
+        <w:rPr>
+          <w:noProof/>
+        </w:rPr>
+        <w:t>Added a Connect button:</w:t>
+      </w:r>
+    </w:p>
+    <w:p>
+      <w:pPr>
+        <w:rPr>
+          <w:noProof/>
+        </w:rPr>
+      </w:pPr>
+      <w:r>
+        <w:rPr>
+          <w:noProof/>
+        </w:rPr>
+        <w:t>&lt;Button onClick={connect}&gt;</w:t>
+      </w:r>
+    </w:p>
+    <w:p>
+      <w:pPr>
+        <w:rPr>
+          <w:noProof/>
+        </w:rPr>
+      </w:pPr>
+      <w:r>
+        <w:rPr>
+          <w:noProof/>
+        </w:rPr>
+        <w:t xml:space="preserve">    Connect</w:t>
+      </w:r>
+    </w:p>
+    <w:p>
+      <w:pPr>
+        <w:rPr>
+          <w:noProof/>
+        </w:rPr>
+      </w:pPr>
+      <w:r>
+        <w:rPr>
+          <w:noProof/>
+        </w:rPr>
+        <w:t>&lt;/Button&gt;</w:t>
+      </w:r>
+    </w:p>
+    <w:p>
+      <w:pPr>
+        <w:rPr>
+          <w:noProof/>
+        </w:rPr>
+      </w:pPr>
+      <w:r>
+        <w:rPr>
+          <w:noProof/>
+        </w:rPr>
+        <w:t>Learned that connect is a developer-defined function and is triggered when the user clicks the button.</w:t>
+      </w:r>
+    </w:p>
+    <w:p>
+      <w:pPr>
+        <w:rPr>
+          <w:b/>
+          <w:bCs/>
+          <w:noProof/>
+        </w:rPr>
+      </w:pPr>
+      <w:r>
+        <w:rPr>
+          <w:b/>
+          <w:bCs/>
+          <w:noProof/>
+        </w:rPr>
+        <w:t>10. Current Issues / Next Steps</w:t>
+      </w:r>
+    </w:p>
+    <w:p>
+      <w:pPr>
+        <w:rPr>
+          <w:noProof/>
+        </w:rPr>
+      </w:pPr>
+      <w:r>
+        <w:rPr>
+          <w:noProof/>
+        </w:rPr>
+        <w:t>The component currently references some functions that still need to be implemented:</w:t>
+      </w:r>
+    </w:p>
+    <w:p>
+      <w:pPr>
+        <w:rPr>
+          <w:noProof/>
+        </w:rPr>
+      </w:pPr>
+      <w:r>
+        <w:rPr>
+          <w:noProof/>
+        </w:rPr>
+        <w:t>getDislayMediaSuccess</w:t>
+      </w:r>
+    </w:p>
+    <w:p>
+      <w:pPr>
+        <w:rPr>
+          <w:noProof/>
+        </w:rPr>
+      </w:pPr>
+      <w:r>
+        <w:rPr>
+          <w:noProof/>
+        </w:rPr>
+        <w:t>connectToSocketServer</w:t>
+      </w:r>
+    </w:p>
+    <w:p>
+      <w:pPr>
+        <w:rPr>
+          <w:noProof/>
+        </w:rPr>
+      </w:pPr>
+      <w:r>
+        <w:rPr>
+          <w:noProof/>
+        </w:rPr>
+        <w:t>getUserMediaSuccess</w:t>
+      </w:r>
+    </w:p>
+    <w:p>
+      <w:pPr>
+        <w:rPr>
+          <w:noProof/>
+        </w:rPr>
+      </w:pPr>
+      <w:r>
+        <w:rPr>
+          <w:noProof/>
+        </w:rPr>
+        <w:t>connect</w:t>
+      </w:r>
+    </w:p>
+    <w:p>
+      <w:pPr>
+        <w:rPr>
+          <w:noProof/>
+        </w:rPr>
+      </w:pPr>
+      <w:r>
+        <w:rPr>
+          <w:noProof/>
+        </w:rPr>
+        <w:t>Material UI components also need to be imported:</w:t>
+      </w:r>
+    </w:p>
+    <w:p>
+      <w:pPr>
+        <w:rPr>
+          <w:noProof/>
+        </w:rPr>
+      </w:pPr>
+      <w:r>
+        <w:rPr>
+          <w:noProof/>
+        </w:rPr>
+        <w:t>import { TextField, Button } from "@mui/material";</w:t>
+      </w:r>
+    </w:p>
+    <w:p/>
     <w:sectPr>
       <w:pgSz w:w="11906" w:h="16838"/>
       <w:pgMar w:top="1440" w:right="1440" w:bottom="1440" w:left="1440" w:header="708" w:footer="708" w:gutter="0"/>

</xml_diff>

<commit_message>
Add WebRTC video streaming, ICE candidate handling, and Socket.IO signaling
</commit_message>
<xml_diff>
--- a/connetify document.docx
+++ b/connetify document.docx
@@ -2039,26 +2039,28 @@
       </w:r>
     </w:p>
     <w:p>
-      <w:pPr>
-        <w:rPr>
-          <w:lang w:val="de-DE"/>
-        </w:rPr>
-      </w:pPr>
       <w:r>
         <w:t xml:space="preserve">            </w:t>
       </w:r>
-      <w:r>
-        <w:rPr>
-          <w:lang w:val="de-DE"/>
-        </w:rPr>
-        <w:t>urls: "stun:stun.l.google.com:19302"</w:t>
-      </w:r>
-    </w:p>
-    <w:p>
-      <w:r>
-        <w:rPr>
-          <w:lang w:val="de-DE"/>
-        </w:rPr>
+      <w:proofErr w:type="spellStart"/>
+      <w:r>
+        <w:t>urls</w:t>
+      </w:r>
+      <w:proofErr w:type="spellEnd"/>
+      <w:r>
+        <w:t>: "</w:t>
+      </w:r>
+      <w:proofErr w:type="gramStart"/>
+      <w:r>
+        <w:t>stun:stun.l.google.com:19302</w:t>
+      </w:r>
+      <w:proofErr w:type="gramEnd"/>
+      <w:r>
+        <w:t>"</w:t>
+      </w:r>
+    </w:p>
+    <w:p>
+      <w:r>
         <w:t xml:space="preserve">        </w:t>
       </w:r>
       <w:r>
@@ -2544,17 +2546,12 @@
         <w:t xml:space="preserve"> = </w:t>
       </w:r>
       <w:proofErr w:type="spellStart"/>
-      <w:proofErr w:type="gramStart"/>
       <w:r>
         <w:t>useRef</w:t>
       </w:r>
       <w:proofErr w:type="spellEnd"/>
       <w:r>
-        <w:t>(</w:t>
-      </w:r>
-      <w:proofErr w:type="gramEnd"/>
-      <w:r>
-        <w:t>);</w:t>
+        <w:t>();</w:t>
       </w:r>
     </w:p>
     <w:p>
@@ -2649,17 +2646,12 @@
         <w:t xml:space="preserve"> = </w:t>
       </w:r>
       <w:proofErr w:type="spellStart"/>
-      <w:proofErr w:type="gramStart"/>
       <w:r>
         <w:t>useRef</w:t>
       </w:r>
       <w:proofErr w:type="spellEnd"/>
       <w:r>
-        <w:t>(</w:t>
-      </w:r>
-      <w:proofErr w:type="gramEnd"/>
-      <w:r>
-        <w:t>);</w:t>
+        <w:t>();</w:t>
       </w:r>
     </w:p>
     <w:p>
@@ -2730,17 +2722,12 @@
         <w:t xml:space="preserve"> = </w:t>
       </w:r>
       <w:proofErr w:type="spellStart"/>
-      <w:proofErr w:type="gramStart"/>
       <w:r>
         <w:t>useRef</w:t>
       </w:r>
       <w:proofErr w:type="spellEnd"/>
       <w:r>
-        <w:t>(</w:t>
-      </w:r>
-      <w:proofErr w:type="gramEnd"/>
-      <w:r>
-        <w:t>);</w:t>
+        <w:t>();</w:t>
       </w:r>
     </w:p>
     <w:p>
@@ -2768,12 +2755,10 @@
     </w:p>
     <w:p>
       <w:proofErr w:type="spellStart"/>
-      <w:proofErr w:type="gramStart"/>
       <w:r>
         <w:t>localVideoref.current.srcObject</w:t>
       </w:r>
       <w:proofErr w:type="spellEnd"/>
-      <w:proofErr w:type="gramEnd"/>
       <w:r>
         <w:t xml:space="preserve"> = stream;</w:t>
       </w:r>
@@ -2820,17 +2805,12 @@
         <w:t xml:space="preserve"> = </w:t>
       </w:r>
       <w:proofErr w:type="spellStart"/>
-      <w:proofErr w:type="gramStart"/>
       <w:r>
         <w:t>useRef</w:t>
       </w:r>
       <w:proofErr w:type="spellEnd"/>
       <w:r>
-        <w:t>(</w:t>
-      </w:r>
-      <w:proofErr w:type="gramEnd"/>
-      <w:r>
-        <w:t>[]);</w:t>
+        <w:t>([]);</w:t>
       </w:r>
     </w:p>
     <w:p>
@@ -2885,18 +2865,13 @@
       </w:r>
       <w:proofErr w:type="spellEnd"/>
       <w:r>
-        <w:t>[index</w:t>
-      </w:r>
-      <w:proofErr w:type="gramStart"/>
-      <w:r>
-        <w:t>].</w:t>
+        <w:t>[index].</w:t>
       </w:r>
       <w:proofErr w:type="spellStart"/>
       <w:r>
         <w:t>srcObject</w:t>
       </w:r>
       <w:proofErr w:type="spellEnd"/>
-      <w:proofErr w:type="gramEnd"/>
       <w:r>
         <w:t xml:space="preserve"> = </w:t>
       </w:r>
@@ -2956,17 +2931,12 @@
         <w:t xml:space="preserve"> connections = </w:t>
       </w:r>
       <w:proofErr w:type="spellStart"/>
-      <w:proofErr w:type="gramStart"/>
       <w:r>
         <w:t>useRef</w:t>
       </w:r>
       <w:proofErr w:type="spellEnd"/>
       <w:r>
-        <w:t>(</w:t>
-      </w:r>
-      <w:proofErr w:type="gramEnd"/>
-      <w:r>
-        <w:t>{});</w:t>
+        <w:t>({});</w:t>
       </w:r>
     </w:p>
     <w:p>
@@ -2976,12 +2946,10 @@
     </w:p>
     <w:p>
       <w:proofErr w:type="spellStart"/>
-      <w:proofErr w:type="gramStart"/>
       <w:r>
         <w:t>connections.current</w:t>
       </w:r>
       <w:proofErr w:type="spellEnd"/>
-      <w:proofErr w:type="gramEnd"/>
       <w:r>
         <w:t>[</w:t>
       </w:r>
@@ -3099,26 +3067,20 @@
       </w:r>
     </w:p>
     <w:p>
-      <w:pPr>
-        <w:rPr>
-          <w:lang w:val="de-DE"/>
-        </w:rPr>
-      </w:pPr>
       <w:r>
         <w:t xml:space="preserve">            </w:t>
       </w:r>
-      <w:r>
-        <w:rPr>
-          <w:lang w:val="de-DE"/>
-        </w:rPr>
-        <w:t>urls: "stun:stun.l.google.com:19302"</w:t>
-      </w:r>
-    </w:p>
-    <w:p>
-      <w:r>
-        <w:rPr>
-          <w:lang w:val="de-DE"/>
-        </w:rPr>
+      <w:proofErr w:type="spellStart"/>
+      <w:r>
+        <w:t>urls</w:t>
+      </w:r>
+      <w:proofErr w:type="spellEnd"/>
+      <w:r>
+        <w:t>: "stun:stun.l.google.com:19302"</w:t>
+      </w:r>
+    </w:p>
+    <w:p>
+      <w:r>
         <w:t xml:space="preserve">        </w:t>
       </w:r>
       <w:r>
@@ -5189,6 +5151,1846 @@
       </w:r>
     </w:p>
     <w:p/>
+    <w:p/>
+    <w:p/>
+    <w:p/>
+    <w:p/>
+    <w:p/>
+    <w:p/>
+    <w:p/>
+    <w:p/>
+    <w:p/>
+    <w:p/>
+    <w:p>
+      <w:pPr>
+        <w:rPr>
+          <w:b/>
+          <w:bCs/>
+        </w:rPr>
+      </w:pPr>
+      <w:r>
+        <w:rPr>
+          <w:b/>
+          <w:bCs/>
+        </w:rPr>
+        <w:lastRenderedPageBreak/>
+        <w:t>Detailed Work Report – 26 July 2026</w:t>
+      </w:r>
+    </w:p>
+    <w:p>
+      <w:pPr>
+        <w:rPr>
+          <w:b/>
+          <w:bCs/>
+        </w:rPr>
+      </w:pPr>
+      <w:r>
+        <w:rPr>
+          <w:b/>
+          <w:bCs/>
+        </w:rPr>
+        <w:t xml:space="preserve">Project: </w:t>
+      </w:r>
+      <w:proofErr w:type="spellStart"/>
+      <w:r>
+        <w:rPr>
+          <w:b/>
+          <w:bCs/>
+        </w:rPr>
+        <w:t>Connectify</w:t>
+      </w:r>
+      <w:proofErr w:type="spellEnd"/>
+      <w:r>
+        <w:rPr>
+          <w:b/>
+          <w:bCs/>
+        </w:rPr>
+        <w:t xml:space="preserve"> – Video Meeting Application</w:t>
+      </w:r>
+    </w:p>
+    <w:p>
+      <w:pPr>
+        <w:rPr>
+          <w:b/>
+          <w:bCs/>
+        </w:rPr>
+      </w:pPr>
+      <w:r>
+        <w:rPr>
+          <w:b/>
+          <w:bCs/>
+        </w:rPr>
+        <w:t>1. Socket.IO Connection Setup</w:t>
+      </w:r>
+    </w:p>
+    <w:p>
+      <w:r>
+        <w:t>Worked on establishing the real-time connection between the React frontend and the Socket.IO server.</w:t>
+      </w:r>
+    </w:p>
+    <w:p>
+      <w:proofErr w:type="spellStart"/>
+      <w:r>
+        <w:t>socketRef.current</w:t>
+      </w:r>
+      <w:proofErr w:type="spellEnd"/>
+      <w:r>
+        <w:t xml:space="preserve"> = </w:t>
+      </w:r>
+      <w:proofErr w:type="spellStart"/>
+      <w:r>
+        <w:t>io.connect</w:t>
+      </w:r>
+      <w:proofErr w:type="spellEnd"/>
+      <w:r>
+        <w:t>(</w:t>
+      </w:r>
+      <w:proofErr w:type="spellStart"/>
+      <w:r>
+        <w:t>server_url</w:t>
+      </w:r>
+      <w:proofErr w:type="spellEnd"/>
+      <w:r>
+        <w:t>, { secure: false });</w:t>
+      </w:r>
+    </w:p>
+    <w:p>
+      <w:r>
+        <w:t xml:space="preserve">Understood why </w:t>
+      </w:r>
+      <w:proofErr w:type="spellStart"/>
+      <w:r>
+        <w:t>socketRef</w:t>
+      </w:r>
+      <w:proofErr w:type="spellEnd"/>
+      <w:r>
+        <w:t xml:space="preserve"> is used with React </w:t>
+      </w:r>
+      <w:proofErr w:type="spellStart"/>
+      <w:r>
+        <w:t>useRef</w:t>
+      </w:r>
+      <w:proofErr w:type="spellEnd"/>
+      <w:r>
+        <w:t>(). It stores the socket connection and keeps the same reference even when the React component re-renders.</w:t>
+      </w:r>
+    </w:p>
+    <w:p>
+      <w:r>
+        <w:t>Also revised Socket.IO communication:</w:t>
+      </w:r>
+    </w:p>
+    <w:p>
+      <w:pPr>
+        <w:numPr>
+          <w:ilvl w:val="0"/>
+          <w:numId w:val="6"/>
+        </w:numPr>
+      </w:pPr>
+      <w:proofErr w:type="spellStart"/>
+      <w:r>
+        <w:t>socket.emit</w:t>
+      </w:r>
+      <w:proofErr w:type="spellEnd"/>
+      <w:r>
+        <w:t xml:space="preserve">() → sends an event/data. </w:t>
+      </w:r>
+    </w:p>
+    <w:p>
+      <w:pPr>
+        <w:numPr>
+          <w:ilvl w:val="0"/>
+          <w:numId w:val="6"/>
+        </w:numPr>
+      </w:pPr>
+      <w:proofErr w:type="spellStart"/>
+      <w:r>
+        <w:t>socket.on</w:t>
+      </w:r>
+      <w:proofErr w:type="spellEnd"/>
+      <w:r>
+        <w:t xml:space="preserve">() → listens for an event/data. </w:t>
+      </w:r>
+    </w:p>
+    <w:p>
+      <w:r>
+        <w:pict w14:anchorId="4D61E770">
+          <v:rect id="_x0000_i1140" style="width:0;height:1.5pt" o:hralign="center" o:hrstd="t" o:hr="t" fillcolor="#a0a0a0" stroked="f"/>
+        </w:pict>
+      </w:r>
+    </w:p>
+    <w:p>
+      <w:pPr>
+        <w:rPr>
+          <w:b/>
+          <w:bCs/>
+        </w:rPr>
+      </w:pPr>
+      <w:r>
+        <w:rPr>
+          <w:b/>
+          <w:bCs/>
+        </w:rPr>
+        <w:t>2. Joining a Video Call</w:t>
+      </w:r>
+    </w:p>
+    <w:p>
+      <w:r>
+        <w:t>Studied how a user joins a particular meeting room.</w:t>
+      </w:r>
+    </w:p>
+    <w:p>
+      <w:proofErr w:type="spellStart"/>
+      <w:r>
+        <w:t>socketRef.current.emit</w:t>
+      </w:r>
+      <w:proofErr w:type="spellEnd"/>
+      <w:r>
+        <w:t xml:space="preserve">('join-call', </w:t>
+      </w:r>
+      <w:proofErr w:type="spellStart"/>
+      <w:r>
+        <w:t>window.location.href</w:t>
+      </w:r>
+      <w:proofErr w:type="spellEnd"/>
+      <w:r>
+        <w:t>);</w:t>
+      </w:r>
+    </w:p>
+    <w:p>
+      <w:r>
+        <w:t>The current meeting URL is sent to the server through the join-call event so that users accessing the same meeting URL can be grouped together.</w:t>
+      </w:r>
+    </w:p>
+    <w:p>
+      <w:r>
+        <w:t>The user's unique Socket.IO ID is stored using:</w:t>
+      </w:r>
+    </w:p>
+    <w:p>
+      <w:proofErr w:type="spellStart"/>
+      <w:r>
+        <w:t>socketIdRef.current</w:t>
+      </w:r>
+      <w:proofErr w:type="spellEnd"/>
+      <w:r>
+        <w:t xml:space="preserve"> = socketRef.current.id;</w:t>
+      </w:r>
+    </w:p>
+    <w:p>
+      <w:r>
+        <w:t>This ID is later used to identify individual users in the meeting.</w:t>
+      </w:r>
+    </w:p>
+    <w:p>
+      <w:r>
+        <w:pict w14:anchorId="3FF891F3">
+          <v:rect id="_x0000_i1141" style="width:0;height:1.5pt" o:hralign="center" o:hrstd="t" o:hr="t" fillcolor="#a0a0a0" stroked="f"/>
+        </w:pict>
+      </w:r>
+    </w:p>
+    <w:p>
+      <w:pPr>
+        <w:rPr>
+          <w:b/>
+          <w:bCs/>
+        </w:rPr>
+      </w:pPr>
+      <w:r>
+        <w:rPr>
+          <w:b/>
+          <w:bCs/>
+        </w:rPr>
+        <w:t>3. WebRTC and STUN Server</w:t>
+      </w:r>
+    </w:p>
+    <w:p>
+      <w:r>
+        <w:t xml:space="preserve">Understood the role of the </w:t>
+      </w:r>
+      <w:r>
+        <w:rPr>
+          <w:b/>
+          <w:bCs/>
+        </w:rPr>
+        <w:t>STUN server</w:t>
+      </w:r>
+      <w:r>
+        <w:t xml:space="preserve"> in WebRTC.</w:t>
+      </w:r>
+    </w:p>
+    <w:p>
+      <w:r>
+        <w:t>The STUN server helps users discover the network information/public-facing address required to establish a peer-to-peer connection, especially when users are on different networks.</w:t>
+      </w:r>
+    </w:p>
+    <w:p>
+      <w:r>
+        <w:t>Studied the WebRTC configuration:</w:t>
+      </w:r>
+    </w:p>
+    <w:p>
+      <w:proofErr w:type="spellStart"/>
+      <w:r>
+        <w:t>const</w:t>
+      </w:r>
+      <w:proofErr w:type="spellEnd"/>
+      <w:r>
+        <w:t xml:space="preserve"> </w:t>
+      </w:r>
+      <w:proofErr w:type="spellStart"/>
+      <w:r>
+        <w:t>peerConfigConnections</w:t>
+      </w:r>
+      <w:proofErr w:type="spellEnd"/>
+      <w:r>
+        <w:t xml:space="preserve"> = {</w:t>
+      </w:r>
+    </w:p>
+    <w:p>
+      <w:pPr>
+        <w:rPr>
+          <w:lang w:val="de-DE"/>
+        </w:rPr>
+      </w:pPr>
+      <w:r>
+        <w:t xml:space="preserve">    </w:t>
+      </w:r>
+      <w:r>
+        <w:rPr>
+          <w:lang w:val="de-DE"/>
+        </w:rPr>
+        <w:t>iceServers: [</w:t>
+      </w:r>
+    </w:p>
+    <w:p>
+      <w:pPr>
+        <w:rPr>
+          <w:lang w:val="de-DE"/>
+        </w:rPr>
+      </w:pPr>
+      <w:r>
+        <w:rPr>
+          <w:lang w:val="de-DE"/>
+        </w:rPr>
+        <w:t xml:space="preserve">        { urls: "stun:stun.l.google.com:19302" }</w:t>
+      </w:r>
+    </w:p>
+    <w:p>
+      <w:r>
+        <w:rPr>
+          <w:lang w:val="de-DE"/>
+        </w:rPr>
+        <w:t xml:space="preserve">    </w:t>
+      </w:r>
+      <w:r>
+        <w:t>]</w:t>
+      </w:r>
+    </w:p>
+    <w:p>
+      <w:r>
+        <w:t>};</w:t>
+      </w:r>
+    </w:p>
+    <w:p>
+      <w:r>
+        <w:pict w14:anchorId="3E03DE16">
+          <v:rect id="_x0000_i1142" style="width:0;height:1.5pt" o:hralign="center" o:hrstd="t" o:hr="t" fillcolor="#a0a0a0" stroked="f"/>
+        </w:pict>
+      </w:r>
+    </w:p>
+    <w:p>
+      <w:pPr>
+        <w:rPr>
+          <w:b/>
+          <w:bCs/>
+        </w:rPr>
+      </w:pPr>
+      <w:r>
+        <w:rPr>
+          <w:b/>
+          <w:bCs/>
+        </w:rPr>
+        <w:lastRenderedPageBreak/>
+        <w:t>4. Creating Peer-to-Peer Connections</w:t>
+      </w:r>
+    </w:p>
+    <w:p>
+      <w:r>
+        <w:t>Studied how a separate WebRTC connection is created for each participant.</w:t>
+      </w:r>
+    </w:p>
+    <w:p>
+      <w:r>
+        <w:t>connections[</w:t>
+      </w:r>
+      <w:proofErr w:type="spellStart"/>
+      <w:r>
+        <w:t>socketListId</w:t>
+      </w:r>
+      <w:proofErr w:type="spellEnd"/>
+      <w:r>
+        <w:t>] =</w:t>
+      </w:r>
+    </w:p>
+    <w:p>
+      <w:r>
+        <w:t xml:space="preserve">    new </w:t>
+      </w:r>
+      <w:proofErr w:type="spellStart"/>
+      <w:r>
+        <w:t>RTCPeerConnection</w:t>
+      </w:r>
+      <w:proofErr w:type="spellEnd"/>
+      <w:r>
+        <w:t>(</w:t>
+      </w:r>
+      <w:proofErr w:type="spellStart"/>
+      <w:r>
+        <w:t>peerConfigConnections</w:t>
+      </w:r>
+      <w:proofErr w:type="spellEnd"/>
+      <w:r>
+        <w:t>);</w:t>
+      </w:r>
+    </w:p>
+    <w:p>
+      <w:proofErr w:type="spellStart"/>
+      <w:r>
+        <w:t>RTCPeerConnection</w:t>
+      </w:r>
+      <w:proofErr w:type="spellEnd"/>
+      <w:r>
+        <w:t xml:space="preserve"> is the main WebRTC object responsible for managing the peer-to-peer audio/video connection.</w:t>
+      </w:r>
+    </w:p>
+    <w:p>
+      <w:r>
+        <w:t>Each connection is stored using the participant's socket ID:</w:t>
+      </w:r>
+    </w:p>
+    <w:p>
+      <w:r>
+        <w:t>connections</w:t>
+      </w:r>
+    </w:p>
+    <w:p>
+      <w:r>
+        <w:t xml:space="preserve">   </w:t>
+      </w:r>
+      <w:r>
+        <w:rPr>
+          <w:rFonts w:ascii="MS Gothic" w:eastAsia="MS Gothic" w:hAnsi="MS Gothic" w:cs="MS Gothic" w:hint="eastAsia"/>
+        </w:rPr>
+        <w:t>├</w:t>
+      </w:r>
+      <w:r>
+        <w:rPr>
+          <w:rFonts w:ascii="Calibri" w:hAnsi="Calibri" w:cs="Calibri"/>
+        </w:rPr>
+        <w:t>──</w:t>
+      </w:r>
+      <w:r>
+        <w:t xml:space="preserve"> User A </w:t>
+      </w:r>
+      <w:r>
+        <w:rPr>
+          <w:rFonts w:ascii="Calibri" w:hAnsi="Calibri" w:cs="Calibri"/>
+        </w:rPr>
+        <w:t>→</w:t>
+      </w:r>
+      <w:r>
+        <w:t xml:space="preserve"> </w:t>
+      </w:r>
+      <w:proofErr w:type="spellStart"/>
+      <w:r>
+        <w:t>RTCPeerConnection</w:t>
+      </w:r>
+      <w:proofErr w:type="spellEnd"/>
+    </w:p>
+    <w:p>
+      <w:r>
+        <w:t xml:space="preserve">   </w:t>
+      </w:r>
+      <w:r>
+        <w:rPr>
+          <w:rFonts w:ascii="MS Gothic" w:eastAsia="MS Gothic" w:hAnsi="MS Gothic" w:cs="MS Gothic" w:hint="eastAsia"/>
+        </w:rPr>
+        <w:t>├</w:t>
+      </w:r>
+      <w:r>
+        <w:rPr>
+          <w:rFonts w:ascii="Calibri" w:hAnsi="Calibri" w:cs="Calibri"/>
+        </w:rPr>
+        <w:t>──</w:t>
+      </w:r>
+      <w:r>
+        <w:t xml:space="preserve"> User B </w:t>
+      </w:r>
+      <w:r>
+        <w:rPr>
+          <w:rFonts w:ascii="Calibri" w:hAnsi="Calibri" w:cs="Calibri"/>
+        </w:rPr>
+        <w:t>→</w:t>
+      </w:r>
+      <w:r>
+        <w:t xml:space="preserve"> </w:t>
+      </w:r>
+      <w:proofErr w:type="spellStart"/>
+      <w:r>
+        <w:t>RTCPeerConnection</w:t>
+      </w:r>
+      <w:proofErr w:type="spellEnd"/>
+    </w:p>
+    <w:p>
+      <w:r>
+        <w:t xml:space="preserve">   └── User C → </w:t>
+      </w:r>
+      <w:proofErr w:type="spellStart"/>
+      <w:r>
+        <w:t>RTCPeerConnection</w:t>
+      </w:r>
+      <w:proofErr w:type="spellEnd"/>
+    </w:p>
+    <w:p>
+      <w:r>
+        <w:pict w14:anchorId="356BBE6C">
+          <v:rect id="_x0000_i1143" style="width:0;height:1.5pt" o:hralign="center" o:hrstd="t" o:hr="t" fillcolor="#a0a0a0" stroked="f"/>
+        </w:pict>
+      </w:r>
+    </w:p>
+    <w:p>
+      <w:pPr>
+        <w:rPr>
+          <w:b/>
+          <w:bCs/>
+        </w:rPr>
+      </w:pPr>
+      <w:r>
+        <w:rPr>
+          <w:b/>
+          <w:bCs/>
+        </w:rPr>
+        <w:t>5. ICE Candidate Handling</w:t>
+      </w:r>
+    </w:p>
+    <w:p>
+      <w:r>
+        <w:t xml:space="preserve">Studied the built-in </w:t>
+      </w:r>
+      <w:proofErr w:type="spellStart"/>
+      <w:r>
+        <w:t>onicecandidate</w:t>
+      </w:r>
+      <w:proofErr w:type="spellEnd"/>
+      <w:r>
+        <w:t xml:space="preserve"> event.</w:t>
+      </w:r>
+    </w:p>
+    <w:p>
+      <w:r>
+        <w:t>connections[</w:t>
+      </w:r>
+      <w:proofErr w:type="spellStart"/>
+      <w:r>
+        <w:t>socketListId</w:t>
+      </w:r>
+      <w:proofErr w:type="spellEnd"/>
+      <w:r>
+        <w:t>].</w:t>
+      </w:r>
+      <w:proofErr w:type="spellStart"/>
+      <w:r>
+        <w:t>onicecandidate</w:t>
+      </w:r>
+      <w:proofErr w:type="spellEnd"/>
+      <w:r>
+        <w:t xml:space="preserve"> = function (event) {</w:t>
+      </w:r>
+    </w:p>
+    <w:p>
+      <w:r>
+        <w:t xml:space="preserve">    if (</w:t>
+      </w:r>
+      <w:proofErr w:type="spellStart"/>
+      <w:r>
+        <w:t>event.candidate</w:t>
+      </w:r>
+      <w:proofErr w:type="spellEnd"/>
+      <w:r>
+        <w:t xml:space="preserve"> != null) {</w:t>
+      </w:r>
+    </w:p>
+    <w:p>
+      <w:r>
+        <w:t xml:space="preserve">        </w:t>
+      </w:r>
+      <w:proofErr w:type="spellStart"/>
+      <w:r>
+        <w:t>socketRef.current.emit</w:t>
+      </w:r>
+      <w:proofErr w:type="spellEnd"/>
+      <w:r>
+        <w:t>(</w:t>
+      </w:r>
+    </w:p>
+    <w:p>
+      <w:r>
+        <w:t xml:space="preserve">            'signal',</w:t>
+      </w:r>
+    </w:p>
+    <w:p>
+      <w:r>
+        <w:t xml:space="preserve">            </w:t>
+      </w:r>
+      <w:proofErr w:type="spellStart"/>
+      <w:r>
+        <w:t>socketListId</w:t>
+      </w:r>
+      <w:proofErr w:type="spellEnd"/>
+      <w:r>
+        <w:t>,</w:t>
+      </w:r>
+    </w:p>
+    <w:p>
+      <w:r>
+        <w:t xml:space="preserve">            </w:t>
+      </w:r>
+      <w:proofErr w:type="spellStart"/>
+      <w:r>
+        <w:t>JSON.stringify</w:t>
+      </w:r>
+      <w:proofErr w:type="spellEnd"/>
+      <w:r>
+        <w:t xml:space="preserve">({ ice: </w:t>
+      </w:r>
+      <w:proofErr w:type="spellStart"/>
+      <w:r>
+        <w:t>event.candidate</w:t>
+      </w:r>
+      <w:proofErr w:type="spellEnd"/>
+      <w:r>
+        <w:t xml:space="preserve"> })</w:t>
+      </w:r>
+    </w:p>
+    <w:p>
+      <w:r>
+        <w:t xml:space="preserve">        );</w:t>
+      </w:r>
+    </w:p>
+    <w:p>
+      <w:r>
+        <w:t xml:space="preserve">    }</w:t>
+      </w:r>
+    </w:p>
+    <w:p>
+      <w:r>
+        <w:t>};</w:t>
+      </w:r>
+    </w:p>
+    <w:p>
+      <w:r>
+        <w:t xml:space="preserve">When WebRTC discovers a possible network path for connecting to another peer, </w:t>
+      </w:r>
+      <w:proofErr w:type="spellStart"/>
+      <w:r>
+        <w:t>onicecandidate</w:t>
+      </w:r>
+      <w:proofErr w:type="spellEnd"/>
+      <w:r>
+        <w:t xml:space="preserve"> is triggered.</w:t>
+      </w:r>
+    </w:p>
+    <w:p>
+      <w:r>
+        <w:t xml:space="preserve">The discovered ICE candidate is then sent to the other participant using </w:t>
+      </w:r>
+      <w:proofErr w:type="spellStart"/>
+      <w:r>
+        <w:t>Socket.IO's</w:t>
+      </w:r>
+      <w:proofErr w:type="spellEnd"/>
+      <w:r>
+        <w:t xml:space="preserve"> signal event.</w:t>
+      </w:r>
+    </w:p>
+    <w:p>
+      <w:r>
+        <w:t>Understood the basic flow:</w:t>
+      </w:r>
+    </w:p>
+    <w:p>
+      <w:r>
+        <w:t>WebRTC finds ICE candidate</w:t>
+      </w:r>
+    </w:p>
+    <w:p>
+      <w:r>
+        <w:t xml:space="preserve">          ↓</w:t>
+      </w:r>
+    </w:p>
+    <w:p>
+      <w:proofErr w:type="spellStart"/>
+      <w:r>
+        <w:t>onicecandidate</w:t>
+      </w:r>
+      <w:proofErr w:type="spellEnd"/>
+      <w:r>
+        <w:t xml:space="preserve"> executes</w:t>
+      </w:r>
+    </w:p>
+    <w:p>
+      <w:r>
+        <w:t xml:space="preserve">          ↓</w:t>
+      </w:r>
+    </w:p>
+    <w:p>
+      <w:r>
+        <w:t>Socket.IO "signal" event</w:t>
+      </w:r>
+    </w:p>
+    <w:p>
+      <w:r>
+        <w:lastRenderedPageBreak/>
+        <w:t xml:space="preserve">          ↓</w:t>
+      </w:r>
+    </w:p>
+    <w:p>
+      <w:r>
+        <w:t>Server forwards candidate</w:t>
+      </w:r>
+    </w:p>
+    <w:p>
+      <w:r>
+        <w:t xml:space="preserve">          ↓</w:t>
+      </w:r>
+    </w:p>
+    <w:p>
+      <w:r>
+        <w:t>Other participant receives it</w:t>
+      </w:r>
+    </w:p>
+    <w:p>
+      <w:r>
+        <w:pict w14:anchorId="0174F334">
+          <v:rect id="_x0000_i1144" style="width:0;height:1.5pt" o:hralign="center" o:hrstd="t" o:hr="t" fillcolor="#a0a0a0" stroked="f"/>
+        </w:pict>
+      </w:r>
+    </w:p>
+    <w:p>
+      <w:pPr>
+        <w:rPr>
+          <w:b/>
+          <w:bCs/>
+        </w:rPr>
+      </w:pPr>
+      <w:r>
+        <w:rPr>
+          <w:b/>
+          <w:bCs/>
+        </w:rPr>
+        <w:t xml:space="preserve">6. WebRTC </w:t>
+      </w:r>
+      <w:proofErr w:type="spellStart"/>
+      <w:r>
+        <w:rPr>
+          <w:b/>
+          <w:bCs/>
+        </w:rPr>
+        <w:t>Signaling</w:t>
+      </w:r>
+      <w:proofErr w:type="spellEnd"/>
+    </w:p>
+    <w:p>
+      <w:r>
+        <w:t xml:space="preserve">Studied how Socket.IO is used for </w:t>
+      </w:r>
+      <w:r>
+        <w:rPr>
+          <w:b/>
+          <w:bCs/>
+        </w:rPr>
+        <w:t xml:space="preserve">WebRTC </w:t>
+      </w:r>
+      <w:proofErr w:type="spellStart"/>
+      <w:r>
+        <w:rPr>
+          <w:b/>
+          <w:bCs/>
+        </w:rPr>
+        <w:t>signaling</w:t>
+      </w:r>
+      <w:proofErr w:type="spellEnd"/>
+      <w:r>
+        <w:t>.</w:t>
+      </w:r>
+    </w:p>
+    <w:p>
+      <w:proofErr w:type="spellStart"/>
+      <w:r>
+        <w:t>socketRef.current.on</w:t>
+      </w:r>
+      <w:proofErr w:type="spellEnd"/>
+      <w:r>
+        <w:t xml:space="preserve">('signal', </w:t>
+      </w:r>
+      <w:proofErr w:type="spellStart"/>
+      <w:r>
+        <w:t>gotMessageFromServer</w:t>
+      </w:r>
+      <w:proofErr w:type="spellEnd"/>
+      <w:r>
+        <w:t>);</w:t>
+      </w:r>
+    </w:p>
+    <w:p>
+      <w:r>
+        <w:t>The signal event is used to exchange information required before the actual peer-to-peer connection can be established.</w:t>
+      </w:r>
+    </w:p>
+    <w:p>
+      <w:r>
+        <w:t xml:space="preserve">Main </w:t>
+      </w:r>
+      <w:proofErr w:type="spellStart"/>
+      <w:r>
+        <w:t>signaling</w:t>
+      </w:r>
+      <w:proofErr w:type="spellEnd"/>
+      <w:r>
+        <w:t xml:space="preserve"> information includes:</w:t>
+      </w:r>
+    </w:p>
+    <w:p>
+      <w:pPr>
+        <w:numPr>
+          <w:ilvl w:val="0"/>
+          <w:numId w:val="7"/>
+        </w:numPr>
+      </w:pPr>
+      <w:r>
+        <w:rPr>
+          <w:b/>
+          <w:bCs/>
+        </w:rPr>
+        <w:t>SDP</w:t>
+      </w:r>
+      <w:r>
+        <w:t xml:space="preserve"> – describes the media/connection capabilities. </w:t>
+      </w:r>
+    </w:p>
+    <w:p>
+      <w:pPr>
+        <w:numPr>
+          <w:ilvl w:val="0"/>
+          <w:numId w:val="7"/>
+        </w:numPr>
+      </w:pPr>
+      <w:r>
+        <w:rPr>
+          <w:b/>
+          <w:bCs/>
+        </w:rPr>
+        <w:t>ICE candidates</w:t>
+      </w:r>
+      <w:r>
+        <w:t xml:space="preserve"> – provide possible network paths between peers. </w:t>
+      </w:r>
+    </w:p>
+    <w:p>
+      <w:r>
+        <w:t xml:space="preserve">Understood that </w:t>
+      </w:r>
+      <w:r>
+        <w:rPr>
+          <w:b/>
+          <w:bCs/>
+        </w:rPr>
+        <w:t xml:space="preserve">Socket.IO is mainly being used for </w:t>
+      </w:r>
+      <w:proofErr w:type="spellStart"/>
+      <w:r>
+        <w:rPr>
+          <w:b/>
+          <w:bCs/>
+        </w:rPr>
+        <w:t>signaling</w:t>
+      </w:r>
+      <w:proofErr w:type="spellEnd"/>
+      <w:r>
+        <w:t>, while WebRTC handles the actual peer-to-peer audio/video communication.</w:t>
+      </w:r>
+    </w:p>
+    <w:p>
+      <w:r>
+        <w:pict w14:anchorId="7EA2CDAE">
+          <v:rect id="_x0000_i1145" style="width:0;height:1.5pt" o:hralign="center" o:hrstd="t" o:hr="t" fillcolor="#a0a0a0" stroked="f"/>
+        </w:pict>
+      </w:r>
+    </w:p>
+    <w:p>
+      <w:pPr>
+        <w:rPr>
+          <w:b/>
+          <w:bCs/>
+        </w:rPr>
+      </w:pPr>
+      <w:r>
+        <w:rPr>
+          <w:b/>
+          <w:bCs/>
+        </w:rPr>
+        <w:t>7. Handling New Users</w:t>
+      </w:r>
+    </w:p>
+    <w:p>
+      <w:r>
+        <w:t>Studied the user-joined event:</w:t>
+      </w:r>
+    </w:p>
+    <w:p>
+      <w:proofErr w:type="spellStart"/>
+      <w:r>
+        <w:t>socketRef.current.on</w:t>
+      </w:r>
+      <w:proofErr w:type="spellEnd"/>
+      <w:r>
+        <w:t>('user-joined', (id, clients) =&gt; {</w:t>
+      </w:r>
+    </w:p>
+    <w:p>
+      <w:r>
+        <w:t>When someone joins the meeting, the server provides the new user's ID and the list of clients currently present.</w:t>
+      </w:r>
+    </w:p>
+    <w:p>
+      <w:r>
+        <w:t>The application loops through the clients:</w:t>
+      </w:r>
+    </w:p>
+    <w:p>
+      <w:proofErr w:type="spellStart"/>
+      <w:r>
+        <w:t>clients.forEach</w:t>
+      </w:r>
+      <w:proofErr w:type="spellEnd"/>
+      <w:r>
+        <w:t>((</w:t>
+      </w:r>
+      <w:proofErr w:type="spellStart"/>
+      <w:r>
+        <w:t>socketListId</w:t>
+      </w:r>
+      <w:proofErr w:type="spellEnd"/>
+      <w:r>
+        <w:t>) =&gt; {</w:t>
+      </w:r>
+    </w:p>
+    <w:p>
+      <w:r>
+        <w:t>and prepares a WebRTC connection for each participant.</w:t>
+      </w:r>
+    </w:p>
+    <w:p>
+      <w:r>
+        <w:pict w14:anchorId="46B98A77">
+          <v:rect id="_x0000_i1146" style="width:0;height:1.5pt" o:hralign="center" o:hrstd="t" o:hr="t" fillcolor="#a0a0a0" stroked="f"/>
+        </w:pict>
+      </w:r>
+    </w:p>
+    <w:p>
+      <w:pPr>
+        <w:rPr>
+          <w:b/>
+          <w:bCs/>
+        </w:rPr>
+      </w:pPr>
+      <w:r>
+        <w:rPr>
+          <w:b/>
+          <w:bCs/>
+        </w:rPr>
+        <w:t>8. Sending the Local Camera and Microphone Stream</w:t>
+      </w:r>
+    </w:p>
+    <w:p>
+      <w:r>
+        <w:t>Studied how the user's local camera/microphone stream is added to the WebRTC connection.</w:t>
+      </w:r>
+    </w:p>
+    <w:p>
+      <w:r>
+        <w:t>connections[</w:t>
+      </w:r>
+      <w:proofErr w:type="spellStart"/>
+      <w:r>
+        <w:t>socketListId</w:t>
+      </w:r>
+      <w:proofErr w:type="spellEnd"/>
+      <w:r>
+        <w:t>].</w:t>
+      </w:r>
+      <w:proofErr w:type="spellStart"/>
+      <w:r>
+        <w:t>addStream</w:t>
+      </w:r>
+      <w:proofErr w:type="spellEnd"/>
+      <w:r>
+        <w:t>(</w:t>
+      </w:r>
+      <w:proofErr w:type="spellStart"/>
+      <w:r>
+        <w:t>window.localStream</w:t>
+      </w:r>
+      <w:proofErr w:type="spellEnd"/>
+      <w:r>
+        <w:t>);</w:t>
+      </w:r>
+    </w:p>
+    <w:p>
+      <w:r>
+        <w:t>Basic flow:</w:t>
+      </w:r>
+    </w:p>
+    <w:p>
+      <w:r>
+        <w:t>Camera + Microphone</w:t>
+      </w:r>
+    </w:p>
+    <w:p>
+      <w:r>
+        <w:t xml:space="preserve">        ↓</w:t>
+      </w:r>
+    </w:p>
+    <w:p>
+      <w:proofErr w:type="spellStart"/>
+      <w:r>
+        <w:t>window.localStream</w:t>
+      </w:r>
+      <w:proofErr w:type="spellEnd"/>
+    </w:p>
+    <w:p>
+      <w:r>
+        <w:lastRenderedPageBreak/>
+        <w:t xml:space="preserve">        ↓</w:t>
+      </w:r>
+    </w:p>
+    <w:p>
+      <w:proofErr w:type="spellStart"/>
+      <w:r>
+        <w:t>addStream</w:t>
+      </w:r>
+      <w:proofErr w:type="spellEnd"/>
+      <w:r>
+        <w:t>()</w:t>
+      </w:r>
+    </w:p>
+    <w:p>
+      <w:r>
+        <w:t xml:space="preserve">        ↓</w:t>
+      </w:r>
+    </w:p>
+    <w:p>
+      <w:proofErr w:type="spellStart"/>
+      <w:r>
+        <w:t>RTCPeerConnection</w:t>
+      </w:r>
+      <w:proofErr w:type="spellEnd"/>
+    </w:p>
+    <w:p>
+      <w:r>
+        <w:t xml:space="preserve">        ↓</w:t>
+      </w:r>
+    </w:p>
+    <w:p>
+      <w:r>
+        <w:t>Remote participant</w:t>
+      </w:r>
+    </w:p>
+    <w:p>
+      <w:r>
+        <w:t>Also studied the fallback mechanism where a black video and silent audio stream are generated if the normal local stream is unavailable.</w:t>
+      </w:r>
+    </w:p>
+    <w:p>
+      <w:r>
+        <w:pict w14:anchorId="5701DF28">
+          <v:rect id="_x0000_i1147" style="width:0;height:1.5pt" o:hralign="center" o:hrstd="t" o:hr="t" fillcolor="#a0a0a0" stroked="f"/>
+        </w:pict>
+      </w:r>
+    </w:p>
+    <w:p>
+      <w:pPr>
+        <w:rPr>
+          <w:b/>
+          <w:bCs/>
+        </w:rPr>
+      </w:pPr>
+      <w:r>
+        <w:rPr>
+          <w:b/>
+          <w:bCs/>
+        </w:rPr>
+        <w:t>9. Receiving Remote Video Streams</w:t>
+      </w:r>
+    </w:p>
+    <w:p>
+      <w:r>
+        <w:t>Studied how another participant's video/audio stream is received.</w:t>
+      </w:r>
+    </w:p>
+    <w:p>
+      <w:r>
+        <w:t>connections[</w:t>
+      </w:r>
+      <w:proofErr w:type="spellStart"/>
+      <w:r>
+        <w:t>socketListId</w:t>
+      </w:r>
+      <w:proofErr w:type="spellEnd"/>
+      <w:r>
+        <w:t>].</w:t>
+      </w:r>
+      <w:proofErr w:type="spellStart"/>
+      <w:r>
+        <w:t>onaddstream</w:t>
+      </w:r>
+      <w:proofErr w:type="spellEnd"/>
+      <w:r>
+        <w:t xml:space="preserve"> = (event) =&gt; {</w:t>
+      </w:r>
+    </w:p>
+    <w:p>
+      <w:r>
+        <w:t>The received stream is available through:</w:t>
+      </w:r>
+    </w:p>
+    <w:p>
+      <w:proofErr w:type="spellStart"/>
+      <w:r>
+        <w:t>event.stream</w:t>
+      </w:r>
+      <w:proofErr w:type="spellEnd"/>
+    </w:p>
+    <w:p>
+      <w:r>
+        <w:t>The application checks whether a video for that socket ID already exists. If it exists, the stream is updated; otherwise, a new video object is created.</w:t>
+      </w:r>
+    </w:p>
+    <w:p>
+      <w:r>
+        <w:pict w14:anchorId="7DDAD8E5">
+          <v:rect id="_x0000_i1148" style="width:0;height:1.5pt" o:hralign="center" o:hrstd="t" o:hr="t" fillcolor="#a0a0a0" stroked="f"/>
+        </w:pict>
+      </w:r>
+    </w:p>
+    <w:p>
+      <w:pPr>
+        <w:rPr>
+          <w:b/>
+          <w:bCs/>
+        </w:rPr>
+      </w:pPr>
+      <w:r>
+        <w:rPr>
+          <w:b/>
+          <w:bCs/>
+        </w:rPr>
+        <w:t>10. Managing the Video List in React</w:t>
+      </w:r>
+    </w:p>
+    <w:p>
+      <w:r>
+        <w:t>Studied how React state is used to maintain all participant videos.</w:t>
+      </w:r>
+    </w:p>
+    <w:p>
+      <w:r>
+        <w:t>For a new participant:</w:t>
+      </w:r>
+    </w:p>
+    <w:p>
+      <w:proofErr w:type="spellStart"/>
+      <w:r>
+        <w:t>const</w:t>
+      </w:r>
+      <w:proofErr w:type="spellEnd"/>
+      <w:r>
+        <w:t xml:space="preserve"> </w:t>
+      </w:r>
+      <w:proofErr w:type="spellStart"/>
+      <w:r>
+        <w:t>updatedVideos</w:t>
+      </w:r>
+      <w:proofErr w:type="spellEnd"/>
+      <w:r>
+        <w:t xml:space="preserve"> = [...videos, </w:t>
+      </w:r>
+      <w:proofErr w:type="spellStart"/>
+      <w:r>
+        <w:t>newVideo</w:t>
+      </w:r>
+      <w:proofErr w:type="spellEnd"/>
+      <w:r>
+        <w:t>];</w:t>
+      </w:r>
+    </w:p>
+    <w:p>
+      <w:r>
+        <w:t>The new participant is added while preserving all existing videos.</w:t>
+      </w:r>
+    </w:p>
+    <w:p>
+      <w:r>
+        <w:t xml:space="preserve">Also understood why </w:t>
+      </w:r>
+      <w:proofErr w:type="spellStart"/>
+      <w:r>
+        <w:t>videoRef.current</w:t>
+      </w:r>
+      <w:proofErr w:type="spellEnd"/>
+      <w:r>
+        <w:t xml:space="preserve"> is maintained along with React state—it provides access to the latest video list without depending only on </w:t>
+      </w:r>
+      <w:proofErr w:type="spellStart"/>
+      <w:r>
+        <w:t>React's</w:t>
+      </w:r>
+      <w:proofErr w:type="spellEnd"/>
+      <w:r>
+        <w:t xml:space="preserve"> asynchronous state updates.</w:t>
+      </w:r>
+    </w:p>
+    <w:p>
+      <w:r>
+        <w:pict w14:anchorId="4FBFC173">
+          <v:rect id="_x0000_i1149" style="width:0;height:1.5pt" o:hralign="center" o:hrstd="t" o:hr="t" fillcolor="#a0a0a0" stroked="f"/>
+        </w:pict>
+      </w:r>
+    </w:p>
+    <w:p>
+      <w:pPr>
+        <w:rPr>
+          <w:b/>
+          <w:bCs/>
+        </w:rPr>
+      </w:pPr>
+      <w:r>
+        <w:rPr>
+          <w:b/>
+          <w:bCs/>
+        </w:rPr>
+        <w:t>11. Spread Operator</w:t>
+      </w:r>
+    </w:p>
+    <w:p>
+      <w:r>
+        <w:t>Revised the JavaScript spread operator ....</w:t>
+      </w:r>
+    </w:p>
+    <w:p>
+      <w:r>
+        <w:t>For arrays:</w:t>
+      </w:r>
+    </w:p>
+    <w:p>
+      <w:proofErr w:type="spellStart"/>
+      <w:r>
+        <w:t>const</w:t>
+      </w:r>
+      <w:proofErr w:type="spellEnd"/>
+      <w:r>
+        <w:t xml:space="preserve"> </w:t>
+      </w:r>
+      <w:proofErr w:type="spellStart"/>
+      <w:r>
+        <w:t>updatedVideos</w:t>
+      </w:r>
+      <w:proofErr w:type="spellEnd"/>
+      <w:r>
+        <w:t xml:space="preserve"> = [...videos, </w:t>
+      </w:r>
+      <w:proofErr w:type="spellStart"/>
+      <w:r>
+        <w:t>newVideo</w:t>
+      </w:r>
+      <w:proofErr w:type="spellEnd"/>
+      <w:r>
+        <w:t>];</w:t>
+      </w:r>
+    </w:p>
+    <w:p>
+      <w:r>
+        <w:t>This copies the existing videos and adds the new video.</w:t>
+      </w:r>
+    </w:p>
+    <w:p>
+      <w:r>
+        <w:t>For objects:</w:t>
+      </w:r>
+    </w:p>
+    <w:p>
+      <w:r>
+        <w:t xml:space="preserve">{ ...video, stream: </w:t>
+      </w:r>
+      <w:proofErr w:type="spellStart"/>
+      <w:r>
+        <w:t>event.stream</w:t>
+      </w:r>
+      <w:proofErr w:type="spellEnd"/>
+      <w:r>
+        <w:t xml:space="preserve"> }</w:t>
+      </w:r>
+    </w:p>
+    <w:p>
+      <w:r>
+        <w:lastRenderedPageBreak/>
+        <w:t>This copies all existing properties of video and updates only the stream property.</w:t>
+      </w:r>
+    </w:p>
+    <w:p>
+      <w:r>
+        <w:pict w14:anchorId="0A6D4726">
+          <v:rect id="_x0000_i1150" style="width:0;height:1.5pt" o:hralign="center" o:hrstd="t" o:hr="t" fillcolor="#a0a0a0" stroked="f"/>
+        </w:pict>
+      </w:r>
+    </w:p>
+    <w:p>
+      <w:pPr>
+        <w:rPr>
+          <w:b/>
+          <w:bCs/>
+        </w:rPr>
+      </w:pPr>
+      <w:r>
+        <w:rPr>
+          <w:b/>
+          <w:bCs/>
+        </w:rPr>
+        <w:t>12. Handling Users Leaving</w:t>
+      </w:r>
+    </w:p>
+    <w:p>
+      <w:r>
+        <w:t>Studied how the application removes a participant's video when they leave.</w:t>
+      </w:r>
+    </w:p>
+    <w:p>
+      <w:proofErr w:type="spellStart"/>
+      <w:r>
+        <w:t>socketRef.current.on</w:t>
+      </w:r>
+      <w:proofErr w:type="spellEnd"/>
+      <w:r>
+        <w:t>('user-left', (id) =&gt; {</w:t>
+      </w:r>
+    </w:p>
+    <w:p>
+      <w:r>
+        <w:t xml:space="preserve">    </w:t>
+      </w:r>
+      <w:proofErr w:type="spellStart"/>
+      <w:r>
+        <w:t>setVideos</w:t>
+      </w:r>
+      <w:proofErr w:type="spellEnd"/>
+      <w:r>
+        <w:t>((videos) =&gt;</w:t>
+      </w:r>
+    </w:p>
+    <w:p>
+      <w:r>
+        <w:t xml:space="preserve">        </w:t>
+      </w:r>
+      <w:proofErr w:type="spellStart"/>
+      <w:r>
+        <w:t>videos.filter</w:t>
+      </w:r>
+      <w:proofErr w:type="spellEnd"/>
+      <w:r>
+        <w:t xml:space="preserve">((video) =&gt; </w:t>
+      </w:r>
+      <w:proofErr w:type="spellStart"/>
+      <w:r>
+        <w:t>video.socketId</w:t>
+      </w:r>
+      <w:proofErr w:type="spellEnd"/>
+      <w:r>
+        <w:t xml:space="preserve"> !== id)</w:t>
+      </w:r>
+    </w:p>
+    <w:p>
+      <w:r>
+        <w:t xml:space="preserve">    );</w:t>
+      </w:r>
+    </w:p>
+    <w:p>
+      <w:r>
+        <w:t>});</w:t>
+      </w:r>
+    </w:p>
+    <w:p>
+      <w:r>
+        <w:t xml:space="preserve">filter() removes the video whose </w:t>
+      </w:r>
+      <w:proofErr w:type="spellStart"/>
+      <w:r>
+        <w:t>socketId</w:t>
+      </w:r>
+      <w:proofErr w:type="spellEnd"/>
+      <w:r>
+        <w:t xml:space="preserve"> matches the user who left.</w:t>
+      </w:r>
+    </w:p>
+    <w:p>
+      <w:r>
+        <w:pict w14:anchorId="1D4F45A3">
+          <v:rect id="_x0000_i1151" style="width:0;height:1.5pt" o:hralign="center" o:hrstd="t" o:hr="t" fillcolor="#a0a0a0" stroked="f"/>
+        </w:pict>
+      </w:r>
+    </w:p>
+    <w:p>
+      <w:pPr>
+        <w:rPr>
+          <w:b/>
+          <w:bCs/>
+        </w:rPr>
+      </w:pPr>
+      <w:r>
+        <w:rPr>
+          <w:b/>
+          <w:bCs/>
+        </w:rPr>
+        <w:t>13. Creating a WebRTC Offer</w:t>
+      </w:r>
+    </w:p>
+    <w:p>
+      <w:r>
+        <w:t>Studied how the newly joined user initiates WebRTC negotiation.</w:t>
+      </w:r>
+    </w:p>
+    <w:p>
+      <w:r>
+        <w:t>connections[id2].</w:t>
+      </w:r>
+      <w:proofErr w:type="spellStart"/>
+      <w:r>
+        <w:t>createOffer</w:t>
+      </w:r>
+      <w:proofErr w:type="spellEnd"/>
+      <w:r>
+        <w:t>()</w:t>
+      </w:r>
+    </w:p>
+    <w:p>
+      <w:proofErr w:type="spellStart"/>
+      <w:r>
+        <w:t>createOffer</w:t>
+      </w:r>
+      <w:proofErr w:type="spellEnd"/>
+      <w:r>
+        <w:t xml:space="preserve">() generates an </w:t>
+      </w:r>
+      <w:r>
+        <w:rPr>
+          <w:b/>
+          <w:bCs/>
+        </w:rPr>
+        <w:t>SDP offer</w:t>
+      </w:r>
+      <w:r>
+        <w:t xml:space="preserve"> containing information required to start negotiating the connection.</w:t>
+      </w:r>
+    </w:p>
+    <w:p>
+      <w:r>
+        <w:t>The offer is stored locally using:</w:t>
+      </w:r>
+    </w:p>
+    <w:p>
+      <w:r>
+        <w:t>connections[id2].</w:t>
+      </w:r>
+      <w:proofErr w:type="spellStart"/>
+      <w:r>
+        <w:t>setLocalDescription</w:t>
+      </w:r>
+      <w:proofErr w:type="spellEnd"/>
+      <w:r>
+        <w:t>(description);</w:t>
+      </w:r>
+    </w:p>
+    <w:p>
+      <w:r>
+        <w:t>Then it is sent to the other participant through Socket.IO:</w:t>
+      </w:r>
+    </w:p>
+    <w:p>
+      <w:proofErr w:type="spellStart"/>
+      <w:r>
+        <w:t>socketRef.current.emit</w:t>
+      </w:r>
+      <w:proofErr w:type="spellEnd"/>
+      <w:r>
+        <w:t>(</w:t>
+      </w:r>
+    </w:p>
+    <w:p>
+      <w:r>
+        <w:t xml:space="preserve">    'signal',</w:t>
+      </w:r>
+    </w:p>
+    <w:p>
+      <w:r>
+        <w:t xml:space="preserve">    id2,</w:t>
+      </w:r>
+    </w:p>
+    <w:p>
+      <w:r>
+        <w:t xml:space="preserve">    </w:t>
+      </w:r>
+      <w:proofErr w:type="spellStart"/>
+      <w:r>
+        <w:t>JSON.stringify</w:t>
+      </w:r>
+      <w:proofErr w:type="spellEnd"/>
+      <w:r>
+        <w:t>({</w:t>
+      </w:r>
+    </w:p>
+    <w:p>
+      <w:r>
+        <w:t xml:space="preserve">        </w:t>
+      </w:r>
+      <w:proofErr w:type="spellStart"/>
+      <w:r>
+        <w:t>sdp</w:t>
+      </w:r>
+      <w:proofErr w:type="spellEnd"/>
+      <w:r>
+        <w:t>: connections[id2].</w:t>
+      </w:r>
+      <w:proofErr w:type="spellStart"/>
+      <w:r>
+        <w:t>localDescription</w:t>
+      </w:r>
+      <w:proofErr w:type="spellEnd"/>
+    </w:p>
+    <w:p>
+      <w:r>
+        <w:t xml:space="preserve">    })</w:t>
+      </w:r>
+    </w:p>
+    <w:p>
+      <w:r>
+        <w:t>);</w:t>
+      </w:r>
+    </w:p>
+    <w:p>
+      <w:r>
+        <w:pict w14:anchorId="052F46F9">
+          <v:rect id="_x0000_i1152" style="width:0;height:1.5pt" o:hralign="center" o:hrstd="t" o:hr="t" fillcolor="#a0a0a0" stroked="f"/>
+        </w:pict>
+      </w:r>
+    </w:p>
+    <w:p>
+      <w:pPr>
+        <w:rPr>
+          <w:b/>
+          <w:bCs/>
+        </w:rPr>
+      </w:pPr>
+      <w:r>
+        <w:rPr>
+          <w:b/>
+          <w:bCs/>
+        </w:rPr>
+        <w:t>14. Chat Message Handling</w:t>
+      </w:r>
+    </w:p>
+    <w:p>
+      <w:r>
+        <w:t>Reviewed the real-time chat listener:</w:t>
+      </w:r>
+    </w:p>
+    <w:p>
+      <w:proofErr w:type="spellStart"/>
+      <w:r>
+        <w:t>socketRef.current.on</w:t>
+      </w:r>
+      <w:proofErr w:type="spellEnd"/>
+      <w:r>
+        <w:t xml:space="preserve">('chat-message', </w:t>
+      </w:r>
+      <w:proofErr w:type="spellStart"/>
+      <w:r>
+        <w:t>addMessage</w:t>
+      </w:r>
+      <w:proofErr w:type="spellEnd"/>
+      <w:r>
+        <w:t>);</w:t>
+      </w:r>
+    </w:p>
+    <w:p>
+      <w:r>
+        <w:t xml:space="preserve">Whenever a chat-message event is received from the server, </w:t>
+      </w:r>
+      <w:proofErr w:type="spellStart"/>
+      <w:r>
+        <w:t>addMessage</w:t>
+      </w:r>
+      <w:proofErr w:type="spellEnd"/>
+      <w:r>
+        <w:t>() is called to update the chat.</w:t>
+      </w:r>
+    </w:p>
+    <w:p>
+      <w:r>
+        <w:lastRenderedPageBreak/>
+        <w:pict w14:anchorId="01C28040">
+          <v:rect id="_x0000_i1153" style="width:0;height:1.5pt" o:hralign="center" o:hrstd="t" o:hr="t" fillcolor="#a0a0a0" stroked="f"/>
+        </w:pict>
+      </w:r>
+    </w:p>
+    <w:p>
+      <w:pPr>
+        <w:rPr>
+          <w:b/>
+          <w:bCs/>
+        </w:rPr>
+      </w:pPr>
+      <w:r>
+        <w:rPr>
+          <w:b/>
+          <w:bCs/>
+        </w:rPr>
+        <w:t>Overall Flow Understood Today</w:t>
+      </w:r>
+    </w:p>
+    <w:p>
+      <w:r>
+        <w:t>User opens meeting</w:t>
+      </w:r>
+    </w:p>
+    <w:p>
+      <w:r>
+        <w:t xml:space="preserve">        ↓</w:t>
+      </w:r>
+    </w:p>
+    <w:p>
+      <w:r>
+        <w:t>Connect to Socket.IO server</w:t>
+      </w:r>
+    </w:p>
+    <w:p>
+      <w:r>
+        <w:t xml:space="preserve">        ↓</w:t>
+      </w:r>
+    </w:p>
+    <w:p>
+      <w:r>
+        <w:t>Emit "join-call"</w:t>
+      </w:r>
+    </w:p>
+    <w:p>
+      <w:r>
+        <w:t xml:space="preserve">        ↓</w:t>
+      </w:r>
+    </w:p>
+    <w:p>
+      <w:r>
+        <w:t>Receive "user-joined"</w:t>
+      </w:r>
+    </w:p>
+    <w:p>
+      <w:r>
+        <w:t xml:space="preserve">        ↓</w:t>
+      </w:r>
+    </w:p>
+    <w:p>
+      <w:r>
+        <w:t xml:space="preserve">Create </w:t>
+      </w:r>
+      <w:proofErr w:type="spellStart"/>
+      <w:r>
+        <w:t>RTCPeerConnection</w:t>
+      </w:r>
+      <w:proofErr w:type="spellEnd"/>
+    </w:p>
+    <w:p>
+      <w:r>
+        <w:t xml:space="preserve">        ↓</w:t>
+      </w:r>
+    </w:p>
+    <w:p>
+      <w:r>
+        <w:t>Add local camera/mic stream</w:t>
+      </w:r>
+    </w:p>
+    <w:p>
+      <w:r>
+        <w:t xml:space="preserve">        ↓</w:t>
+      </w:r>
+    </w:p>
+    <w:p>
+      <w:r>
+        <w:t>Create SDP offer</w:t>
+      </w:r>
+    </w:p>
+    <w:p>
+      <w:r>
+        <w:t xml:space="preserve">        ↓</w:t>
+      </w:r>
+    </w:p>
+    <w:p>
+      <w:r>
+        <w:t>Exchange SDP through Socket.IO</w:t>
+      </w:r>
+    </w:p>
+    <w:p>
+      <w:r>
+        <w:t xml:space="preserve">        ↓</w:t>
+      </w:r>
+    </w:p>
+    <w:p>
+      <w:r>
+        <w:t>Exchange ICE candidates</w:t>
+      </w:r>
+    </w:p>
+    <w:p>
+      <w:r>
+        <w:t xml:space="preserve">        ↓</w:t>
+      </w:r>
+    </w:p>
+    <w:p>
+      <w:r>
+        <w:t>WebRTC connection established</w:t>
+      </w:r>
+    </w:p>
+    <w:p>
+      <w:r>
+        <w:t xml:space="preserve">        ↓</w:t>
+      </w:r>
+    </w:p>
+    <w:p>
+      <w:r>
+        <w:t>Receive remote stream</w:t>
+      </w:r>
+    </w:p>
+    <w:p>
+      <w:r>
+        <w:t xml:space="preserve">        ↓</w:t>
+      </w:r>
+    </w:p>
+    <w:p>
+      <w:r>
+        <w:t>Display participant video</w:t>
+      </w:r>
+    </w:p>
+    <w:p>
+      <w:pPr>
+        <w:rPr>
+          <w:b/>
+          <w:bCs/>
+        </w:rPr>
+      </w:pPr>
+      <w:r>
+        <w:rPr>
+          <w:b/>
+          <w:bCs/>
+        </w:rPr>
+        <w:t>Today's Outcome</w:t>
+      </w:r>
+    </w:p>
+    <w:p>
+      <w:r>
+        <w:t xml:space="preserve">Today's session mainly focused on understanding and implementing the </w:t>
+      </w:r>
+      <w:r>
+        <w:rPr>
+          <w:b/>
+          <w:bCs/>
+        </w:rPr>
+        <w:t xml:space="preserve">core real-time communication flow of </w:t>
+      </w:r>
+      <w:proofErr w:type="spellStart"/>
+      <w:r>
+        <w:rPr>
+          <w:b/>
+          <w:bCs/>
+        </w:rPr>
+        <w:t>Connectify</w:t>
+      </w:r>
+      <w:proofErr w:type="spellEnd"/>
+      <w:r>
+        <w:t xml:space="preserve">. Covered Socket.IO connection management, </w:t>
+      </w:r>
+      <w:proofErr w:type="spellStart"/>
+      <w:r>
+        <w:t>socketRef</w:t>
+      </w:r>
+      <w:proofErr w:type="spellEnd"/>
+      <w:r>
+        <w:t xml:space="preserve">, STUN servers, WebRTC </w:t>
+      </w:r>
+      <w:proofErr w:type="spellStart"/>
+      <w:r>
+        <w:t>RTCPeerConnection</w:t>
+      </w:r>
+      <w:proofErr w:type="spellEnd"/>
+      <w:r>
+        <w:t xml:space="preserve">, ICE candidate exchange, </w:t>
+      </w:r>
+      <w:proofErr w:type="spellStart"/>
+      <w:r>
+        <w:t>signaling</w:t>
+      </w:r>
+      <w:proofErr w:type="spellEnd"/>
+      <w:r>
+        <w:t>, SDP offers, local and remote media streams, participant join/leave handling, video state management, chat events, and the JavaScript spread operator.</w:t>
+      </w:r>
+    </w:p>
+    <w:p>
+      <w:r>
+        <w:t>The major concept understood was the relationship between the two technologies:</w:t>
+      </w:r>
+    </w:p>
+    <w:p>
+      <w:r>
+        <w:rPr>
+          <w:b/>
+          <w:bCs/>
+        </w:rPr>
+        <w:lastRenderedPageBreak/>
+        <w:t xml:space="preserve">Socket.IO → helps users find each other and exchange </w:t>
+      </w:r>
+      <w:proofErr w:type="spellStart"/>
+      <w:r>
+        <w:rPr>
+          <w:b/>
+          <w:bCs/>
+        </w:rPr>
+        <w:t>signaling</w:t>
+      </w:r>
+      <w:proofErr w:type="spellEnd"/>
+      <w:r>
+        <w:rPr>
+          <w:b/>
+          <w:bCs/>
+        </w:rPr>
+        <w:t xml:space="preserve"> information.</w:t>
+      </w:r>
+    </w:p>
+    <w:p>
+      <w:r>
+        <w:rPr>
+          <w:b/>
+          <w:bCs/>
+        </w:rPr>
+        <w:t>WebRTC → establishes the peer-to-peer connection and transfers the actual audio/video between users.</w:t>
+      </w:r>
+    </w:p>
+    <w:p/>
     <w:sectPr>
       <w:pgSz w:w="11906" w:h="16838"/>
       <w:pgMar w:top="1440" w:right="1440" w:bottom="1440" w:left="1440" w:header="708" w:footer="708" w:gutter="0"/>
@@ -5315,9 +7117,9 @@
     </w:lvl>
   </w:abstractNum>
   <w:abstractNum w:abstractNumId="1" w15:restartNumberingAfterBreak="0">
-    <w:nsid w:val="14F00155"/>
+    <w:nsid w:val="080D7C71"/>
     <w:multiLevelType w:val="multilevel"/>
-    <w:tmpl w:val="6D3C1832"/>
+    <w:tmpl w:val="BAAE3BE0"/>
     <w:lvl w:ilvl="0">
       <w:start w:val="1"/>
       <w:numFmt w:val="bullet"/>
@@ -5464,9 +7266,9 @@
     </w:lvl>
   </w:abstractNum>
   <w:abstractNum w:abstractNumId="2" w15:restartNumberingAfterBreak="0">
-    <w:nsid w:val="16073EBB"/>
+    <w:nsid w:val="14F00155"/>
     <w:multiLevelType w:val="multilevel"/>
-    <w:tmpl w:val="8EEA3CC6"/>
+    <w:tmpl w:val="6D3C1832"/>
     <w:lvl w:ilvl="0">
       <w:start w:val="1"/>
       <w:numFmt w:val="bullet"/>
@@ -5613,122 +7415,9 @@
     </w:lvl>
   </w:abstractNum>
   <w:abstractNum w:abstractNumId="3" w15:restartNumberingAfterBreak="0">
-    <w:nsid w:val="3AFF1569"/>
+    <w:nsid w:val="16073EBB"/>
     <w:multiLevelType w:val="multilevel"/>
-    <w:tmpl w:val="37AE95FE"/>
-    <w:lvl w:ilvl="0">
-      <w:start w:val="1"/>
-      <w:numFmt w:val="decimal"/>
-      <w:lvlText w:val="%1."/>
-      <w:lvlJc w:val="left"/>
-      <w:pPr>
-        <w:tabs>
-          <w:tab w:val="num" w:pos="720"/>
-        </w:tabs>
-        <w:ind w:left="720" w:hanging="360"/>
-      </w:pPr>
-    </w:lvl>
-    <w:lvl w:ilvl="1" w:tentative="1">
-      <w:start w:val="1"/>
-      <w:numFmt w:val="decimal"/>
-      <w:lvlText w:val="%2."/>
-      <w:lvlJc w:val="left"/>
-      <w:pPr>
-        <w:tabs>
-          <w:tab w:val="num" w:pos="1440"/>
-        </w:tabs>
-        <w:ind w:left="1440" w:hanging="360"/>
-      </w:pPr>
-    </w:lvl>
-    <w:lvl w:ilvl="2" w:tentative="1">
-      <w:start w:val="1"/>
-      <w:numFmt w:val="decimal"/>
-      <w:lvlText w:val="%3."/>
-      <w:lvlJc w:val="left"/>
-      <w:pPr>
-        <w:tabs>
-          <w:tab w:val="num" w:pos="2160"/>
-        </w:tabs>
-        <w:ind w:left="2160" w:hanging="360"/>
-      </w:pPr>
-    </w:lvl>
-    <w:lvl w:ilvl="3" w:tentative="1">
-      <w:start w:val="1"/>
-      <w:numFmt w:val="decimal"/>
-      <w:lvlText w:val="%4."/>
-      <w:lvlJc w:val="left"/>
-      <w:pPr>
-        <w:tabs>
-          <w:tab w:val="num" w:pos="2880"/>
-        </w:tabs>
-        <w:ind w:left="2880" w:hanging="360"/>
-      </w:pPr>
-    </w:lvl>
-    <w:lvl w:ilvl="4" w:tentative="1">
-      <w:start w:val="1"/>
-      <w:numFmt w:val="decimal"/>
-      <w:lvlText w:val="%5."/>
-      <w:lvlJc w:val="left"/>
-      <w:pPr>
-        <w:tabs>
-          <w:tab w:val="num" w:pos="3600"/>
-        </w:tabs>
-        <w:ind w:left="3600" w:hanging="360"/>
-      </w:pPr>
-    </w:lvl>
-    <w:lvl w:ilvl="5" w:tentative="1">
-      <w:start w:val="1"/>
-      <w:numFmt w:val="decimal"/>
-      <w:lvlText w:val="%6."/>
-      <w:lvlJc w:val="left"/>
-      <w:pPr>
-        <w:tabs>
-          <w:tab w:val="num" w:pos="4320"/>
-        </w:tabs>
-        <w:ind w:left="4320" w:hanging="360"/>
-      </w:pPr>
-    </w:lvl>
-    <w:lvl w:ilvl="6" w:tentative="1">
-      <w:start w:val="1"/>
-      <w:numFmt w:val="decimal"/>
-      <w:lvlText w:val="%7."/>
-      <w:lvlJc w:val="left"/>
-      <w:pPr>
-        <w:tabs>
-          <w:tab w:val="num" w:pos="5040"/>
-        </w:tabs>
-        <w:ind w:left="5040" w:hanging="360"/>
-      </w:pPr>
-    </w:lvl>
-    <w:lvl w:ilvl="7" w:tentative="1">
-      <w:start w:val="1"/>
-      <w:numFmt w:val="decimal"/>
-      <w:lvlText w:val="%8."/>
-      <w:lvlJc w:val="left"/>
-      <w:pPr>
-        <w:tabs>
-          <w:tab w:val="num" w:pos="5760"/>
-        </w:tabs>
-        <w:ind w:left="5760" w:hanging="360"/>
-      </w:pPr>
-    </w:lvl>
-    <w:lvl w:ilvl="8" w:tentative="1">
-      <w:start w:val="1"/>
-      <w:numFmt w:val="decimal"/>
-      <w:lvlText w:val="%9."/>
-      <w:lvlJc w:val="left"/>
-      <w:pPr>
-        <w:tabs>
-          <w:tab w:val="num" w:pos="6480"/>
-        </w:tabs>
-        <w:ind w:left="6480" w:hanging="360"/>
-      </w:pPr>
-    </w:lvl>
-  </w:abstractNum>
-  <w:abstractNum w:abstractNumId="4" w15:restartNumberingAfterBreak="0">
-    <w:nsid w:val="520E1C95"/>
-    <w:multiLevelType w:val="multilevel"/>
-    <w:tmpl w:val="48266A70"/>
+    <w:tmpl w:val="8EEA3CC6"/>
     <w:lvl w:ilvl="0">
       <w:start w:val="1"/>
       <w:numFmt w:val="bullet"/>
@@ -5874,20 +7563,437 @@
       </w:rPr>
     </w:lvl>
   </w:abstractNum>
+  <w:abstractNum w:abstractNumId="4" w15:restartNumberingAfterBreak="0">
+    <w:nsid w:val="3AFF1569"/>
+    <w:multiLevelType w:val="multilevel"/>
+    <w:tmpl w:val="37AE95FE"/>
+    <w:lvl w:ilvl="0">
+      <w:start w:val="1"/>
+      <w:numFmt w:val="decimal"/>
+      <w:lvlText w:val="%1."/>
+      <w:lvlJc w:val="left"/>
+      <w:pPr>
+        <w:tabs>
+          <w:tab w:val="num" w:pos="720"/>
+        </w:tabs>
+        <w:ind w:left="720" w:hanging="360"/>
+      </w:pPr>
+    </w:lvl>
+    <w:lvl w:ilvl="1" w:tentative="1">
+      <w:start w:val="1"/>
+      <w:numFmt w:val="decimal"/>
+      <w:lvlText w:val="%2."/>
+      <w:lvlJc w:val="left"/>
+      <w:pPr>
+        <w:tabs>
+          <w:tab w:val="num" w:pos="1440"/>
+        </w:tabs>
+        <w:ind w:left="1440" w:hanging="360"/>
+      </w:pPr>
+    </w:lvl>
+    <w:lvl w:ilvl="2" w:tentative="1">
+      <w:start w:val="1"/>
+      <w:numFmt w:val="decimal"/>
+      <w:lvlText w:val="%3."/>
+      <w:lvlJc w:val="left"/>
+      <w:pPr>
+        <w:tabs>
+          <w:tab w:val="num" w:pos="2160"/>
+        </w:tabs>
+        <w:ind w:left="2160" w:hanging="360"/>
+      </w:pPr>
+    </w:lvl>
+    <w:lvl w:ilvl="3" w:tentative="1">
+      <w:start w:val="1"/>
+      <w:numFmt w:val="decimal"/>
+      <w:lvlText w:val="%4."/>
+      <w:lvlJc w:val="left"/>
+      <w:pPr>
+        <w:tabs>
+          <w:tab w:val="num" w:pos="2880"/>
+        </w:tabs>
+        <w:ind w:left="2880" w:hanging="360"/>
+      </w:pPr>
+    </w:lvl>
+    <w:lvl w:ilvl="4" w:tentative="1">
+      <w:start w:val="1"/>
+      <w:numFmt w:val="decimal"/>
+      <w:lvlText w:val="%5."/>
+      <w:lvlJc w:val="left"/>
+      <w:pPr>
+        <w:tabs>
+          <w:tab w:val="num" w:pos="3600"/>
+        </w:tabs>
+        <w:ind w:left="3600" w:hanging="360"/>
+      </w:pPr>
+    </w:lvl>
+    <w:lvl w:ilvl="5" w:tentative="1">
+      <w:start w:val="1"/>
+      <w:numFmt w:val="decimal"/>
+      <w:lvlText w:val="%6."/>
+      <w:lvlJc w:val="left"/>
+      <w:pPr>
+        <w:tabs>
+          <w:tab w:val="num" w:pos="4320"/>
+        </w:tabs>
+        <w:ind w:left="4320" w:hanging="360"/>
+      </w:pPr>
+    </w:lvl>
+    <w:lvl w:ilvl="6" w:tentative="1">
+      <w:start w:val="1"/>
+      <w:numFmt w:val="decimal"/>
+      <w:lvlText w:val="%7."/>
+      <w:lvlJc w:val="left"/>
+      <w:pPr>
+        <w:tabs>
+          <w:tab w:val="num" w:pos="5040"/>
+        </w:tabs>
+        <w:ind w:left="5040" w:hanging="360"/>
+      </w:pPr>
+    </w:lvl>
+    <w:lvl w:ilvl="7" w:tentative="1">
+      <w:start w:val="1"/>
+      <w:numFmt w:val="decimal"/>
+      <w:lvlText w:val="%8."/>
+      <w:lvlJc w:val="left"/>
+      <w:pPr>
+        <w:tabs>
+          <w:tab w:val="num" w:pos="5760"/>
+        </w:tabs>
+        <w:ind w:left="5760" w:hanging="360"/>
+      </w:pPr>
+    </w:lvl>
+    <w:lvl w:ilvl="8" w:tentative="1">
+      <w:start w:val="1"/>
+      <w:numFmt w:val="decimal"/>
+      <w:lvlText w:val="%9."/>
+      <w:lvlJc w:val="left"/>
+      <w:pPr>
+        <w:tabs>
+          <w:tab w:val="num" w:pos="6480"/>
+        </w:tabs>
+        <w:ind w:left="6480" w:hanging="360"/>
+      </w:pPr>
+    </w:lvl>
+  </w:abstractNum>
+  <w:abstractNum w:abstractNumId="5" w15:restartNumberingAfterBreak="0">
+    <w:nsid w:val="520E1C95"/>
+    <w:multiLevelType w:val="multilevel"/>
+    <w:tmpl w:val="48266A70"/>
+    <w:lvl w:ilvl="0">
+      <w:start w:val="1"/>
+      <w:numFmt w:val="bullet"/>
+      <w:lvlText w:val=""/>
+      <w:lvlJc w:val="left"/>
+      <w:pPr>
+        <w:tabs>
+          <w:tab w:val="num" w:pos="720"/>
+        </w:tabs>
+        <w:ind w:left="720" w:hanging="360"/>
+      </w:pPr>
+      <w:rPr>
+        <w:rFonts w:ascii="Symbol" w:hAnsi="Symbol" w:hint="default"/>
+        <w:sz w:val="20"/>
+      </w:rPr>
+    </w:lvl>
+    <w:lvl w:ilvl="1" w:tentative="1">
+      <w:start w:val="1"/>
+      <w:numFmt w:val="bullet"/>
+      <w:lvlText w:val="o"/>
+      <w:lvlJc w:val="left"/>
+      <w:pPr>
+        <w:tabs>
+          <w:tab w:val="num" w:pos="1440"/>
+        </w:tabs>
+        <w:ind w:left="1440" w:hanging="360"/>
+      </w:pPr>
+      <w:rPr>
+        <w:rFonts w:ascii="Courier New" w:hAnsi="Courier New" w:hint="default"/>
+        <w:sz w:val="20"/>
+      </w:rPr>
+    </w:lvl>
+    <w:lvl w:ilvl="2" w:tentative="1">
+      <w:start w:val="1"/>
+      <w:numFmt w:val="bullet"/>
+      <w:lvlText w:val=""/>
+      <w:lvlJc w:val="left"/>
+      <w:pPr>
+        <w:tabs>
+          <w:tab w:val="num" w:pos="2160"/>
+        </w:tabs>
+        <w:ind w:left="2160" w:hanging="360"/>
+      </w:pPr>
+      <w:rPr>
+        <w:rFonts w:ascii="Wingdings" w:hAnsi="Wingdings" w:hint="default"/>
+        <w:sz w:val="20"/>
+      </w:rPr>
+    </w:lvl>
+    <w:lvl w:ilvl="3" w:tentative="1">
+      <w:start w:val="1"/>
+      <w:numFmt w:val="bullet"/>
+      <w:lvlText w:val=""/>
+      <w:lvlJc w:val="left"/>
+      <w:pPr>
+        <w:tabs>
+          <w:tab w:val="num" w:pos="2880"/>
+        </w:tabs>
+        <w:ind w:left="2880" w:hanging="360"/>
+      </w:pPr>
+      <w:rPr>
+        <w:rFonts w:ascii="Wingdings" w:hAnsi="Wingdings" w:hint="default"/>
+        <w:sz w:val="20"/>
+      </w:rPr>
+    </w:lvl>
+    <w:lvl w:ilvl="4" w:tentative="1">
+      <w:start w:val="1"/>
+      <w:numFmt w:val="bullet"/>
+      <w:lvlText w:val=""/>
+      <w:lvlJc w:val="left"/>
+      <w:pPr>
+        <w:tabs>
+          <w:tab w:val="num" w:pos="3600"/>
+        </w:tabs>
+        <w:ind w:left="3600" w:hanging="360"/>
+      </w:pPr>
+      <w:rPr>
+        <w:rFonts w:ascii="Wingdings" w:hAnsi="Wingdings" w:hint="default"/>
+        <w:sz w:val="20"/>
+      </w:rPr>
+    </w:lvl>
+    <w:lvl w:ilvl="5" w:tentative="1">
+      <w:start w:val="1"/>
+      <w:numFmt w:val="bullet"/>
+      <w:lvlText w:val=""/>
+      <w:lvlJc w:val="left"/>
+      <w:pPr>
+        <w:tabs>
+          <w:tab w:val="num" w:pos="4320"/>
+        </w:tabs>
+        <w:ind w:left="4320" w:hanging="360"/>
+      </w:pPr>
+      <w:rPr>
+        <w:rFonts w:ascii="Wingdings" w:hAnsi="Wingdings" w:hint="default"/>
+        <w:sz w:val="20"/>
+      </w:rPr>
+    </w:lvl>
+    <w:lvl w:ilvl="6" w:tentative="1">
+      <w:start w:val="1"/>
+      <w:numFmt w:val="bullet"/>
+      <w:lvlText w:val=""/>
+      <w:lvlJc w:val="left"/>
+      <w:pPr>
+        <w:tabs>
+          <w:tab w:val="num" w:pos="5040"/>
+        </w:tabs>
+        <w:ind w:left="5040" w:hanging="360"/>
+      </w:pPr>
+      <w:rPr>
+        <w:rFonts w:ascii="Wingdings" w:hAnsi="Wingdings" w:hint="default"/>
+        <w:sz w:val="20"/>
+      </w:rPr>
+    </w:lvl>
+    <w:lvl w:ilvl="7" w:tentative="1">
+      <w:start w:val="1"/>
+      <w:numFmt w:val="bullet"/>
+      <w:lvlText w:val=""/>
+      <w:lvlJc w:val="left"/>
+      <w:pPr>
+        <w:tabs>
+          <w:tab w:val="num" w:pos="5760"/>
+        </w:tabs>
+        <w:ind w:left="5760" w:hanging="360"/>
+      </w:pPr>
+      <w:rPr>
+        <w:rFonts w:ascii="Wingdings" w:hAnsi="Wingdings" w:hint="default"/>
+        <w:sz w:val="20"/>
+      </w:rPr>
+    </w:lvl>
+    <w:lvl w:ilvl="8" w:tentative="1">
+      <w:start w:val="1"/>
+      <w:numFmt w:val="bullet"/>
+      <w:lvlText w:val=""/>
+      <w:lvlJc w:val="left"/>
+      <w:pPr>
+        <w:tabs>
+          <w:tab w:val="num" w:pos="6480"/>
+        </w:tabs>
+        <w:ind w:left="6480" w:hanging="360"/>
+      </w:pPr>
+      <w:rPr>
+        <w:rFonts w:ascii="Wingdings" w:hAnsi="Wingdings" w:hint="default"/>
+        <w:sz w:val="20"/>
+      </w:rPr>
+    </w:lvl>
+  </w:abstractNum>
+  <w:abstractNum w:abstractNumId="6" w15:restartNumberingAfterBreak="0">
+    <w:nsid w:val="7C5D571E"/>
+    <w:multiLevelType w:val="multilevel"/>
+    <w:tmpl w:val="A7D058B8"/>
+    <w:lvl w:ilvl="0">
+      <w:start w:val="1"/>
+      <w:numFmt w:val="bullet"/>
+      <w:lvlText w:val=""/>
+      <w:lvlJc w:val="left"/>
+      <w:pPr>
+        <w:tabs>
+          <w:tab w:val="num" w:pos="720"/>
+        </w:tabs>
+        <w:ind w:left="720" w:hanging="360"/>
+      </w:pPr>
+      <w:rPr>
+        <w:rFonts w:ascii="Symbol" w:hAnsi="Symbol" w:hint="default"/>
+        <w:sz w:val="20"/>
+      </w:rPr>
+    </w:lvl>
+    <w:lvl w:ilvl="1" w:tentative="1">
+      <w:start w:val="1"/>
+      <w:numFmt w:val="bullet"/>
+      <w:lvlText w:val="o"/>
+      <w:lvlJc w:val="left"/>
+      <w:pPr>
+        <w:tabs>
+          <w:tab w:val="num" w:pos="1440"/>
+        </w:tabs>
+        <w:ind w:left="1440" w:hanging="360"/>
+      </w:pPr>
+      <w:rPr>
+        <w:rFonts w:ascii="Courier New" w:hAnsi="Courier New" w:hint="default"/>
+        <w:sz w:val="20"/>
+      </w:rPr>
+    </w:lvl>
+    <w:lvl w:ilvl="2" w:tentative="1">
+      <w:start w:val="1"/>
+      <w:numFmt w:val="bullet"/>
+      <w:lvlText w:val=""/>
+      <w:lvlJc w:val="left"/>
+      <w:pPr>
+        <w:tabs>
+          <w:tab w:val="num" w:pos="2160"/>
+        </w:tabs>
+        <w:ind w:left="2160" w:hanging="360"/>
+      </w:pPr>
+      <w:rPr>
+        <w:rFonts w:ascii="Wingdings" w:hAnsi="Wingdings" w:hint="default"/>
+        <w:sz w:val="20"/>
+      </w:rPr>
+    </w:lvl>
+    <w:lvl w:ilvl="3" w:tentative="1">
+      <w:start w:val="1"/>
+      <w:numFmt w:val="bullet"/>
+      <w:lvlText w:val=""/>
+      <w:lvlJc w:val="left"/>
+      <w:pPr>
+        <w:tabs>
+          <w:tab w:val="num" w:pos="2880"/>
+        </w:tabs>
+        <w:ind w:left="2880" w:hanging="360"/>
+      </w:pPr>
+      <w:rPr>
+        <w:rFonts w:ascii="Wingdings" w:hAnsi="Wingdings" w:hint="default"/>
+        <w:sz w:val="20"/>
+      </w:rPr>
+    </w:lvl>
+    <w:lvl w:ilvl="4" w:tentative="1">
+      <w:start w:val="1"/>
+      <w:numFmt w:val="bullet"/>
+      <w:lvlText w:val=""/>
+      <w:lvlJc w:val="left"/>
+      <w:pPr>
+        <w:tabs>
+          <w:tab w:val="num" w:pos="3600"/>
+        </w:tabs>
+        <w:ind w:left="3600" w:hanging="360"/>
+      </w:pPr>
+      <w:rPr>
+        <w:rFonts w:ascii="Wingdings" w:hAnsi="Wingdings" w:hint="default"/>
+        <w:sz w:val="20"/>
+      </w:rPr>
+    </w:lvl>
+    <w:lvl w:ilvl="5" w:tentative="1">
+      <w:start w:val="1"/>
+      <w:numFmt w:val="bullet"/>
+      <w:lvlText w:val=""/>
+      <w:lvlJc w:val="left"/>
+      <w:pPr>
+        <w:tabs>
+          <w:tab w:val="num" w:pos="4320"/>
+        </w:tabs>
+        <w:ind w:left="4320" w:hanging="360"/>
+      </w:pPr>
+      <w:rPr>
+        <w:rFonts w:ascii="Wingdings" w:hAnsi="Wingdings" w:hint="default"/>
+        <w:sz w:val="20"/>
+      </w:rPr>
+    </w:lvl>
+    <w:lvl w:ilvl="6" w:tentative="1">
+      <w:start w:val="1"/>
+      <w:numFmt w:val="bullet"/>
+      <w:lvlText w:val=""/>
+      <w:lvlJc w:val="left"/>
+      <w:pPr>
+        <w:tabs>
+          <w:tab w:val="num" w:pos="5040"/>
+        </w:tabs>
+        <w:ind w:left="5040" w:hanging="360"/>
+      </w:pPr>
+      <w:rPr>
+        <w:rFonts w:ascii="Wingdings" w:hAnsi="Wingdings" w:hint="default"/>
+        <w:sz w:val="20"/>
+      </w:rPr>
+    </w:lvl>
+    <w:lvl w:ilvl="7" w:tentative="1">
+      <w:start w:val="1"/>
+      <w:numFmt w:val="bullet"/>
+      <w:lvlText w:val=""/>
+      <w:lvlJc w:val="left"/>
+      <w:pPr>
+        <w:tabs>
+          <w:tab w:val="num" w:pos="5760"/>
+        </w:tabs>
+        <w:ind w:left="5760" w:hanging="360"/>
+      </w:pPr>
+      <w:rPr>
+        <w:rFonts w:ascii="Wingdings" w:hAnsi="Wingdings" w:hint="default"/>
+        <w:sz w:val="20"/>
+      </w:rPr>
+    </w:lvl>
+    <w:lvl w:ilvl="8" w:tentative="1">
+      <w:start w:val="1"/>
+      <w:numFmt w:val="bullet"/>
+      <w:lvlText w:val=""/>
+      <w:lvlJc w:val="left"/>
+      <w:pPr>
+        <w:tabs>
+          <w:tab w:val="num" w:pos="6480"/>
+        </w:tabs>
+        <w:ind w:left="6480" w:hanging="360"/>
+      </w:pPr>
+      <w:rPr>
+        <w:rFonts w:ascii="Wingdings" w:hAnsi="Wingdings" w:hint="default"/>
+        <w:sz w:val="20"/>
+      </w:rPr>
+    </w:lvl>
+  </w:abstractNum>
   <w:num w:numId="1" w16cid:durableId="1628313210">
-    <w:abstractNumId w:val="2"/>
+    <w:abstractNumId w:val="3"/>
   </w:num>
   <w:num w:numId="2" w16cid:durableId="63525851">
     <w:abstractNumId w:val="0"/>
   </w:num>
   <w:num w:numId="3" w16cid:durableId="1714188091">
+    <w:abstractNumId w:val="5"/>
+  </w:num>
+  <w:num w:numId="4" w16cid:durableId="1576817066">
+    <w:abstractNumId w:val="2"/>
+  </w:num>
+  <w:num w:numId="5" w16cid:durableId="1474129752">
     <w:abstractNumId w:val="4"/>
   </w:num>
-  <w:num w:numId="4" w16cid:durableId="1576817066">
+  <w:num w:numId="6" w16cid:durableId="2029721107">
+    <w:abstractNumId w:val="6"/>
+  </w:num>
+  <w:num w:numId="7" w16cid:durableId="916669958">
     <w:abstractNumId w:val="1"/>
-  </w:num>
-  <w:num w:numId="5" w16cid:durableId="1474129752">
-    <w:abstractNumId w:val="3"/>
   </w:num>
 </w:numbering>
 </file>

</xml_diff>